<commit_message>
Day 1: Notes and work uploaded
</commit_message>
<xml_diff>
--- a/notes/AGENTIC AI DAILY WORK.docx
+++ b/notes/AGENTIC AI DAILY WORK.docx
@@ -4990,7 +4990,7 @@
           <w:szCs w:val="24"/>
         </w:rPr>
         <w:pict w14:anchorId="14219098">
-          <v:rect id="_x0000_i1037" style="width:0;height:1.5pt" o:hralign="center" o:hrstd="t" o:hr="t" fillcolor="#a0a0a0" stroked="f"/>
+          <v:rect id="_x0000_i1025" style="width:0;height:1.5pt" o:hralign="center" o:hrstd="t" o:hr="t" fillcolor="#a0a0a0" stroked="f"/>
         </w:pict>
       </w:r>
     </w:p>
@@ -5073,7 +5073,7 @@
           <w:szCs w:val="24"/>
         </w:rPr>
         <w:pict w14:anchorId="66B4CD51">
-          <v:rect id="_x0000_i1038" style="width:0;height:1.5pt" o:hralign="center" o:hrstd="t" o:hr="t" fillcolor="#a0a0a0" stroked="f"/>
+          <v:rect id="_x0000_i1026" style="width:0;height:1.5pt" o:hralign="center" o:hrstd="t" o:hr="t" fillcolor="#a0a0a0" stroked="f"/>
         </w:pict>
       </w:r>
     </w:p>
@@ -5185,6 +5185,1039 @@
         </w:rPr>
         <w:t>This usually produces much better responses.</w:t>
       </w:r>
+    </w:p>
+    <w:p>
+      <w:pPr>
+        <w:rPr>
+          <w:rFonts w:ascii="Aptos" w:hAnsi="Aptos"/>
+          <w:sz w:val="24"/>
+          <w:szCs w:val="24"/>
+        </w:rPr>
+      </w:pPr>
+    </w:p>
+    <w:p>
+      <w:pPr>
+        <w:rPr>
+          <w:rFonts w:ascii="Aptos" w:hAnsi="Aptos"/>
+          <w:b/>
+          <w:bCs/>
+          <w:color w:val="0070C0"/>
+          <w:sz w:val="24"/>
+          <w:szCs w:val="24"/>
+        </w:rPr>
+      </w:pPr>
+      <w:r>
+        <w:rPr>
+          <w:rFonts w:ascii="Aptos" w:hAnsi="Aptos"/>
+          <w:b/>
+          <w:bCs/>
+          <w:color w:val="0070C0"/>
+          <w:sz w:val="24"/>
+          <w:szCs w:val="24"/>
+        </w:rPr>
+        <w:t>Day 2:</w:t>
+      </w:r>
+    </w:p>
+    <w:p>
+      <w:pPr>
+        <w:rPr>
+          <w:rFonts w:ascii="Aptos" w:hAnsi="Aptos"/>
+          <w:b/>
+          <w:bCs/>
+          <w:color w:val="7030A0"/>
+          <w:sz w:val="24"/>
+          <w:szCs w:val="24"/>
+        </w:rPr>
+      </w:pPr>
+      <w:r>
+        <w:rPr>
+          <w:rFonts w:ascii="Aptos" w:hAnsi="Aptos"/>
+          <w:b/>
+          <w:bCs/>
+          <w:color w:val="7030A0"/>
+          <w:sz w:val="24"/>
+          <w:szCs w:val="24"/>
+        </w:rPr>
+        <w:t xml:space="preserve">PART 1 - </w:t>
+      </w:r>
+      <w:r>
+        <w:rPr>
+          <w:rFonts w:ascii="Aptos" w:hAnsi="Aptos"/>
+          <w:b/>
+          <w:bCs/>
+          <w:color w:val="7030A0"/>
+          <w:sz w:val="24"/>
+          <w:szCs w:val="24"/>
+        </w:rPr>
+        <w:t>Python for AI</w:t>
+      </w:r>
+    </w:p>
+    <w:p>
+      <w:pPr>
+        <w:rPr>
+          <w:rFonts w:ascii="Aptos" w:hAnsi="Aptos"/>
+          <w:sz w:val="24"/>
+          <w:szCs w:val="24"/>
+        </w:rPr>
+      </w:pPr>
+      <w:r>
+        <w:rPr>
+          <w:rFonts w:ascii="Aptos" w:hAnsi="Aptos"/>
+          <w:sz w:val="24"/>
+          <w:szCs w:val="24"/>
+        </w:rPr>
+        <w:t>AI frameworks are object- oriented. (</w:t>
+      </w:r>
+      <w:proofErr w:type="spellStart"/>
+      <w:r>
+        <w:rPr>
+          <w:rFonts w:ascii="Aptos" w:hAnsi="Aptos"/>
+          <w:sz w:val="24"/>
+          <w:szCs w:val="24"/>
+        </w:rPr>
+        <w:t>LangChain</w:t>
+      </w:r>
+      <w:proofErr w:type="spellEnd"/>
+      <w:r>
+        <w:rPr>
+          <w:rFonts w:ascii="Aptos" w:hAnsi="Aptos"/>
+          <w:sz w:val="24"/>
+          <w:szCs w:val="24"/>
+        </w:rPr>
+        <w:t xml:space="preserve">, </w:t>
+      </w:r>
+      <w:proofErr w:type="spellStart"/>
+      <w:r>
+        <w:rPr>
+          <w:rFonts w:ascii="Aptos" w:hAnsi="Aptos"/>
+          <w:sz w:val="24"/>
+          <w:szCs w:val="24"/>
+        </w:rPr>
+        <w:t>LangGraph</w:t>
+      </w:r>
+      <w:proofErr w:type="spellEnd"/>
+      <w:r>
+        <w:rPr>
+          <w:rFonts w:ascii="Aptos" w:hAnsi="Aptos"/>
+          <w:sz w:val="24"/>
+          <w:szCs w:val="24"/>
+        </w:rPr>
+        <w:t xml:space="preserve">, </w:t>
+      </w:r>
+      <w:proofErr w:type="spellStart"/>
+      <w:r>
+        <w:rPr>
+          <w:rFonts w:ascii="Aptos" w:hAnsi="Aptos"/>
+          <w:sz w:val="24"/>
+          <w:szCs w:val="24"/>
+        </w:rPr>
+        <w:t>CrewAI</w:t>
+      </w:r>
+      <w:proofErr w:type="spellEnd"/>
+      <w:r>
+        <w:rPr>
+          <w:rFonts w:ascii="Aptos" w:hAnsi="Aptos"/>
+          <w:sz w:val="24"/>
+          <w:szCs w:val="24"/>
+        </w:rPr>
+        <w:t xml:space="preserve">, </w:t>
+      </w:r>
+      <w:proofErr w:type="spellStart"/>
+      <w:r>
+        <w:rPr>
+          <w:rFonts w:ascii="Aptos" w:hAnsi="Aptos"/>
+          <w:sz w:val="24"/>
+          <w:szCs w:val="24"/>
+        </w:rPr>
+        <w:t>AutoGen</w:t>
+      </w:r>
+      <w:proofErr w:type="spellEnd"/>
+      <w:r>
+        <w:rPr>
+          <w:rFonts w:ascii="Aptos" w:hAnsi="Aptos"/>
+          <w:sz w:val="24"/>
+          <w:szCs w:val="24"/>
+        </w:rPr>
+        <w:t>)</w:t>
+      </w:r>
+    </w:p>
+    <w:p>
+      <w:pPr>
+        <w:rPr>
+          <w:rFonts w:ascii="Aptos" w:hAnsi="Aptos"/>
+          <w:sz w:val="24"/>
+          <w:szCs w:val="24"/>
+        </w:rPr>
+      </w:pPr>
+      <w:r>
+        <w:rPr>
+          <w:rFonts w:ascii="Aptos" w:hAnsi="Aptos"/>
+          <w:b/>
+          <w:bCs/>
+          <w:sz w:val="24"/>
+          <w:szCs w:val="24"/>
+        </w:rPr>
+        <w:t>Class</w:t>
+      </w:r>
+      <w:r>
+        <w:rPr>
+          <w:rFonts w:ascii="Aptos" w:hAnsi="Aptos"/>
+          <w:sz w:val="24"/>
+          <w:szCs w:val="24"/>
+        </w:rPr>
+        <w:t xml:space="preserve">- </w:t>
+      </w:r>
+      <w:r>
+        <w:rPr>
+          <w:rFonts w:ascii="Aptos" w:hAnsi="Aptos"/>
+          <w:sz w:val="24"/>
+          <w:szCs w:val="24"/>
+        </w:rPr>
+        <w:t>is a blueprint or a template used to create objects.</w:t>
+      </w:r>
+    </w:p>
+    <w:p>
+      <w:pPr>
+        <w:rPr>
+          <w:rFonts w:ascii="Aptos" w:hAnsi="Aptos"/>
+          <w:sz w:val="24"/>
+          <w:szCs w:val="24"/>
+        </w:rPr>
+      </w:pPr>
+      <w:r>
+        <w:rPr>
+          <w:rFonts w:ascii="Aptos" w:hAnsi="Aptos"/>
+          <w:sz w:val="24"/>
+          <w:szCs w:val="24"/>
+        </w:rPr>
+        <w:t>a class defines two main things for the objects created from it:</w:t>
+      </w:r>
+    </w:p>
+    <w:p>
+      <w:pPr>
+        <w:numPr>
+          <w:ilvl w:val="0"/>
+          <w:numId w:val="10"/>
+        </w:numPr>
+        <w:rPr>
+          <w:rFonts w:ascii="Aptos" w:hAnsi="Aptos"/>
+          <w:sz w:val="24"/>
+          <w:szCs w:val="24"/>
+        </w:rPr>
+      </w:pPr>
+      <w:r>
+        <w:rPr>
+          <w:rFonts w:ascii="Aptos" w:hAnsi="Aptos"/>
+          <w:b/>
+          <w:bCs/>
+          <w:sz w:val="24"/>
+          <w:szCs w:val="24"/>
+        </w:rPr>
+        <w:t>Attributes (Data):</w:t>
+      </w:r>
+      <w:r>
+        <w:rPr>
+          <w:rFonts w:ascii="Aptos" w:hAnsi="Aptos"/>
+          <w:sz w:val="24"/>
+          <w:szCs w:val="24"/>
+        </w:rPr>
+        <w:t xml:space="preserve"> What the object knows (like variables).</w:t>
+      </w:r>
+    </w:p>
+    <w:p>
+      <w:pPr>
+        <w:numPr>
+          <w:ilvl w:val="0"/>
+          <w:numId w:val="10"/>
+        </w:numPr>
+        <w:rPr>
+          <w:rFonts w:ascii="Aptos" w:hAnsi="Aptos"/>
+          <w:sz w:val="24"/>
+          <w:szCs w:val="24"/>
+        </w:rPr>
+      </w:pPr>
+      <w:r>
+        <w:rPr>
+          <w:rFonts w:ascii="Aptos" w:hAnsi="Aptos"/>
+          <w:b/>
+          <w:bCs/>
+          <w:sz w:val="24"/>
+          <w:szCs w:val="24"/>
+        </w:rPr>
+        <w:t>Methods (</w:t>
+      </w:r>
+      <w:proofErr w:type="spellStart"/>
+      <w:r>
+        <w:rPr>
+          <w:rFonts w:ascii="Aptos" w:hAnsi="Aptos"/>
+          <w:b/>
+          <w:bCs/>
+          <w:sz w:val="24"/>
+          <w:szCs w:val="24"/>
+        </w:rPr>
+        <w:t>Behaviors</w:t>
+      </w:r>
+      <w:proofErr w:type="spellEnd"/>
+      <w:r>
+        <w:rPr>
+          <w:rFonts w:ascii="Aptos" w:hAnsi="Aptos"/>
+          <w:b/>
+          <w:bCs/>
+          <w:sz w:val="24"/>
+          <w:szCs w:val="24"/>
+        </w:rPr>
+        <w:t>):</w:t>
+      </w:r>
+      <w:r>
+        <w:rPr>
+          <w:rFonts w:ascii="Aptos" w:hAnsi="Aptos"/>
+          <w:sz w:val="24"/>
+          <w:szCs w:val="24"/>
+        </w:rPr>
+        <w:t xml:space="preserve"> What the object can do (like functions).</w:t>
+      </w:r>
+    </w:p>
+    <w:p>
+      <w:pPr>
+        <w:rPr>
+          <w:rFonts w:ascii="Aptos" w:hAnsi="Aptos"/>
+          <w:sz w:val="24"/>
+          <w:szCs w:val="24"/>
+        </w:rPr>
+      </w:pPr>
+    </w:p>
+    <w:p>
+      <w:pPr>
+        <w:rPr>
+          <w:rFonts w:ascii="Aptos" w:hAnsi="Aptos"/>
+          <w:sz w:val="24"/>
+          <w:szCs w:val="24"/>
+        </w:rPr>
+      </w:pPr>
+      <w:r>
+        <w:rPr>
+          <w:rFonts w:ascii="Aptos" w:hAnsi="Aptos"/>
+          <w:b/>
+          <w:bCs/>
+          <w:sz w:val="24"/>
+          <w:szCs w:val="24"/>
+        </w:rPr>
+        <w:t>Object</w:t>
+      </w:r>
+      <w:r>
+        <w:rPr>
+          <w:rFonts w:ascii="Aptos" w:hAnsi="Aptos"/>
+          <w:sz w:val="24"/>
+          <w:szCs w:val="24"/>
+        </w:rPr>
+        <w:t xml:space="preserve">- </w:t>
+      </w:r>
+      <w:r>
+        <w:rPr>
+          <w:rFonts w:ascii="Aptos" w:hAnsi="Aptos"/>
+          <w:sz w:val="24"/>
+          <w:szCs w:val="24"/>
+        </w:rPr>
+        <w:t>Object is the actual, physical thing built from that blueprint</w:t>
+      </w:r>
+      <w:r>
+        <w:rPr>
+          <w:rFonts w:ascii="Aptos" w:hAnsi="Aptos"/>
+          <w:sz w:val="24"/>
+          <w:szCs w:val="24"/>
+        </w:rPr>
+        <w:t>.</w:t>
+      </w:r>
+    </w:p>
+    <w:p>
+      <w:pPr>
+        <w:rPr>
+          <w:rFonts w:ascii="Aptos" w:hAnsi="Aptos"/>
+          <w:sz w:val="24"/>
+          <w:szCs w:val="24"/>
+        </w:rPr>
+      </w:pPr>
+      <w:r>
+        <w:rPr>
+          <w:rFonts w:ascii="Aptos" w:hAnsi="Aptos"/>
+          <w:sz w:val="24"/>
+          <w:szCs w:val="24"/>
+        </w:rPr>
+        <w:t xml:space="preserve"> </w:t>
+      </w:r>
+    </w:p>
+    <w:p>
+      <w:pPr>
+        <w:rPr>
+          <w:rFonts w:ascii="Aptos" w:hAnsi="Aptos"/>
+          <w:sz w:val="24"/>
+          <w:szCs w:val="24"/>
+        </w:rPr>
+      </w:pPr>
+      <w:r>
+        <w:rPr>
+          <w:rFonts w:ascii="Aptos" w:hAnsi="Aptos"/>
+          <w:b/>
+          <w:bCs/>
+          <w:sz w:val="24"/>
+          <w:szCs w:val="24"/>
+        </w:rPr>
+        <w:t>__</w:t>
+      </w:r>
+      <w:proofErr w:type="spellStart"/>
+      <w:r>
+        <w:rPr>
+          <w:rFonts w:ascii="Aptos" w:hAnsi="Aptos"/>
+          <w:b/>
+          <w:bCs/>
+          <w:sz w:val="24"/>
+          <w:szCs w:val="24"/>
+        </w:rPr>
+        <w:t>init</w:t>
+      </w:r>
+      <w:proofErr w:type="spellEnd"/>
+      <w:r>
+        <w:rPr>
+          <w:rFonts w:ascii="Aptos" w:hAnsi="Aptos"/>
+          <w:b/>
+          <w:bCs/>
+          <w:sz w:val="24"/>
+          <w:szCs w:val="24"/>
+        </w:rPr>
+        <w:t>_</w:t>
+      </w:r>
+      <w:proofErr w:type="gramStart"/>
+      <w:r>
+        <w:rPr>
+          <w:rFonts w:ascii="Aptos" w:hAnsi="Aptos"/>
+          <w:b/>
+          <w:bCs/>
+          <w:sz w:val="24"/>
+          <w:szCs w:val="24"/>
+        </w:rPr>
+        <w:t>_(</w:t>
+      </w:r>
+      <w:proofErr w:type="gramEnd"/>
+      <w:r>
+        <w:rPr>
+          <w:rFonts w:ascii="Aptos" w:hAnsi="Aptos"/>
+          <w:b/>
+          <w:bCs/>
+          <w:sz w:val="24"/>
+          <w:szCs w:val="24"/>
+        </w:rPr>
+        <w:t>)</w:t>
+      </w:r>
+      <w:r>
+        <w:rPr>
+          <w:rFonts w:ascii="Aptos" w:hAnsi="Aptos"/>
+          <w:sz w:val="24"/>
+          <w:szCs w:val="24"/>
+        </w:rPr>
+        <w:t xml:space="preserve"> - </w:t>
+      </w:r>
+      <w:r>
+        <w:rPr>
+          <w:rFonts w:ascii="Aptos" w:hAnsi="Aptos"/>
+          <w:sz w:val="24"/>
+          <w:szCs w:val="24"/>
+        </w:rPr>
+        <w:t>is a special method known as a constructor. Its primary job is to initialize the attributes of an object the moment it is created.</w:t>
+      </w:r>
+      <w:r>
+        <w:rPr>
+          <w:rFonts w:ascii="Aptos" w:hAnsi="Aptos"/>
+          <w:sz w:val="24"/>
+          <w:szCs w:val="24"/>
+        </w:rPr>
+        <w:t xml:space="preserve"> </w:t>
+      </w:r>
+      <w:r>
+        <w:rPr>
+          <w:rFonts w:ascii="Aptos" w:hAnsi="Aptos"/>
+          <w:sz w:val="24"/>
+          <w:szCs w:val="24"/>
+        </w:rPr>
+        <w:t xml:space="preserve">It requires the </w:t>
+      </w:r>
+      <w:proofErr w:type="spellStart"/>
+      <w:r>
+        <w:rPr>
+          <w:rFonts w:ascii="Aptos" w:hAnsi="Aptos"/>
+          <w:sz w:val="24"/>
+          <w:szCs w:val="24"/>
+        </w:rPr>
+        <w:t>self parameter</w:t>
+      </w:r>
+      <w:proofErr w:type="spellEnd"/>
+      <w:r>
+        <w:rPr>
+          <w:rFonts w:ascii="Aptos" w:hAnsi="Aptos"/>
+          <w:sz w:val="24"/>
+          <w:szCs w:val="24"/>
+        </w:rPr>
+        <w:t>, which represents the specific object being built, allowing us to assign real data to it right out of the gate.</w:t>
+      </w:r>
+    </w:p>
+    <w:p>
+      <w:pPr>
+        <w:rPr>
+          <w:rFonts w:ascii="Aptos" w:hAnsi="Aptos"/>
+          <w:sz w:val="24"/>
+          <w:szCs w:val="24"/>
+        </w:rPr>
+      </w:pPr>
+    </w:p>
+    <w:p>
+      <w:pPr>
+        <w:rPr>
+          <w:rFonts w:ascii="Aptos" w:hAnsi="Aptos"/>
+          <w:i/>
+          <w:iCs/>
+          <w:sz w:val="24"/>
+          <w:szCs w:val="24"/>
+        </w:rPr>
+      </w:pPr>
+      <w:r>
+        <w:rPr>
+          <w:rFonts w:ascii="Aptos" w:hAnsi="Aptos"/>
+          <w:b/>
+          <w:bCs/>
+          <w:sz w:val="24"/>
+          <w:szCs w:val="24"/>
+        </w:rPr>
+        <w:t>S</w:t>
+      </w:r>
+      <w:r>
+        <w:rPr>
+          <w:rFonts w:ascii="Aptos" w:hAnsi="Aptos"/>
+          <w:b/>
+          <w:bCs/>
+          <w:sz w:val="24"/>
+          <w:szCs w:val="24"/>
+        </w:rPr>
+        <w:t>elf</w:t>
+      </w:r>
+      <w:r>
+        <w:rPr>
+          <w:rFonts w:ascii="Aptos" w:hAnsi="Aptos"/>
+          <w:b/>
+          <w:bCs/>
+          <w:sz w:val="24"/>
+          <w:szCs w:val="24"/>
+        </w:rPr>
+        <w:t>-</w:t>
+      </w:r>
+      <w:r>
+        <w:rPr>
+          <w:rFonts w:ascii="Aptos" w:hAnsi="Aptos"/>
+          <w:sz w:val="24"/>
+          <w:szCs w:val="24"/>
+        </w:rPr>
+        <w:t xml:space="preserve"> is a reference variable that points to the current instance of the class</w:t>
+      </w:r>
+      <w:r>
+        <w:rPr>
+          <w:rFonts w:ascii="Aptos" w:hAnsi="Aptos"/>
+          <w:sz w:val="24"/>
+          <w:szCs w:val="24"/>
+        </w:rPr>
+        <w:t xml:space="preserve">. </w:t>
+      </w:r>
+      <w:r>
+        <w:rPr>
+          <w:rFonts w:ascii="Aptos" w:hAnsi="Aptos"/>
+          <w:sz w:val="24"/>
+          <w:szCs w:val="24"/>
+        </w:rPr>
+        <w:t xml:space="preserve">It tells the class: </w:t>
+      </w:r>
+      <w:r>
+        <w:rPr>
+          <w:rFonts w:ascii="Aptos" w:hAnsi="Aptos"/>
+          <w:i/>
+          <w:iCs/>
+          <w:sz w:val="24"/>
+          <w:szCs w:val="24"/>
+        </w:rPr>
+        <w:t>'Apply this action or data to this specific object instance right here, not the others.'</w:t>
+      </w:r>
+    </w:p>
+    <w:p>
+      <w:pPr>
+        <w:rPr>
+          <w:rFonts w:ascii="Aptos" w:hAnsi="Aptos"/>
+          <w:i/>
+          <w:iCs/>
+          <w:sz w:val="24"/>
+          <w:szCs w:val="24"/>
+        </w:rPr>
+      </w:pPr>
+    </w:p>
+    <w:p>
+      <w:pPr>
+        <w:rPr>
+          <w:rFonts w:ascii="Aptos" w:hAnsi="Aptos"/>
+          <w:sz w:val="24"/>
+          <w:szCs w:val="24"/>
+        </w:rPr>
+      </w:pPr>
+      <w:r>
+        <w:rPr>
+          <w:rFonts w:ascii="Aptos" w:hAnsi="Aptos"/>
+          <w:b/>
+          <w:bCs/>
+          <w:sz w:val="24"/>
+          <w:szCs w:val="24"/>
+        </w:rPr>
+        <w:t>Method</w:t>
+      </w:r>
+      <w:r>
+        <w:rPr>
+          <w:rFonts w:ascii="Aptos" w:hAnsi="Aptos"/>
+          <w:b/>
+          <w:bCs/>
+          <w:sz w:val="24"/>
+          <w:szCs w:val="24"/>
+        </w:rPr>
+        <w:t>-</w:t>
+      </w:r>
+      <w:r>
+        <w:rPr>
+          <w:rFonts w:ascii="Aptos" w:hAnsi="Aptos"/>
+          <w:sz w:val="24"/>
+          <w:szCs w:val="24"/>
+        </w:rPr>
+        <w:t xml:space="preserve"> is essentially a function, it lives inside a class and is tied to an object.</w:t>
+      </w:r>
+    </w:p>
+    <w:p>
+      <w:pPr>
+        <w:rPr>
+          <w:rFonts w:ascii="Aptos" w:hAnsi="Aptos"/>
+          <w:sz w:val="24"/>
+          <w:szCs w:val="24"/>
+        </w:rPr>
+      </w:pPr>
+      <w:r>
+        <w:rPr>
+          <w:rFonts w:ascii="Aptos" w:hAnsi="Aptos"/>
+          <w:sz w:val="24"/>
+          <w:szCs w:val="24"/>
+        </w:rPr>
+        <w:t xml:space="preserve">If attributes are the </w:t>
+      </w:r>
+      <w:r>
+        <w:rPr>
+          <w:rFonts w:ascii="Aptos" w:hAnsi="Aptos"/>
+          <w:i/>
+          <w:iCs/>
+          <w:sz w:val="24"/>
+          <w:szCs w:val="24"/>
+        </w:rPr>
+        <w:t>nouns</w:t>
+      </w:r>
+      <w:r>
+        <w:rPr>
+          <w:rFonts w:ascii="Aptos" w:hAnsi="Aptos"/>
+          <w:sz w:val="24"/>
+          <w:szCs w:val="24"/>
+        </w:rPr>
+        <w:t xml:space="preserve"> (what the object knows), methods are the </w:t>
+      </w:r>
+      <w:r>
+        <w:rPr>
+          <w:rFonts w:ascii="Aptos" w:hAnsi="Aptos"/>
+          <w:i/>
+          <w:iCs/>
+          <w:sz w:val="24"/>
+          <w:szCs w:val="24"/>
+        </w:rPr>
+        <w:t>verbs</w:t>
+      </w:r>
+      <w:r>
+        <w:rPr>
+          <w:rFonts w:ascii="Aptos" w:hAnsi="Aptos"/>
+          <w:sz w:val="24"/>
+          <w:szCs w:val="24"/>
+        </w:rPr>
+        <w:t xml:space="preserve"> (what the object can do).</w:t>
+      </w:r>
+    </w:p>
+    <w:p>
+      <w:pPr>
+        <w:rPr>
+          <w:rFonts w:ascii="Aptos" w:hAnsi="Aptos"/>
+          <w:sz w:val="24"/>
+          <w:szCs w:val="24"/>
+        </w:rPr>
+      </w:pPr>
+    </w:p>
+    <w:p>
+      <w:pPr>
+        <w:rPr>
+          <w:rFonts w:ascii="Aptos" w:hAnsi="Aptos"/>
+          <w:sz w:val="24"/>
+          <w:szCs w:val="24"/>
+        </w:rPr>
+      </w:pPr>
+      <w:proofErr w:type="spellStart"/>
+      <w:proofErr w:type="gramStart"/>
+      <w:r>
+        <w:rPr>
+          <w:rFonts w:ascii="Aptos" w:hAnsi="Aptos"/>
+          <w:b/>
+          <w:bCs/>
+          <w:sz w:val="24"/>
+          <w:szCs w:val="24"/>
+        </w:rPr>
+        <w:lastRenderedPageBreak/>
+        <w:t>json.dumps</w:t>
+      </w:r>
+      <w:proofErr w:type="spellEnd"/>
+      <w:proofErr w:type="gramEnd"/>
+      <w:r>
+        <w:rPr>
+          <w:rFonts w:ascii="Aptos" w:hAnsi="Aptos"/>
+          <w:b/>
+          <w:bCs/>
+          <w:sz w:val="24"/>
+          <w:szCs w:val="24"/>
+        </w:rPr>
+        <w:t>()</w:t>
+      </w:r>
+      <w:r>
+        <w:rPr>
+          <w:rFonts w:ascii="Aptos" w:hAnsi="Aptos"/>
+          <w:b/>
+          <w:bCs/>
+          <w:sz w:val="24"/>
+          <w:szCs w:val="24"/>
+        </w:rPr>
+        <w:t xml:space="preserve">- </w:t>
+      </w:r>
+      <w:r>
+        <w:rPr>
+          <w:rFonts w:ascii="Aptos" w:hAnsi="Aptos"/>
+          <w:sz w:val="24"/>
+          <w:szCs w:val="24"/>
+        </w:rPr>
+        <w:t>Converts a Python dictionary into a formatted JSON text string</w:t>
+      </w:r>
+      <w:r>
+        <w:rPr>
+          <w:rFonts w:ascii="Aptos" w:hAnsi="Aptos"/>
+          <w:sz w:val="24"/>
+          <w:szCs w:val="24"/>
+        </w:rPr>
+        <w:t xml:space="preserve">. </w:t>
+      </w:r>
+      <w:r>
+        <w:rPr>
+          <w:rFonts w:ascii="Aptos" w:hAnsi="Aptos"/>
+          <w:sz w:val="24"/>
+          <w:szCs w:val="24"/>
+        </w:rPr>
+        <w:t>Use this when sending data over the web or passing it to an API.</w:t>
+      </w:r>
+    </w:p>
+    <w:p>
+      <w:pPr>
+        <w:rPr>
+          <w:rFonts w:ascii="Aptos" w:hAnsi="Aptos"/>
+          <w:sz w:val="24"/>
+          <w:szCs w:val="24"/>
+        </w:rPr>
+      </w:pPr>
+      <w:proofErr w:type="spellStart"/>
+      <w:proofErr w:type="gramStart"/>
+      <w:r>
+        <w:rPr>
+          <w:rFonts w:ascii="Aptos" w:hAnsi="Aptos"/>
+          <w:b/>
+          <w:bCs/>
+          <w:sz w:val="24"/>
+          <w:szCs w:val="24"/>
+        </w:rPr>
+        <w:t>json.dump</w:t>
+      </w:r>
+      <w:proofErr w:type="spellEnd"/>
+      <w:proofErr w:type="gramEnd"/>
+      <w:r>
+        <w:rPr>
+          <w:rFonts w:ascii="Aptos" w:hAnsi="Aptos"/>
+          <w:b/>
+          <w:bCs/>
+          <w:sz w:val="24"/>
+          <w:szCs w:val="24"/>
+        </w:rPr>
+        <w:t>()</w:t>
+      </w:r>
+      <w:r>
+        <w:rPr>
+          <w:rFonts w:ascii="Aptos" w:hAnsi="Aptos"/>
+          <w:sz w:val="24"/>
+          <w:szCs w:val="24"/>
+        </w:rPr>
+        <w:t xml:space="preserve"> - </w:t>
+      </w:r>
+      <w:r>
+        <w:rPr>
+          <w:rFonts w:ascii="Aptos" w:hAnsi="Aptos"/>
+          <w:sz w:val="24"/>
+          <w:szCs w:val="24"/>
+        </w:rPr>
+        <w:t>Writes your Python dictionary directly into a physical .</w:t>
+      </w:r>
+      <w:proofErr w:type="spellStart"/>
+      <w:r>
+        <w:rPr>
+          <w:rFonts w:ascii="Aptos" w:hAnsi="Aptos"/>
+          <w:sz w:val="24"/>
+          <w:szCs w:val="24"/>
+        </w:rPr>
+        <w:t>json</w:t>
+      </w:r>
+      <w:proofErr w:type="spellEnd"/>
+      <w:r>
+        <w:rPr>
+          <w:rFonts w:ascii="Aptos" w:hAnsi="Aptos"/>
+          <w:sz w:val="24"/>
+          <w:szCs w:val="24"/>
+        </w:rPr>
+        <w:t xml:space="preserve"> file on your computer. </w:t>
+      </w:r>
+    </w:p>
+    <w:p>
+      <w:pPr>
+        <w:rPr>
+          <w:rFonts w:ascii="Aptos" w:hAnsi="Aptos"/>
+          <w:sz w:val="24"/>
+          <w:szCs w:val="24"/>
+        </w:rPr>
+      </w:pPr>
+      <w:proofErr w:type="spellStart"/>
+      <w:proofErr w:type="gramStart"/>
+      <w:r>
+        <w:rPr>
+          <w:rFonts w:ascii="Aptos" w:hAnsi="Aptos"/>
+          <w:b/>
+          <w:bCs/>
+          <w:sz w:val="24"/>
+          <w:szCs w:val="24"/>
+        </w:rPr>
+        <w:t>json.loads</w:t>
+      </w:r>
+      <w:proofErr w:type="spellEnd"/>
+      <w:proofErr w:type="gramEnd"/>
+      <w:r>
+        <w:rPr>
+          <w:rFonts w:ascii="Aptos" w:hAnsi="Aptos"/>
+          <w:b/>
+          <w:bCs/>
+          <w:sz w:val="24"/>
+          <w:szCs w:val="24"/>
+        </w:rPr>
+        <w:t>()</w:t>
+      </w:r>
+      <w:r>
+        <w:rPr>
+          <w:rFonts w:ascii="Aptos" w:hAnsi="Aptos"/>
+          <w:sz w:val="24"/>
+          <w:szCs w:val="24"/>
+        </w:rPr>
+        <w:t xml:space="preserve"> - </w:t>
+      </w:r>
+      <w:r>
+        <w:rPr>
+          <w:rFonts w:ascii="Aptos" w:hAnsi="Aptos"/>
+          <w:sz w:val="24"/>
+          <w:szCs w:val="24"/>
+        </w:rPr>
+        <w:t>Takes a raw JSON text string and parses it back into a usable Python dictionary.</w:t>
+      </w:r>
+    </w:p>
+    <w:p>
+      <w:pPr>
+        <w:rPr>
+          <w:rFonts w:ascii="Aptos" w:hAnsi="Aptos"/>
+          <w:sz w:val="24"/>
+          <w:szCs w:val="24"/>
+        </w:rPr>
+      </w:pPr>
+      <w:proofErr w:type="spellStart"/>
+      <w:proofErr w:type="gramStart"/>
+      <w:r>
+        <w:rPr>
+          <w:rFonts w:ascii="Aptos" w:hAnsi="Aptos"/>
+          <w:b/>
+          <w:bCs/>
+          <w:sz w:val="24"/>
+          <w:szCs w:val="24"/>
+        </w:rPr>
+        <w:t>json.load</w:t>
+      </w:r>
+      <w:proofErr w:type="spellEnd"/>
+      <w:proofErr w:type="gramEnd"/>
+      <w:r>
+        <w:rPr>
+          <w:rFonts w:ascii="Aptos" w:hAnsi="Aptos"/>
+          <w:b/>
+          <w:bCs/>
+          <w:sz w:val="24"/>
+          <w:szCs w:val="24"/>
+        </w:rPr>
+        <w:t>()</w:t>
+      </w:r>
+      <w:r>
+        <w:rPr>
+          <w:rFonts w:ascii="Aptos" w:hAnsi="Aptos"/>
+          <w:sz w:val="24"/>
+          <w:szCs w:val="24"/>
+        </w:rPr>
+        <w:t xml:space="preserve"> - </w:t>
+      </w:r>
+      <w:r>
+        <w:rPr>
+          <w:rFonts w:ascii="Aptos" w:hAnsi="Aptos"/>
+          <w:sz w:val="24"/>
+          <w:szCs w:val="24"/>
+        </w:rPr>
+        <w:t>Opens a physical .</w:t>
+      </w:r>
+      <w:proofErr w:type="spellStart"/>
+      <w:r>
+        <w:rPr>
+          <w:rFonts w:ascii="Aptos" w:hAnsi="Aptos"/>
+          <w:sz w:val="24"/>
+          <w:szCs w:val="24"/>
+        </w:rPr>
+        <w:t>json</w:t>
+      </w:r>
+      <w:proofErr w:type="spellEnd"/>
+      <w:r>
+        <w:rPr>
+          <w:rFonts w:ascii="Aptos" w:hAnsi="Aptos"/>
+          <w:sz w:val="24"/>
+          <w:szCs w:val="24"/>
+        </w:rPr>
+        <w:t xml:space="preserve"> file from your computer and reads it straight into a Python dictionary.</w:t>
+      </w:r>
+    </w:p>
+    <w:p>
+      <w:pPr>
+        <w:rPr>
+          <w:rFonts w:ascii="Aptos" w:hAnsi="Aptos"/>
+          <w:sz w:val="24"/>
+          <w:szCs w:val="24"/>
+        </w:rPr>
+      </w:pPr>
+    </w:p>
+    <w:p>
+      <w:pPr>
+        <w:rPr>
+          <w:rFonts w:ascii="Aptos" w:hAnsi="Aptos"/>
+          <w:sz w:val="24"/>
+          <w:szCs w:val="24"/>
+        </w:rPr>
+      </w:pPr>
+      <w:r>
+        <w:rPr>
+          <w:rFonts w:ascii="Aptos" w:hAnsi="Aptos"/>
+          <w:b/>
+          <w:bCs/>
+          <w:sz w:val="24"/>
+          <w:szCs w:val="24"/>
+        </w:rPr>
+        <w:t>Module</w:t>
+      </w:r>
+      <w:r>
+        <w:rPr>
+          <w:rFonts w:ascii="Aptos" w:hAnsi="Aptos"/>
+          <w:sz w:val="24"/>
+          <w:szCs w:val="24"/>
+        </w:rPr>
+        <w:t xml:space="preserve">- </w:t>
+      </w:r>
+      <w:r>
+        <w:rPr>
+          <w:rFonts w:ascii="Aptos" w:hAnsi="Aptos"/>
+          <w:sz w:val="24"/>
+          <w:szCs w:val="24"/>
+        </w:rPr>
+        <w:t>a single Python file ending in .</w:t>
+      </w:r>
+      <w:proofErr w:type="spellStart"/>
+      <w:r>
+        <w:rPr>
+          <w:rFonts w:ascii="Aptos" w:hAnsi="Aptos"/>
+          <w:sz w:val="24"/>
+          <w:szCs w:val="24"/>
+        </w:rPr>
+        <w:t>py</w:t>
+      </w:r>
+      <w:proofErr w:type="spellEnd"/>
+      <w:r>
+        <w:rPr>
+          <w:rFonts w:ascii="Aptos" w:hAnsi="Aptos"/>
+          <w:sz w:val="24"/>
+          <w:szCs w:val="24"/>
+        </w:rPr>
+        <w:t>. It contains variables, functions, and classes that belong together.</w:t>
+      </w:r>
+    </w:p>
+    <w:p>
+      <w:pPr>
+        <w:rPr>
+          <w:rFonts w:ascii="Aptos" w:hAnsi="Aptos"/>
+          <w:sz w:val="24"/>
+          <w:szCs w:val="24"/>
+        </w:rPr>
+      </w:pPr>
+    </w:p>
+    <w:p>
+      <w:pPr>
+        <w:rPr>
+          <w:rFonts w:ascii="Aptos" w:hAnsi="Aptos"/>
+          <w:sz w:val="24"/>
+          <w:szCs w:val="24"/>
+        </w:rPr>
+      </w:pPr>
+      <w:r>
+        <w:rPr>
+          <w:rFonts w:ascii="Aptos" w:hAnsi="Aptos"/>
+          <w:b/>
+          <w:bCs/>
+          <w:sz w:val="24"/>
+          <w:szCs w:val="24"/>
+        </w:rPr>
+        <w:t>Package</w:t>
+      </w:r>
+      <w:r>
+        <w:rPr>
+          <w:rFonts w:ascii="Aptos" w:hAnsi="Aptos"/>
+          <w:sz w:val="24"/>
+          <w:szCs w:val="24"/>
+        </w:rPr>
+        <w:t xml:space="preserve">- </w:t>
+      </w:r>
+      <w:r>
+        <w:rPr>
+          <w:rFonts w:ascii="Aptos" w:hAnsi="Aptos"/>
+          <w:sz w:val="24"/>
+          <w:szCs w:val="24"/>
+        </w:rPr>
+        <w:t>a directory or folder containing multiple modules.</w:t>
+      </w:r>
+    </w:p>
+    <w:p>
+      <w:pPr>
+        <w:rPr>
+          <w:rFonts w:ascii="Aptos" w:hAnsi="Aptos"/>
+          <w:sz w:val="24"/>
+          <w:szCs w:val="24"/>
+        </w:rPr>
+      </w:pPr>
     </w:p>
     <w:p>
       <w:pPr>
@@ -5446,6 +6479,119 @@
     </w:lvl>
   </w:abstractNum>
   <w:abstractNum w:abstractNumId="2" w15:restartNumberingAfterBreak="0">
+    <w:nsid w:val="237B6F3B"/>
+    <w:multiLevelType w:val="multilevel"/>
+    <w:tmpl w:val="EDF2DEE2"/>
+    <w:lvl w:ilvl="0">
+      <w:start w:val="1"/>
+      <w:numFmt w:val="decimal"/>
+      <w:lvlText w:val="%1."/>
+      <w:lvlJc w:val="left"/>
+      <w:pPr>
+        <w:tabs>
+          <w:tab w:val="num" w:pos="720"/>
+        </w:tabs>
+        <w:ind w:left="720" w:hanging="360"/>
+      </w:pPr>
+    </w:lvl>
+    <w:lvl w:ilvl="1" w:tentative="1">
+      <w:start w:val="1"/>
+      <w:numFmt w:val="decimal"/>
+      <w:lvlText w:val="%2."/>
+      <w:lvlJc w:val="left"/>
+      <w:pPr>
+        <w:tabs>
+          <w:tab w:val="num" w:pos="1440"/>
+        </w:tabs>
+        <w:ind w:left="1440" w:hanging="360"/>
+      </w:pPr>
+    </w:lvl>
+    <w:lvl w:ilvl="2" w:tentative="1">
+      <w:start w:val="1"/>
+      <w:numFmt w:val="decimal"/>
+      <w:lvlText w:val="%3."/>
+      <w:lvlJc w:val="left"/>
+      <w:pPr>
+        <w:tabs>
+          <w:tab w:val="num" w:pos="2160"/>
+        </w:tabs>
+        <w:ind w:left="2160" w:hanging="360"/>
+      </w:pPr>
+    </w:lvl>
+    <w:lvl w:ilvl="3" w:tentative="1">
+      <w:start w:val="1"/>
+      <w:numFmt w:val="decimal"/>
+      <w:lvlText w:val="%4."/>
+      <w:lvlJc w:val="left"/>
+      <w:pPr>
+        <w:tabs>
+          <w:tab w:val="num" w:pos="2880"/>
+        </w:tabs>
+        <w:ind w:left="2880" w:hanging="360"/>
+      </w:pPr>
+    </w:lvl>
+    <w:lvl w:ilvl="4" w:tentative="1">
+      <w:start w:val="1"/>
+      <w:numFmt w:val="decimal"/>
+      <w:lvlText w:val="%5."/>
+      <w:lvlJc w:val="left"/>
+      <w:pPr>
+        <w:tabs>
+          <w:tab w:val="num" w:pos="3600"/>
+        </w:tabs>
+        <w:ind w:left="3600" w:hanging="360"/>
+      </w:pPr>
+    </w:lvl>
+    <w:lvl w:ilvl="5" w:tentative="1">
+      <w:start w:val="1"/>
+      <w:numFmt w:val="decimal"/>
+      <w:lvlText w:val="%6."/>
+      <w:lvlJc w:val="left"/>
+      <w:pPr>
+        <w:tabs>
+          <w:tab w:val="num" w:pos="4320"/>
+        </w:tabs>
+        <w:ind w:left="4320" w:hanging="360"/>
+      </w:pPr>
+    </w:lvl>
+    <w:lvl w:ilvl="6" w:tentative="1">
+      <w:start w:val="1"/>
+      <w:numFmt w:val="decimal"/>
+      <w:lvlText w:val="%7."/>
+      <w:lvlJc w:val="left"/>
+      <w:pPr>
+        <w:tabs>
+          <w:tab w:val="num" w:pos="5040"/>
+        </w:tabs>
+        <w:ind w:left="5040" w:hanging="360"/>
+      </w:pPr>
+    </w:lvl>
+    <w:lvl w:ilvl="7" w:tentative="1">
+      <w:start w:val="1"/>
+      <w:numFmt w:val="decimal"/>
+      <w:lvlText w:val="%8."/>
+      <w:lvlJc w:val="left"/>
+      <w:pPr>
+        <w:tabs>
+          <w:tab w:val="num" w:pos="5760"/>
+        </w:tabs>
+        <w:ind w:left="5760" w:hanging="360"/>
+      </w:pPr>
+    </w:lvl>
+    <w:lvl w:ilvl="8" w:tentative="1">
+      <w:start w:val="1"/>
+      <w:numFmt w:val="decimal"/>
+      <w:lvlText w:val="%9."/>
+      <w:lvlJc w:val="left"/>
+      <w:pPr>
+        <w:tabs>
+          <w:tab w:val="num" w:pos="6480"/>
+        </w:tabs>
+        <w:ind w:left="6480" w:hanging="360"/>
+      </w:pPr>
+    </w:lvl>
+  </w:abstractNum>
+  <w:abstractNum w:abstractNumId="3" w15:restartNumberingAfterBreak="0">
     <w:nsid w:val="2B4D6E6F"/>
     <w:multiLevelType w:val="hybridMultilevel"/>
     <w:tmpl w:val="BC5209C8"/>
@@ -5531,7 +6677,7 @@
       </w:pPr>
     </w:lvl>
   </w:abstractNum>
-  <w:abstractNum w:abstractNumId="3" w15:restartNumberingAfterBreak="0">
+  <w:abstractNum w:abstractNumId="4" w15:restartNumberingAfterBreak="0">
     <w:nsid w:val="382C35D8"/>
     <w:multiLevelType w:val="multilevel"/>
     <w:tmpl w:val="AAAAEC82"/>
@@ -5680,7 +6826,7 @@
       </w:rPr>
     </w:lvl>
   </w:abstractNum>
-  <w:abstractNum w:abstractNumId="4" w15:restartNumberingAfterBreak="0">
+  <w:abstractNum w:abstractNumId="5" w15:restartNumberingAfterBreak="0">
     <w:nsid w:val="451F0311"/>
     <w:multiLevelType w:val="hybridMultilevel"/>
     <w:tmpl w:val="C292EB6C"/>
@@ -5769,7 +6915,7 @@
       </w:pPr>
     </w:lvl>
   </w:abstractNum>
-  <w:abstractNum w:abstractNumId="5" w15:restartNumberingAfterBreak="0">
+  <w:abstractNum w:abstractNumId="6" w15:restartNumberingAfterBreak="0">
     <w:nsid w:val="58CF4881"/>
     <w:multiLevelType w:val="hybridMultilevel"/>
     <w:tmpl w:val="77EE7A1C"/>
@@ -5881,7 +7027,7 @@
       </w:rPr>
     </w:lvl>
   </w:abstractNum>
-  <w:abstractNum w:abstractNumId="6" w15:restartNumberingAfterBreak="0">
+  <w:abstractNum w:abstractNumId="7" w15:restartNumberingAfterBreak="0">
     <w:nsid w:val="66227C1A"/>
     <w:multiLevelType w:val="hybridMultilevel"/>
     <w:tmpl w:val="82068D66"/>
@@ -5994,7 +7140,7 @@
       </w:rPr>
     </w:lvl>
   </w:abstractNum>
-  <w:abstractNum w:abstractNumId="7" w15:restartNumberingAfterBreak="0">
+  <w:abstractNum w:abstractNumId="8" w15:restartNumberingAfterBreak="0">
     <w:nsid w:val="70AE0F10"/>
     <w:multiLevelType w:val="hybridMultilevel"/>
     <w:tmpl w:val="6CBE34D0"/>
@@ -6080,7 +7226,7 @@
       </w:pPr>
     </w:lvl>
   </w:abstractNum>
-  <w:abstractNum w:abstractNumId="8" w15:restartNumberingAfterBreak="0">
+  <w:abstractNum w:abstractNumId="9" w15:restartNumberingAfterBreak="0">
     <w:nsid w:val="762F327D"/>
     <w:multiLevelType w:val="hybridMultilevel"/>
     <w:tmpl w:val="3F146536"/>
@@ -6194,31 +7340,34 @@
     </w:lvl>
   </w:abstractNum>
   <w:num w:numId="1" w16cid:durableId="1732650367">
-    <w:abstractNumId w:val="2"/>
+    <w:abstractNumId w:val="3"/>
   </w:num>
   <w:num w:numId="2" w16cid:durableId="1496343170">
-    <w:abstractNumId w:val="5"/>
+    <w:abstractNumId w:val="6"/>
   </w:num>
   <w:num w:numId="3" w16cid:durableId="49767029">
-    <w:abstractNumId w:val="7"/>
+    <w:abstractNumId w:val="8"/>
   </w:num>
   <w:num w:numId="4" w16cid:durableId="374893099">
     <w:abstractNumId w:val="1"/>
   </w:num>
   <w:num w:numId="5" w16cid:durableId="1740667314">
-    <w:abstractNumId w:val="6"/>
+    <w:abstractNumId w:val="7"/>
   </w:num>
   <w:num w:numId="6" w16cid:durableId="211429764">
-    <w:abstractNumId w:val="8"/>
+    <w:abstractNumId w:val="9"/>
   </w:num>
   <w:num w:numId="7" w16cid:durableId="205803120">
-    <w:abstractNumId w:val="4"/>
+    <w:abstractNumId w:val="5"/>
   </w:num>
   <w:num w:numId="8" w16cid:durableId="1639070327">
-    <w:abstractNumId w:val="3"/>
+    <w:abstractNumId w:val="4"/>
   </w:num>
   <w:num w:numId="9" w16cid:durableId="623119324">
     <w:abstractNumId w:val="0"/>
+  </w:num>
+  <w:num w:numId="10" w16cid:durableId="393817826">
+    <w:abstractNumId w:val="2"/>
   </w:num>
 </w:numbering>
 </file>

</xml_diff>

<commit_message>
Day 2: Notes and work uploaded
</commit_message>
<xml_diff>
--- a/notes/AGENTIC AI DAILY WORK.docx
+++ b/notes/AGENTIC AI DAILY WORK.docx
@@ -472,9 +472,9 @@
           <w:sz w:val="24"/>
           <w:szCs w:val="24"/>
         </w:rPr>
-        <w:t>generate_</w:t>
-      </w:r>
-      <w:proofErr w:type="gramStart"/>
+        <w:t>generate_content</w:t>
+      </w:r>
+      <w:proofErr w:type="spellEnd"/>
       <w:r>
         <w:rPr>
           <w:rFonts w:ascii="Aptos" w:hAnsi="Aptos"/>
@@ -482,27 +482,7 @@
           <w:sz w:val="24"/>
           <w:szCs w:val="24"/>
         </w:rPr>
-        <w:t>content</w:t>
-      </w:r>
-      <w:proofErr w:type="spellEnd"/>
-      <w:r>
-        <w:rPr>
-          <w:rFonts w:ascii="Aptos" w:hAnsi="Aptos"/>
-          <w:color w:val="7030A0"/>
-          <w:sz w:val="24"/>
-          <w:szCs w:val="24"/>
-        </w:rPr>
-        <w:t>(</w:t>
-      </w:r>
-      <w:proofErr w:type="gramEnd"/>
-      <w:r>
-        <w:rPr>
-          <w:rFonts w:ascii="Aptos" w:hAnsi="Aptos"/>
-          <w:color w:val="7030A0"/>
-          <w:sz w:val="24"/>
-          <w:szCs w:val="24"/>
-        </w:rPr>
-        <w:t>)?</w:t>
+        <w:t>()?</w:t>
       </w:r>
     </w:p>
     <w:p>
@@ -2422,25 +2402,7 @@
           <w:sz w:val="24"/>
           <w:szCs w:val="24"/>
         </w:rPr>
-        <w:t xml:space="preserve">a numerical representation of text where words or concepts with similar meanings are mapped to vectors that are close to each other in a multi-dimensional space. It acts as a "meaning map" that translates human language into a </w:t>
-      </w:r>
-      <w:proofErr w:type="gramStart"/>
-      <w:r>
-        <w:rPr>
-          <w:rFonts w:ascii="Aptos" w:hAnsi="Aptos"/>
-          <w:sz w:val="24"/>
-          <w:szCs w:val="24"/>
-        </w:rPr>
-        <w:t>language machines</w:t>
-      </w:r>
-      <w:proofErr w:type="gramEnd"/>
-      <w:r>
-        <w:rPr>
-          <w:rFonts w:ascii="Aptos" w:hAnsi="Aptos"/>
-          <w:sz w:val="24"/>
-          <w:szCs w:val="24"/>
-        </w:rPr>
-        <w:t xml:space="preserve"> can process mathematically. </w:t>
+        <w:t xml:space="preserve">a numerical representation of text where words or concepts with similar meanings are mapped to vectors that are close to each other in a multi-dimensional space. It acts as a "meaning map" that translates human language into a language machines can process mathematically. </w:t>
       </w:r>
     </w:p>
     <w:p>
@@ -2842,7 +2804,6 @@
                 <w:szCs w:val="24"/>
               </w:rPr>
             </w:pPr>
-            <w:proofErr w:type="gramStart"/>
             <w:r>
               <w:rPr>
                 <w:rFonts w:ascii="Aptos" w:hAnsi="Aptos"/>
@@ -2861,7 +2822,6 @@
               <w:t>venv</w:t>
             </w:r>
             <w:proofErr w:type="spellEnd"/>
-            <w:proofErr w:type="gramEnd"/>
           </w:p>
         </w:tc>
         <w:tc>
@@ -2906,7 +2866,6 @@
                 <w:szCs w:val="24"/>
               </w:rPr>
             </w:pPr>
-            <w:proofErr w:type="gramStart"/>
             <w:r>
               <w:rPr>
                 <w:rFonts w:ascii="Aptos" w:hAnsi="Aptos"/>
@@ -2915,7 +2874,6 @@
               </w:rPr>
               <w:t>.env</w:t>
             </w:r>
-            <w:proofErr w:type="gramEnd"/>
           </w:p>
         </w:tc>
         <w:tc>
@@ -2960,7 +2918,6 @@
                 <w:szCs w:val="24"/>
               </w:rPr>
             </w:pPr>
-            <w:proofErr w:type="gramStart"/>
             <w:r>
               <w:rPr>
                 <w:rFonts w:ascii="Aptos" w:hAnsi="Aptos"/>
@@ -2979,7 +2936,6 @@
               <w:t>gitignore</w:t>
             </w:r>
             <w:proofErr w:type="spellEnd"/>
-            <w:proofErr w:type="gramEnd"/>
           </w:p>
         </w:tc>
         <w:tc>
@@ -3170,7 +3126,6 @@
         <w:t xml:space="preserve">python -m </w:t>
       </w:r>
       <w:proofErr w:type="spellStart"/>
-      <w:proofErr w:type="gramStart"/>
       <w:r>
         <w:rPr>
           <w:rFonts w:ascii="Aptos" w:hAnsi="Aptos"/>
@@ -3201,7 +3156,6 @@
         <w:t>venv</w:t>
       </w:r>
       <w:proofErr w:type="spellEnd"/>
-      <w:proofErr w:type="gramEnd"/>
     </w:p>
     <w:p>
       <w:pPr>
@@ -3292,7 +3246,6 @@
           <w:szCs w:val="24"/>
         </w:rPr>
       </w:pPr>
-      <w:proofErr w:type="gramStart"/>
       <w:r>
         <w:rPr>
           <w:rFonts w:ascii="Aptos" w:hAnsi="Aptos"/>
@@ -3311,7 +3264,6 @@
         <w:t>venv</w:t>
       </w:r>
       <w:proofErr w:type="spellEnd"/>
-      <w:proofErr w:type="gramEnd"/>
       <w:r>
         <w:rPr>
           <w:rFonts w:ascii="Aptos" w:hAnsi="Aptos"/>
@@ -3670,25 +3622,7 @@
           <w:sz w:val="24"/>
           <w:szCs w:val="24"/>
         </w:rPr>
-        <w:t xml:space="preserve"> → Reads API keys </w:t>
-      </w:r>
-      <w:proofErr w:type="gramStart"/>
-      <w:r>
-        <w:rPr>
-          <w:rFonts w:ascii="Aptos" w:hAnsi="Aptos"/>
-          <w:sz w:val="24"/>
-          <w:szCs w:val="24"/>
-        </w:rPr>
-        <w:t>from .env</w:t>
-      </w:r>
-      <w:proofErr w:type="gramEnd"/>
-      <w:r>
-        <w:rPr>
-          <w:rFonts w:ascii="Aptos" w:hAnsi="Aptos"/>
-          <w:sz w:val="24"/>
-          <w:szCs w:val="24"/>
-        </w:rPr>
-        <w:t>.</w:t>
+        <w:t xml:space="preserve"> → Reads API keys from .env.</w:t>
       </w:r>
     </w:p>
     <w:p>
@@ -3770,7 +3704,6 @@
           <w:szCs w:val="24"/>
         </w:rPr>
       </w:pPr>
-      <w:proofErr w:type="gramStart"/>
       <w:r>
         <w:rPr>
           <w:rFonts w:ascii="Aptos" w:hAnsi="Aptos"/>
@@ -3781,7 +3714,6 @@
         </w:rPr>
         <w:t>Create .env</w:t>
       </w:r>
-      <w:proofErr w:type="gramEnd"/>
     </w:p>
     <w:p>
       <w:pPr>
@@ -3835,7 +3767,6 @@
           <w:szCs w:val="24"/>
         </w:rPr>
       </w:pPr>
-      <w:proofErr w:type="gramStart"/>
       <w:r>
         <w:rPr>
           <w:rFonts w:ascii="Aptos" w:hAnsi="Aptos"/>
@@ -3858,7 +3789,6 @@
         <w:t>gitignore</w:t>
       </w:r>
       <w:proofErr w:type="spellEnd"/>
-      <w:proofErr w:type="gramEnd"/>
     </w:p>
     <w:p>
       <w:pPr>
@@ -4540,16 +4470,7 @@
                 <w:sz w:val="24"/>
                 <w:szCs w:val="24"/>
               </w:rPr>
-              <w:t>load_</w:t>
-            </w:r>
-            <w:proofErr w:type="gramStart"/>
-            <w:r>
-              <w:rPr>
-                <w:rFonts w:ascii="Aptos" w:hAnsi="Aptos"/>
-                <w:sz w:val="24"/>
-                <w:szCs w:val="24"/>
-              </w:rPr>
-              <w:t>dotenv</w:t>
+              <w:t>load_dotenv</w:t>
             </w:r>
             <w:proofErr w:type="spellEnd"/>
             <w:r>
@@ -4558,16 +4479,7 @@
                 <w:sz w:val="24"/>
                 <w:szCs w:val="24"/>
               </w:rPr>
-              <w:t>(</w:t>
-            </w:r>
-            <w:proofErr w:type="gramEnd"/>
-            <w:r>
-              <w:rPr>
-                <w:rFonts w:ascii="Aptos" w:hAnsi="Aptos"/>
-                <w:sz w:val="24"/>
-                <w:szCs w:val="24"/>
-              </w:rPr>
-              <w:t>)</w:t>
+              <w:t>()</w:t>
             </w:r>
           </w:p>
         </w:tc>
@@ -4585,23 +4497,13 @@
                 <w:szCs w:val="24"/>
               </w:rPr>
             </w:pPr>
-            <w:proofErr w:type="gramStart"/>
             <w:r>
               <w:rPr>
                 <w:rFonts w:ascii="Aptos" w:hAnsi="Aptos"/>
                 <w:sz w:val="24"/>
                 <w:szCs w:val="24"/>
               </w:rPr>
-              <w:t>Load .env</w:t>
-            </w:r>
-            <w:proofErr w:type="gramEnd"/>
-            <w:r>
-              <w:rPr>
-                <w:rFonts w:ascii="Aptos" w:hAnsi="Aptos"/>
-                <w:sz w:val="24"/>
-                <w:szCs w:val="24"/>
-              </w:rPr>
-              <w:t xml:space="preserve"> variables</w:t>
+              <w:t>Load .env variables</w:t>
             </w:r>
           </w:p>
         </w:tc>
@@ -4625,7 +4527,6 @@
               </w:rPr>
             </w:pPr>
             <w:proofErr w:type="spellStart"/>
-            <w:proofErr w:type="gramStart"/>
             <w:r>
               <w:rPr>
                 <w:rFonts w:ascii="Aptos" w:hAnsi="Aptos"/>
@@ -4635,7 +4536,6 @@
               <w:t>os.getenv</w:t>
             </w:r>
             <w:proofErr w:type="spellEnd"/>
-            <w:proofErr w:type="gramEnd"/>
             <w:r>
               <w:rPr>
                 <w:rFonts w:ascii="Aptos" w:hAnsi="Aptos"/>
@@ -4690,7 +4590,6 @@
               </w:rPr>
             </w:pPr>
             <w:proofErr w:type="spellStart"/>
-            <w:proofErr w:type="gramStart"/>
             <w:r>
               <w:rPr>
                 <w:rFonts w:ascii="Aptos" w:hAnsi="Aptos"/>
@@ -4700,7 +4599,6 @@
               <w:t>genai.Client</w:t>
             </w:r>
             <w:proofErr w:type="spellEnd"/>
-            <w:proofErr w:type="gramEnd"/>
             <w:r>
               <w:rPr>
                 <w:rFonts w:ascii="Aptos" w:hAnsi="Aptos"/>
@@ -4761,16 +4659,7 @@
                 <w:sz w:val="24"/>
                 <w:szCs w:val="24"/>
               </w:rPr>
-              <w:t>generate_</w:t>
-            </w:r>
-            <w:proofErr w:type="gramStart"/>
-            <w:r>
-              <w:rPr>
-                <w:rFonts w:ascii="Aptos" w:hAnsi="Aptos"/>
-                <w:sz w:val="24"/>
-                <w:szCs w:val="24"/>
-              </w:rPr>
-              <w:t>content</w:t>
+              <w:t>generate_content</w:t>
             </w:r>
             <w:proofErr w:type="spellEnd"/>
             <w:r>
@@ -4779,16 +4668,7 @@
                 <w:sz w:val="24"/>
                 <w:szCs w:val="24"/>
               </w:rPr>
-              <w:t>(</w:t>
-            </w:r>
-            <w:proofErr w:type="gramEnd"/>
-            <w:r>
-              <w:rPr>
-                <w:rFonts w:ascii="Aptos" w:hAnsi="Aptos"/>
-                <w:sz w:val="24"/>
-                <w:szCs w:val="24"/>
-              </w:rPr>
-              <w:t>)</w:t>
+              <w:t>()</w:t>
             </w:r>
           </w:p>
         </w:tc>
@@ -5573,29 +5453,7 @@
           <w:sz w:val="24"/>
           <w:szCs w:val="24"/>
         </w:rPr>
-        <w:t>_</w:t>
-      </w:r>
-      <w:proofErr w:type="gramStart"/>
-      <w:r>
-        <w:rPr>
-          <w:rFonts w:ascii="Aptos" w:hAnsi="Aptos"/>
-          <w:b/>
-          <w:bCs/>
-          <w:sz w:val="24"/>
-          <w:szCs w:val="24"/>
-        </w:rPr>
-        <w:t>_(</w:t>
-      </w:r>
-      <w:proofErr w:type="gramEnd"/>
-      <w:r>
-        <w:rPr>
-          <w:rFonts w:ascii="Aptos" w:hAnsi="Aptos"/>
-          <w:b/>
-          <w:bCs/>
-          <w:sz w:val="24"/>
-          <w:szCs w:val="24"/>
-        </w:rPr>
-        <w:t>)</w:t>
+        <w:t>__()</w:t>
       </w:r>
       <w:r>
         <w:rPr>
@@ -5825,7 +5683,6 @@
         </w:rPr>
       </w:pPr>
       <w:proofErr w:type="spellStart"/>
-      <w:proofErr w:type="gramStart"/>
       <w:r>
         <w:rPr>
           <w:rFonts w:ascii="Aptos" w:hAnsi="Aptos"/>
@@ -5838,7 +5695,6 @@
         <w:t>json.dumps</w:t>
       </w:r>
       <w:proofErr w:type="spellEnd"/>
-      <w:proofErr w:type="gramEnd"/>
       <w:r>
         <w:rPr>
           <w:rFonts w:ascii="Aptos" w:hAnsi="Aptos"/>
@@ -5893,7 +5749,6 @@
         </w:rPr>
       </w:pPr>
       <w:proofErr w:type="spellStart"/>
-      <w:proofErr w:type="gramStart"/>
       <w:r>
         <w:rPr>
           <w:rFonts w:ascii="Aptos" w:hAnsi="Aptos"/>
@@ -5905,7 +5760,6 @@
         <w:t>json.dump</w:t>
       </w:r>
       <w:proofErr w:type="spellEnd"/>
-      <w:proofErr w:type="gramEnd"/>
       <w:r>
         <w:rPr>
           <w:rFonts w:ascii="Aptos" w:hAnsi="Aptos"/>
@@ -5960,7 +5814,6 @@
         </w:rPr>
       </w:pPr>
       <w:proofErr w:type="spellStart"/>
-      <w:proofErr w:type="gramStart"/>
       <w:r>
         <w:rPr>
           <w:rFonts w:ascii="Aptos" w:hAnsi="Aptos"/>
@@ -5972,7 +5825,6 @@
         <w:t>json.loads</w:t>
       </w:r>
       <w:proofErr w:type="spellEnd"/>
-      <w:proofErr w:type="gramEnd"/>
       <w:r>
         <w:rPr>
           <w:rFonts w:ascii="Aptos" w:hAnsi="Aptos"/>
@@ -6009,7 +5861,6 @@
         </w:rPr>
       </w:pPr>
       <w:proofErr w:type="spellStart"/>
-      <w:proofErr w:type="gramStart"/>
       <w:r>
         <w:rPr>
           <w:rFonts w:ascii="Aptos" w:hAnsi="Aptos"/>
@@ -6021,7 +5872,6 @@
         <w:t>json.load</w:t>
       </w:r>
       <w:proofErr w:type="spellEnd"/>
-      <w:proofErr w:type="gramEnd"/>
       <w:r>
         <w:rPr>
           <w:rFonts w:ascii="Aptos" w:hAnsi="Aptos"/>
@@ -6193,7 +6043,6 @@
         <w:t>*</w:t>
       </w:r>
       <w:proofErr w:type="spellStart"/>
-      <w:proofErr w:type="gramStart"/>
       <w:r>
         <w:rPr>
           <w:rFonts w:ascii="Aptos" w:hAnsi="Aptos"/>
@@ -6205,7 +6054,6 @@
         <w:t>args</w:t>
       </w:r>
       <w:proofErr w:type="spellEnd"/>
-      <w:proofErr w:type="gramEnd"/>
       <w:r>
         <w:rPr>
           <w:rFonts w:ascii="Aptos" w:hAnsi="Aptos"/>
@@ -6366,6 +6214,1058 @@
         </w:rPr>
         <w:t>is a formal annotation used in Python to specify the expected data type of a variable, function argument, or return value. Python remains dynamically typed (it will not crash at runtime if types do not match), but type hints help your code editor catch bugs early and provide better auto-completion.</w:t>
       </w:r>
+    </w:p>
+    <w:p>
+      <w:pPr>
+        <w:rPr>
+          <w:rFonts w:ascii="Aptos" w:hAnsi="Aptos"/>
+          <w:sz w:val="24"/>
+          <w:szCs w:val="24"/>
+        </w:rPr>
+      </w:pPr>
+    </w:p>
+    <w:p>
+      <w:pPr>
+        <w:rPr>
+          <w:rFonts w:ascii="Aptos" w:hAnsi="Aptos"/>
+          <w:b/>
+          <w:bCs/>
+          <w:color w:val="7030A0"/>
+          <w:sz w:val="24"/>
+          <w:szCs w:val="24"/>
+        </w:rPr>
+      </w:pPr>
+      <w:r>
+        <w:rPr>
+          <w:rFonts w:ascii="Aptos" w:hAnsi="Aptos"/>
+          <w:b/>
+          <w:bCs/>
+          <w:color w:val="7030A0"/>
+          <w:sz w:val="24"/>
+          <w:szCs w:val="24"/>
+        </w:rPr>
+        <w:t xml:space="preserve">PART </w:t>
+      </w:r>
+      <w:r>
+        <w:rPr>
+          <w:rFonts w:ascii="Aptos" w:hAnsi="Aptos"/>
+          <w:b/>
+          <w:bCs/>
+          <w:color w:val="7030A0"/>
+          <w:sz w:val="24"/>
+          <w:szCs w:val="24"/>
+        </w:rPr>
+        <w:t>2</w:t>
+      </w:r>
+      <w:r>
+        <w:rPr>
+          <w:rFonts w:ascii="Aptos" w:hAnsi="Aptos"/>
+          <w:b/>
+          <w:bCs/>
+          <w:color w:val="7030A0"/>
+          <w:sz w:val="24"/>
+          <w:szCs w:val="24"/>
+        </w:rPr>
+        <w:t xml:space="preserve"> - </w:t>
+      </w:r>
+      <w:r>
+        <w:rPr>
+          <w:rFonts w:ascii="Aptos" w:hAnsi="Aptos"/>
+          <w:b/>
+          <w:bCs/>
+          <w:color w:val="7030A0"/>
+          <w:sz w:val="24"/>
+          <w:szCs w:val="24"/>
+        </w:rPr>
+        <w:t>LLM Fundamentals</w:t>
+      </w:r>
+    </w:p>
+    <w:p>
+      <w:pPr>
+        <w:rPr>
+          <w:rFonts w:ascii="Aptos" w:hAnsi="Aptos"/>
+          <w:sz w:val="24"/>
+          <w:szCs w:val="24"/>
+        </w:rPr>
+      </w:pPr>
+      <w:r>
+        <w:rPr>
+          <w:rFonts w:ascii="Aptos" w:hAnsi="Aptos"/>
+          <w:sz w:val="24"/>
+          <w:szCs w:val="24"/>
+        </w:rPr>
+        <w:t>1. Transformer</w:t>
+      </w:r>
+      <w:r>
+        <w:rPr>
+          <w:rFonts w:ascii="Aptos" w:hAnsi="Aptos"/>
+          <w:sz w:val="24"/>
+          <w:szCs w:val="24"/>
+        </w:rPr>
+        <w:br/>
+      </w:r>
+      <w:r>
+        <w:rPr>
+          <w:rFonts w:ascii="Aptos" w:hAnsi="Aptos"/>
+          <w:sz w:val="24"/>
+          <w:szCs w:val="24"/>
+        </w:rPr>
+        <w:t xml:space="preserve"> </w:t>
+      </w:r>
+      <w:r>
+        <w:rPr>
+          <w:rFonts w:ascii="Aptos" w:hAnsi="Aptos"/>
+          <w:sz w:val="24"/>
+          <w:szCs w:val="24"/>
+        </w:rPr>
+        <w:tab/>
+      </w:r>
+      <w:r>
+        <w:rPr>
+          <w:rFonts w:ascii="Aptos" w:hAnsi="Aptos"/>
+          <w:sz w:val="24"/>
+          <w:szCs w:val="24"/>
+        </w:rPr>
+        <w:t>↓</w:t>
+      </w:r>
+      <w:r>
+        <w:rPr>
+          <w:rFonts w:ascii="Aptos" w:hAnsi="Aptos"/>
+          <w:sz w:val="24"/>
+          <w:szCs w:val="24"/>
+        </w:rPr>
+        <w:br/>
+        <w:t>2. Tokens</w:t>
+      </w:r>
+      <w:r>
+        <w:rPr>
+          <w:rFonts w:ascii="Aptos" w:hAnsi="Aptos"/>
+          <w:sz w:val="24"/>
+          <w:szCs w:val="24"/>
+        </w:rPr>
+        <w:br/>
+      </w:r>
+      <w:r>
+        <w:rPr>
+          <w:rFonts w:ascii="Aptos" w:hAnsi="Aptos"/>
+          <w:sz w:val="24"/>
+          <w:szCs w:val="24"/>
+        </w:rPr>
+        <w:t xml:space="preserve"> </w:t>
+      </w:r>
+      <w:r>
+        <w:rPr>
+          <w:rFonts w:ascii="Aptos" w:hAnsi="Aptos"/>
+          <w:sz w:val="24"/>
+          <w:szCs w:val="24"/>
+        </w:rPr>
+        <w:tab/>
+      </w:r>
+      <w:r>
+        <w:rPr>
+          <w:rFonts w:ascii="Aptos" w:hAnsi="Aptos"/>
+          <w:sz w:val="24"/>
+          <w:szCs w:val="24"/>
+        </w:rPr>
+        <w:t>↓</w:t>
+      </w:r>
+      <w:r>
+        <w:rPr>
+          <w:rFonts w:ascii="Aptos" w:hAnsi="Aptos"/>
+          <w:sz w:val="24"/>
+          <w:szCs w:val="24"/>
+        </w:rPr>
+        <w:br/>
+        <w:t>3. Tokenization</w:t>
+      </w:r>
+      <w:r>
+        <w:rPr>
+          <w:rFonts w:ascii="Aptos" w:hAnsi="Aptos"/>
+          <w:sz w:val="24"/>
+          <w:szCs w:val="24"/>
+        </w:rPr>
+        <w:br/>
+      </w:r>
+      <w:r>
+        <w:rPr>
+          <w:rFonts w:ascii="Aptos" w:hAnsi="Aptos"/>
+          <w:sz w:val="24"/>
+          <w:szCs w:val="24"/>
+        </w:rPr>
+        <w:t xml:space="preserve"> </w:t>
+      </w:r>
+      <w:r>
+        <w:rPr>
+          <w:rFonts w:ascii="Aptos" w:hAnsi="Aptos"/>
+          <w:sz w:val="24"/>
+          <w:szCs w:val="24"/>
+        </w:rPr>
+        <w:tab/>
+      </w:r>
+      <w:r>
+        <w:rPr>
+          <w:rFonts w:ascii="Aptos" w:hAnsi="Aptos"/>
+          <w:sz w:val="24"/>
+          <w:szCs w:val="24"/>
+        </w:rPr>
+        <w:t>↓</w:t>
+      </w:r>
+      <w:r>
+        <w:rPr>
+          <w:rFonts w:ascii="Aptos" w:hAnsi="Aptos"/>
+          <w:sz w:val="24"/>
+          <w:szCs w:val="24"/>
+        </w:rPr>
+        <w:br/>
+        <w:t>4. Context Window</w:t>
+      </w:r>
+      <w:r>
+        <w:rPr>
+          <w:rFonts w:ascii="Aptos" w:hAnsi="Aptos"/>
+          <w:sz w:val="24"/>
+          <w:szCs w:val="24"/>
+        </w:rPr>
+        <w:br/>
+      </w:r>
+      <w:r>
+        <w:rPr>
+          <w:rFonts w:ascii="Aptos" w:hAnsi="Aptos"/>
+          <w:sz w:val="24"/>
+          <w:szCs w:val="24"/>
+        </w:rPr>
+        <w:t xml:space="preserve"> </w:t>
+      </w:r>
+      <w:r>
+        <w:rPr>
+          <w:rFonts w:ascii="Aptos" w:hAnsi="Aptos"/>
+          <w:sz w:val="24"/>
+          <w:szCs w:val="24"/>
+        </w:rPr>
+        <w:tab/>
+      </w:r>
+      <w:r>
+        <w:rPr>
+          <w:rFonts w:ascii="Aptos" w:hAnsi="Aptos"/>
+          <w:sz w:val="24"/>
+          <w:szCs w:val="24"/>
+        </w:rPr>
+        <w:t>↓</w:t>
+      </w:r>
+      <w:r>
+        <w:rPr>
+          <w:rFonts w:ascii="Aptos" w:hAnsi="Aptos"/>
+          <w:sz w:val="24"/>
+          <w:szCs w:val="24"/>
+        </w:rPr>
+        <w:br/>
+        <w:t>5. Temperature</w:t>
+      </w:r>
+      <w:r>
+        <w:rPr>
+          <w:rFonts w:ascii="Aptos" w:hAnsi="Aptos"/>
+          <w:sz w:val="24"/>
+          <w:szCs w:val="24"/>
+        </w:rPr>
+        <w:br/>
+      </w:r>
+      <w:r>
+        <w:rPr>
+          <w:rFonts w:ascii="Aptos" w:hAnsi="Aptos"/>
+          <w:sz w:val="24"/>
+          <w:szCs w:val="24"/>
+        </w:rPr>
+        <w:lastRenderedPageBreak/>
+        <w:t xml:space="preserve"> </w:t>
+      </w:r>
+      <w:r>
+        <w:rPr>
+          <w:rFonts w:ascii="Aptos" w:hAnsi="Aptos"/>
+          <w:sz w:val="24"/>
+          <w:szCs w:val="24"/>
+        </w:rPr>
+        <w:tab/>
+      </w:r>
+      <w:r>
+        <w:rPr>
+          <w:rFonts w:ascii="Aptos" w:hAnsi="Aptos"/>
+          <w:sz w:val="24"/>
+          <w:szCs w:val="24"/>
+        </w:rPr>
+        <w:t>↓</w:t>
+      </w:r>
+      <w:r>
+        <w:rPr>
+          <w:rFonts w:ascii="Aptos" w:hAnsi="Aptos"/>
+          <w:sz w:val="24"/>
+          <w:szCs w:val="24"/>
+        </w:rPr>
+        <w:br/>
+        <w:t>6. Top-p</w:t>
+      </w:r>
+      <w:r>
+        <w:rPr>
+          <w:rFonts w:ascii="Aptos" w:hAnsi="Aptos"/>
+          <w:sz w:val="24"/>
+          <w:szCs w:val="24"/>
+        </w:rPr>
+        <w:br/>
+      </w:r>
+      <w:r>
+        <w:rPr>
+          <w:rFonts w:ascii="Aptos" w:hAnsi="Aptos"/>
+          <w:sz w:val="24"/>
+          <w:szCs w:val="24"/>
+        </w:rPr>
+        <w:t xml:space="preserve"> </w:t>
+      </w:r>
+      <w:r>
+        <w:rPr>
+          <w:rFonts w:ascii="Aptos" w:hAnsi="Aptos"/>
+          <w:sz w:val="24"/>
+          <w:szCs w:val="24"/>
+        </w:rPr>
+        <w:tab/>
+      </w:r>
+      <w:r>
+        <w:rPr>
+          <w:rFonts w:ascii="Aptos" w:hAnsi="Aptos"/>
+          <w:sz w:val="24"/>
+          <w:szCs w:val="24"/>
+        </w:rPr>
+        <w:t>↓</w:t>
+      </w:r>
+      <w:r>
+        <w:rPr>
+          <w:rFonts w:ascii="Aptos" w:hAnsi="Aptos"/>
+          <w:sz w:val="24"/>
+          <w:szCs w:val="24"/>
+        </w:rPr>
+        <w:br/>
+        <w:t>7. Hallucinations</w:t>
+      </w:r>
+      <w:r>
+        <w:rPr>
+          <w:rFonts w:ascii="Aptos" w:hAnsi="Aptos"/>
+          <w:sz w:val="24"/>
+          <w:szCs w:val="24"/>
+        </w:rPr>
+        <w:br/>
+      </w:r>
+      <w:r>
+        <w:rPr>
+          <w:rFonts w:ascii="Aptos" w:hAnsi="Aptos"/>
+          <w:sz w:val="24"/>
+          <w:szCs w:val="24"/>
+        </w:rPr>
+        <w:t xml:space="preserve"> </w:t>
+      </w:r>
+      <w:r>
+        <w:rPr>
+          <w:rFonts w:ascii="Aptos" w:hAnsi="Aptos"/>
+          <w:sz w:val="24"/>
+          <w:szCs w:val="24"/>
+        </w:rPr>
+        <w:tab/>
+      </w:r>
+      <w:r>
+        <w:rPr>
+          <w:rFonts w:ascii="Aptos" w:hAnsi="Aptos"/>
+          <w:sz w:val="24"/>
+          <w:szCs w:val="24"/>
+        </w:rPr>
+        <w:t>↓</w:t>
+      </w:r>
+      <w:r>
+        <w:rPr>
+          <w:rFonts w:ascii="Aptos" w:hAnsi="Aptos"/>
+          <w:sz w:val="24"/>
+          <w:szCs w:val="24"/>
+        </w:rPr>
+        <w:br/>
+        <w:t>8. System Prompt</w:t>
+      </w:r>
+      <w:r>
+        <w:rPr>
+          <w:rFonts w:ascii="Aptos" w:hAnsi="Aptos"/>
+          <w:sz w:val="24"/>
+          <w:szCs w:val="24"/>
+        </w:rPr>
+        <w:br/>
+      </w:r>
+      <w:r>
+        <w:rPr>
+          <w:rFonts w:ascii="Aptos" w:hAnsi="Aptos"/>
+          <w:sz w:val="24"/>
+          <w:szCs w:val="24"/>
+        </w:rPr>
+        <w:t xml:space="preserve"> </w:t>
+      </w:r>
+      <w:r>
+        <w:rPr>
+          <w:rFonts w:ascii="Aptos" w:hAnsi="Aptos"/>
+          <w:sz w:val="24"/>
+          <w:szCs w:val="24"/>
+        </w:rPr>
+        <w:tab/>
+      </w:r>
+      <w:r>
+        <w:rPr>
+          <w:rFonts w:ascii="Aptos" w:hAnsi="Aptos"/>
+          <w:sz w:val="24"/>
+          <w:szCs w:val="24"/>
+        </w:rPr>
+        <w:t>↓</w:t>
+      </w:r>
+      <w:r>
+        <w:rPr>
+          <w:rFonts w:ascii="Aptos" w:hAnsi="Aptos"/>
+          <w:sz w:val="24"/>
+          <w:szCs w:val="24"/>
+        </w:rPr>
+        <w:br/>
+        <w:t>9. User Prompt</w:t>
+      </w:r>
+      <w:r>
+        <w:rPr>
+          <w:rFonts w:ascii="Aptos" w:hAnsi="Aptos"/>
+          <w:sz w:val="24"/>
+          <w:szCs w:val="24"/>
+        </w:rPr>
+        <w:br/>
+      </w:r>
+      <w:r>
+        <w:rPr>
+          <w:rFonts w:ascii="Aptos" w:hAnsi="Aptos"/>
+          <w:sz w:val="24"/>
+          <w:szCs w:val="24"/>
+        </w:rPr>
+        <w:t xml:space="preserve"> </w:t>
+      </w:r>
+      <w:r>
+        <w:rPr>
+          <w:rFonts w:ascii="Aptos" w:hAnsi="Aptos"/>
+          <w:sz w:val="24"/>
+          <w:szCs w:val="24"/>
+        </w:rPr>
+        <w:tab/>
+      </w:r>
+      <w:r>
+        <w:rPr>
+          <w:rFonts w:ascii="Aptos" w:hAnsi="Aptos"/>
+          <w:sz w:val="24"/>
+          <w:szCs w:val="24"/>
+        </w:rPr>
+        <w:t>↓</w:t>
+      </w:r>
+      <w:r>
+        <w:rPr>
+          <w:rFonts w:ascii="Aptos" w:hAnsi="Aptos"/>
+          <w:sz w:val="24"/>
+          <w:szCs w:val="24"/>
+        </w:rPr>
+        <w:br/>
+        <w:t>10. Assistant Response</w:t>
+      </w:r>
+    </w:p>
+    <w:p>
+      <w:pPr>
+        <w:rPr>
+          <w:rFonts w:ascii="Aptos" w:hAnsi="Aptos"/>
+          <w:sz w:val="24"/>
+          <w:szCs w:val="24"/>
+        </w:rPr>
+      </w:pPr>
+    </w:p>
+    <w:p>
+      <w:pPr>
+        <w:rPr>
+          <w:rFonts w:ascii="Aptos" w:hAnsi="Aptos"/>
+          <w:sz w:val="24"/>
+          <w:szCs w:val="24"/>
+        </w:rPr>
+      </w:pPr>
+      <w:r>
+        <w:rPr>
+          <w:rFonts w:ascii="Aptos" w:hAnsi="Aptos"/>
+          <w:b/>
+          <w:bCs/>
+          <w:sz w:val="24"/>
+          <w:szCs w:val="24"/>
+        </w:rPr>
+        <w:t>Context Window</w:t>
+      </w:r>
+      <w:r>
+        <w:rPr>
+          <w:rFonts w:ascii="Aptos" w:hAnsi="Aptos"/>
+          <w:b/>
+          <w:bCs/>
+          <w:sz w:val="24"/>
+          <w:szCs w:val="24"/>
+        </w:rPr>
+        <w:t xml:space="preserve">- </w:t>
+      </w:r>
+      <w:r>
+        <w:rPr>
+          <w:rFonts w:ascii="Aptos" w:hAnsi="Aptos"/>
+          <w:sz w:val="24"/>
+          <w:szCs w:val="24"/>
+        </w:rPr>
+        <w:t>Imagine talking to someone.</w:t>
+      </w:r>
+      <w:r>
+        <w:rPr>
+          <w:rFonts w:ascii="Aptos" w:hAnsi="Aptos"/>
+          <w:sz w:val="24"/>
+          <w:szCs w:val="24"/>
+        </w:rPr>
+        <w:t xml:space="preserve"> </w:t>
+      </w:r>
+      <w:r>
+        <w:rPr>
+          <w:rFonts w:ascii="Aptos" w:hAnsi="Aptos"/>
+          <w:sz w:val="24"/>
+          <w:szCs w:val="24"/>
+        </w:rPr>
+        <w:t>If they remember only your last sentence,</w:t>
+      </w:r>
+      <w:r>
+        <w:rPr>
+          <w:rFonts w:ascii="Aptos" w:hAnsi="Aptos"/>
+          <w:sz w:val="24"/>
+          <w:szCs w:val="24"/>
+        </w:rPr>
+        <w:t xml:space="preserve"> </w:t>
+      </w:r>
+      <w:r>
+        <w:rPr>
+          <w:rFonts w:ascii="Aptos" w:hAnsi="Aptos"/>
+          <w:sz w:val="24"/>
+          <w:szCs w:val="24"/>
+        </w:rPr>
+        <w:t>conversation becomes difficult.</w:t>
+      </w:r>
+      <w:r>
+        <w:rPr>
+          <w:rFonts w:ascii="Aptos" w:hAnsi="Aptos"/>
+          <w:sz w:val="24"/>
+          <w:szCs w:val="24"/>
+        </w:rPr>
+        <w:t xml:space="preserve"> </w:t>
+      </w:r>
+      <w:r>
+        <w:rPr>
+          <w:rFonts w:ascii="Aptos" w:hAnsi="Aptos"/>
+          <w:sz w:val="24"/>
+          <w:szCs w:val="24"/>
+        </w:rPr>
+        <w:t>LLMs also have memory limits.</w:t>
+      </w:r>
+      <w:r>
+        <w:rPr>
+          <w:rFonts w:ascii="Aptos" w:hAnsi="Aptos"/>
+          <w:sz w:val="24"/>
+          <w:szCs w:val="24"/>
+        </w:rPr>
+        <w:t xml:space="preserve"> </w:t>
+      </w:r>
+      <w:r>
+        <w:rPr>
+          <w:rFonts w:ascii="Aptos" w:hAnsi="Aptos"/>
+          <w:sz w:val="24"/>
+          <w:szCs w:val="24"/>
+        </w:rPr>
+        <w:t>That limit is called the Context Window.</w:t>
+      </w:r>
+    </w:p>
+    <w:p>
+      <w:pPr>
+        <w:rPr>
+          <w:rFonts w:ascii="Aptos" w:hAnsi="Aptos"/>
+          <w:sz w:val="24"/>
+          <w:szCs w:val="24"/>
+        </w:rPr>
+      </w:pPr>
+    </w:p>
+    <w:p>
+      <w:pPr>
+        <w:rPr>
+          <w:rFonts w:ascii="Aptos" w:hAnsi="Aptos"/>
+          <w:sz w:val="24"/>
+          <w:szCs w:val="24"/>
+        </w:rPr>
+      </w:pPr>
+      <w:r>
+        <w:rPr>
+          <w:rFonts w:ascii="Aptos" w:hAnsi="Aptos"/>
+          <w:b/>
+          <w:bCs/>
+          <w:sz w:val="24"/>
+          <w:szCs w:val="24"/>
+        </w:rPr>
+        <w:t>Temperature</w:t>
+      </w:r>
+      <w:r>
+        <w:rPr>
+          <w:rFonts w:ascii="Aptos" w:hAnsi="Aptos"/>
+          <w:sz w:val="24"/>
+          <w:szCs w:val="24"/>
+        </w:rPr>
+        <w:t xml:space="preserve"> controls the randomness of the model's output. Lower values produce more deterministic responses, while higher values encourage more diverse and creative outputs.</w:t>
+      </w:r>
+    </w:p>
+    <w:p>
+      <w:pPr>
+        <w:rPr>
+          <w:rFonts w:ascii="Aptos" w:hAnsi="Aptos"/>
+          <w:sz w:val="24"/>
+          <w:szCs w:val="24"/>
+        </w:rPr>
+      </w:pPr>
+    </w:p>
+    <w:p>
+      <w:pPr>
+        <w:rPr>
+          <w:rFonts w:ascii="Aptos" w:hAnsi="Aptos"/>
+          <w:sz w:val="24"/>
+          <w:szCs w:val="24"/>
+        </w:rPr>
+      </w:pPr>
+      <w:r>
+        <w:rPr>
+          <w:rFonts w:ascii="Aptos" w:hAnsi="Aptos"/>
+          <w:b/>
+          <w:bCs/>
+          <w:sz w:val="24"/>
+          <w:szCs w:val="24"/>
+        </w:rPr>
+        <w:t>Top-p</w:t>
+      </w:r>
+      <w:r>
+        <w:rPr>
+          <w:rFonts w:ascii="Aptos" w:hAnsi="Aptos"/>
+          <w:sz w:val="24"/>
+          <w:szCs w:val="24"/>
+        </w:rPr>
+        <w:t>-</w:t>
+      </w:r>
+      <w:r>
+        <w:rPr>
+          <w:rFonts w:ascii="Aptos" w:hAnsi="Aptos"/>
+          <w:sz w:val="24"/>
+          <w:szCs w:val="24"/>
+        </w:rPr>
+        <w:t xml:space="preserve"> a generation parameter that controls text randomness by dynamically selecting from a pool of tokens whose cumulative probabilities add up to the value p. For example, if p = 0.90, the model picks from the top words that collectively account for 90% of the total probability.</w:t>
+      </w:r>
+    </w:p>
+    <w:p>
+      <w:pPr>
+        <w:rPr>
+          <w:rFonts w:ascii="Aptos" w:hAnsi="Aptos"/>
+          <w:sz w:val="24"/>
+          <w:szCs w:val="24"/>
+        </w:rPr>
+      </w:pPr>
+      <w:r>
+        <w:rPr>
+          <w:rFonts w:ascii="Aptos" w:hAnsi="Aptos"/>
+          <w:sz w:val="24"/>
+          <w:szCs w:val="24"/>
+        </w:rPr>
+        <w:t>The LLM ranks all possible next words by probability. It starts adding the most likely words to a pool until the sum of their probabilities reaches or exceeds the threshold p. Only words inside this "nucleus" are considered for generation, effectively trimming off unlikely words</w:t>
+      </w:r>
+    </w:p>
+    <w:p>
+      <w:pPr>
+        <w:rPr>
+          <w:rFonts w:ascii="Aptos" w:hAnsi="Aptos"/>
+          <w:sz w:val="24"/>
+          <w:szCs w:val="24"/>
+        </w:rPr>
+      </w:pPr>
+      <w:r>
+        <w:rPr>
+          <w:rFonts w:ascii="Aptos" w:hAnsi="Aptos"/>
+          <w:sz w:val="24"/>
+          <w:szCs w:val="24"/>
+        </w:rPr>
+        <w:t>While Top-k restricts choices to a fixed number of words (e.g., the top 10 words), Top-p adjusts the number of words dynamically depending on how confident the model is, offering more natural variance in responses.</w:t>
+      </w:r>
+    </w:p>
+    <w:p>
+      <w:pPr>
+        <w:rPr>
+          <w:rFonts w:ascii="Aptos" w:hAnsi="Aptos"/>
+          <w:sz w:val="24"/>
+          <w:szCs w:val="24"/>
+        </w:rPr>
+      </w:pPr>
+    </w:p>
+    <w:p>
+      <w:pPr>
+        <w:rPr>
+          <w:rFonts w:ascii="Aptos" w:hAnsi="Aptos"/>
+          <w:sz w:val="24"/>
+          <w:szCs w:val="24"/>
+        </w:rPr>
+      </w:pPr>
+      <w:r>
+        <w:rPr>
+          <w:rFonts w:ascii="Aptos" w:hAnsi="Aptos"/>
+          <w:b/>
+          <w:bCs/>
+          <w:sz w:val="24"/>
+          <w:szCs w:val="24"/>
+        </w:rPr>
+        <w:t>Hallucination</w:t>
+      </w:r>
+      <w:r>
+        <w:rPr>
+          <w:rFonts w:ascii="Aptos" w:hAnsi="Aptos"/>
+          <w:sz w:val="24"/>
+          <w:szCs w:val="24"/>
+        </w:rPr>
+        <w:t xml:space="preserve">- </w:t>
+      </w:r>
+      <w:r>
+        <w:rPr>
+          <w:rFonts w:ascii="Aptos" w:hAnsi="Aptos"/>
+          <w:sz w:val="24"/>
+          <w:szCs w:val="24"/>
+        </w:rPr>
+        <w:t>A hallucination occurs when an LLM generates incorrect or fabricated information while presenting it confidently. This happens because the model predicts likely text rather than verifying facts.</w:t>
+      </w:r>
+    </w:p>
+    <w:p>
+      <w:pPr>
+        <w:rPr>
+          <w:rFonts w:ascii="Aptos" w:hAnsi="Aptos"/>
+          <w:b/>
+          <w:bCs/>
+          <w:sz w:val="24"/>
+          <w:szCs w:val="24"/>
+        </w:rPr>
+      </w:pPr>
+      <w:r>
+        <w:rPr>
+          <w:rFonts w:ascii="Aptos" w:hAnsi="Aptos"/>
+          <w:b/>
+          <w:bCs/>
+          <w:sz w:val="24"/>
+          <w:szCs w:val="24"/>
+        </w:rPr>
+        <w:t>Reducing Hallucinations</w:t>
+      </w:r>
+    </w:p>
+    <w:p>
+      <w:pPr>
+        <w:numPr>
+          <w:ilvl w:val="0"/>
+          <w:numId w:val="11"/>
+        </w:numPr>
+        <w:rPr>
+          <w:rFonts w:ascii="Aptos" w:hAnsi="Aptos"/>
+          <w:sz w:val="24"/>
+          <w:szCs w:val="24"/>
+        </w:rPr>
+      </w:pPr>
+      <w:r>
+        <w:rPr>
+          <w:rFonts w:ascii="Aptos" w:hAnsi="Aptos"/>
+          <w:sz w:val="24"/>
+          <w:szCs w:val="24"/>
+        </w:rPr>
+        <w:t xml:space="preserve">Better prompts </w:t>
+      </w:r>
+    </w:p>
+    <w:p>
+      <w:pPr>
+        <w:numPr>
+          <w:ilvl w:val="0"/>
+          <w:numId w:val="11"/>
+        </w:numPr>
+        <w:rPr>
+          <w:rFonts w:ascii="Aptos" w:hAnsi="Aptos"/>
+          <w:sz w:val="24"/>
+          <w:szCs w:val="24"/>
+        </w:rPr>
+      </w:pPr>
+      <w:r>
+        <w:rPr>
+          <w:rFonts w:ascii="Aptos" w:hAnsi="Aptos"/>
+          <w:sz w:val="24"/>
+          <w:szCs w:val="24"/>
+        </w:rPr>
+        <w:t xml:space="preserve">Lower temperature (depending on the task) </w:t>
+      </w:r>
+    </w:p>
+    <w:p>
+      <w:pPr>
+        <w:numPr>
+          <w:ilvl w:val="0"/>
+          <w:numId w:val="11"/>
+        </w:numPr>
+        <w:rPr>
+          <w:rFonts w:ascii="Aptos" w:hAnsi="Aptos"/>
+          <w:sz w:val="24"/>
+          <w:szCs w:val="24"/>
+        </w:rPr>
+      </w:pPr>
+      <w:r>
+        <w:rPr>
+          <w:rFonts w:ascii="Aptos" w:hAnsi="Aptos"/>
+          <w:sz w:val="24"/>
+          <w:szCs w:val="24"/>
+        </w:rPr>
+        <w:lastRenderedPageBreak/>
+        <w:t xml:space="preserve">Retrieval-Augmented Generation (RAG) </w:t>
+      </w:r>
+    </w:p>
+    <w:p>
+      <w:pPr>
+        <w:numPr>
+          <w:ilvl w:val="0"/>
+          <w:numId w:val="11"/>
+        </w:numPr>
+        <w:rPr>
+          <w:rFonts w:ascii="Aptos" w:hAnsi="Aptos"/>
+          <w:sz w:val="24"/>
+          <w:szCs w:val="24"/>
+        </w:rPr>
+      </w:pPr>
+      <w:r>
+        <w:rPr>
+          <w:rFonts w:ascii="Aptos" w:hAnsi="Aptos"/>
+          <w:sz w:val="24"/>
+          <w:szCs w:val="24"/>
+        </w:rPr>
+        <w:t>Verifying with external data or tools</w:t>
+      </w:r>
+    </w:p>
+    <w:p>
+      <w:pPr>
+        <w:rPr>
+          <w:rFonts w:ascii="Aptos" w:hAnsi="Aptos"/>
+          <w:sz w:val="24"/>
+          <w:szCs w:val="24"/>
+        </w:rPr>
+      </w:pPr>
+    </w:p>
+    <w:p>
+      <w:pPr>
+        <w:rPr>
+          <w:rFonts w:ascii="Aptos" w:hAnsi="Aptos"/>
+          <w:sz w:val="24"/>
+          <w:szCs w:val="24"/>
+        </w:rPr>
+      </w:pPr>
+      <w:r>
+        <w:rPr>
+          <w:rFonts w:ascii="Aptos" w:hAnsi="Aptos"/>
+          <w:b/>
+          <w:bCs/>
+          <w:sz w:val="24"/>
+          <w:szCs w:val="24"/>
+        </w:rPr>
+        <w:t>System Prompt</w:t>
+      </w:r>
+      <w:r>
+        <w:rPr>
+          <w:rFonts w:ascii="Aptos" w:hAnsi="Aptos"/>
+          <w:b/>
+          <w:bCs/>
+          <w:sz w:val="24"/>
+          <w:szCs w:val="24"/>
+        </w:rPr>
+        <w:t xml:space="preserve">- </w:t>
+      </w:r>
+      <w:r>
+        <w:rPr>
+          <w:rFonts w:ascii="Aptos" w:hAnsi="Aptos"/>
+          <w:sz w:val="24"/>
+          <w:szCs w:val="24"/>
+        </w:rPr>
+        <w:t xml:space="preserve">The background instructions that set the AI's persona, rules, and </w:t>
+      </w:r>
+      <w:r>
+        <w:rPr>
+          <w:rFonts w:ascii="Aptos" w:hAnsi="Aptos"/>
+          <w:sz w:val="24"/>
+          <w:szCs w:val="24"/>
+        </w:rPr>
+        <w:t>behavioural</w:t>
+      </w:r>
+      <w:r>
+        <w:rPr>
+          <w:rFonts w:ascii="Aptos" w:hAnsi="Aptos"/>
+          <w:sz w:val="24"/>
+          <w:szCs w:val="24"/>
+        </w:rPr>
+        <w:t xml:space="preserve"> boundaries.</w:t>
+      </w:r>
+    </w:p>
+    <w:p>
+      <w:pPr>
+        <w:rPr>
+          <w:rFonts w:ascii="Aptos" w:hAnsi="Aptos"/>
+          <w:sz w:val="24"/>
+          <w:szCs w:val="24"/>
+        </w:rPr>
+      </w:pPr>
+      <w:r>
+        <w:rPr>
+          <w:rFonts w:ascii="Aptos" w:hAnsi="Aptos"/>
+          <w:b/>
+          <w:bCs/>
+          <w:sz w:val="24"/>
+          <w:szCs w:val="24"/>
+        </w:rPr>
+        <w:t>User Prompt</w:t>
+      </w:r>
+      <w:r>
+        <w:rPr>
+          <w:rFonts w:ascii="Aptos" w:hAnsi="Aptos"/>
+          <w:b/>
+          <w:bCs/>
+          <w:sz w:val="24"/>
+          <w:szCs w:val="24"/>
+        </w:rPr>
+        <w:t xml:space="preserve">- </w:t>
+      </w:r>
+      <w:r>
+        <w:rPr>
+          <w:rFonts w:ascii="Aptos" w:hAnsi="Aptos"/>
+          <w:sz w:val="24"/>
+          <w:szCs w:val="24"/>
+        </w:rPr>
+        <w:t>The input, question, or command provided directly by the human interacting with the model.</w:t>
+      </w:r>
+    </w:p>
+    <w:p>
+      <w:pPr>
+        <w:rPr>
+          <w:rFonts w:ascii="Aptos" w:hAnsi="Aptos"/>
+          <w:sz w:val="24"/>
+          <w:szCs w:val="24"/>
+        </w:rPr>
+      </w:pPr>
+      <w:r>
+        <w:rPr>
+          <w:rFonts w:ascii="Aptos" w:hAnsi="Aptos"/>
+          <w:b/>
+          <w:bCs/>
+          <w:sz w:val="24"/>
+          <w:szCs w:val="24"/>
+        </w:rPr>
+        <w:t>Assistant Response</w:t>
+      </w:r>
+      <w:r>
+        <w:rPr>
+          <w:rFonts w:ascii="Aptos" w:hAnsi="Aptos"/>
+          <w:b/>
+          <w:bCs/>
+          <w:sz w:val="24"/>
+          <w:szCs w:val="24"/>
+        </w:rPr>
+        <w:t xml:space="preserve">- </w:t>
+      </w:r>
+      <w:r>
+        <w:rPr>
+          <w:rFonts w:ascii="Aptos" w:hAnsi="Aptos"/>
+          <w:sz w:val="24"/>
+          <w:szCs w:val="24"/>
+        </w:rPr>
+        <w:t>The final text generated by the model based on the system instructions and user input.</w:t>
+      </w:r>
+    </w:p>
+    <w:p>
+      <w:pPr>
+        <w:rPr>
+          <w:rFonts w:ascii="Aptos" w:hAnsi="Aptos"/>
+          <w:sz w:val="24"/>
+          <w:szCs w:val="24"/>
+        </w:rPr>
+      </w:pPr>
+    </w:p>
+    <w:p>
+      <w:pPr>
+        <w:rPr>
+          <w:rFonts w:ascii="Aptos" w:hAnsi="Aptos"/>
+          <w:sz w:val="24"/>
+          <w:szCs w:val="24"/>
+        </w:rPr>
+      </w:pPr>
+      <w:r>
+        <w:rPr>
+          <w:rFonts w:ascii="Aptos" w:hAnsi="Aptos"/>
+          <w:b/>
+          <w:bCs/>
+          <w:sz w:val="24"/>
+          <w:szCs w:val="24"/>
+        </w:rPr>
+        <w:t xml:space="preserve">Standard LLM: </w:t>
+      </w:r>
+      <w:r>
+        <w:rPr>
+          <w:rFonts w:ascii="Aptos" w:hAnsi="Aptos"/>
+          <w:sz w:val="24"/>
+          <w:szCs w:val="24"/>
+        </w:rPr>
+        <w:t xml:space="preserve">Trained on vast datasets of raw internet text to learn grammar, facts, and reasoning. If you give it the phrase "The capital of France is", it will likely output "Paris". However, if you ask it a question like "Can you help me write an essay?", it might just continue the pattern by writing a list of more questions instead of answering you. </w:t>
+      </w:r>
+    </w:p>
+    <w:p>
+      <w:pPr>
+        <w:rPr>
+          <w:rFonts w:ascii="Aptos" w:hAnsi="Aptos"/>
+          <w:sz w:val="24"/>
+          <w:szCs w:val="24"/>
+        </w:rPr>
+      </w:pPr>
+      <w:r>
+        <w:rPr>
+          <w:rFonts w:ascii="Aptos" w:hAnsi="Aptos"/>
+          <w:b/>
+          <w:bCs/>
+          <w:sz w:val="24"/>
+          <w:szCs w:val="24"/>
+        </w:rPr>
+        <w:t xml:space="preserve">Conversational LLM: </w:t>
+      </w:r>
+      <w:r>
+        <w:rPr>
+          <w:rFonts w:ascii="Aptos" w:hAnsi="Aptos"/>
+          <w:sz w:val="24"/>
+          <w:szCs w:val="24"/>
+        </w:rPr>
+        <w:t xml:space="preserve">Starts as a standard LLM but undergoes secondary training called Instruction Fine-Tuning and Reinforcement Learning from Human Feedback (RLHF). This teaches the model to understand human intent, follow commands, act like a helpful assistant, and avoid generating toxic or dangerous content. </w:t>
+      </w:r>
+    </w:p>
+    <w:p>
+      <w:pPr>
+        <w:rPr>
+          <w:rFonts w:ascii="Aptos" w:hAnsi="Aptos"/>
+          <w:sz w:val="24"/>
+          <w:szCs w:val="24"/>
+        </w:rPr>
+      </w:pPr>
+    </w:p>
+    <w:p>
+      <w:pPr>
+        <w:rPr>
+          <w:rFonts w:ascii="Aptos" w:hAnsi="Aptos"/>
+          <w:sz w:val="24"/>
+          <w:szCs w:val="24"/>
+        </w:rPr>
+      </w:pPr>
+    </w:p>
+    <w:p>
+      <w:pPr>
+        <w:rPr>
+          <w:rFonts w:ascii="Aptos" w:hAnsi="Aptos"/>
+          <w:sz w:val="24"/>
+          <w:szCs w:val="24"/>
+        </w:rPr>
+      </w:pPr>
     </w:p>
     <w:sectPr>
       <w:pgSz w:w="11906" w:h="16838"/>
@@ -7280,6 +8180,155 @@
     </w:lvl>
   </w:abstractNum>
   <w:abstractNum w:abstractNumId="8" w15:restartNumberingAfterBreak="0">
+    <w:nsid w:val="6B457B84"/>
+    <w:multiLevelType w:val="multilevel"/>
+    <w:tmpl w:val="83E2DB6A"/>
+    <w:lvl w:ilvl="0">
+      <w:start w:val="1"/>
+      <w:numFmt w:val="bullet"/>
+      <w:lvlText w:val=""/>
+      <w:lvlJc w:val="left"/>
+      <w:pPr>
+        <w:tabs>
+          <w:tab w:val="num" w:pos="720"/>
+        </w:tabs>
+        <w:ind w:left="720" w:hanging="360"/>
+      </w:pPr>
+      <w:rPr>
+        <w:rFonts w:ascii="Symbol" w:hAnsi="Symbol" w:hint="default"/>
+        <w:sz w:val="20"/>
+      </w:rPr>
+    </w:lvl>
+    <w:lvl w:ilvl="1" w:tentative="1">
+      <w:start w:val="1"/>
+      <w:numFmt w:val="bullet"/>
+      <w:lvlText w:val="o"/>
+      <w:lvlJc w:val="left"/>
+      <w:pPr>
+        <w:tabs>
+          <w:tab w:val="num" w:pos="1440"/>
+        </w:tabs>
+        <w:ind w:left="1440" w:hanging="360"/>
+      </w:pPr>
+      <w:rPr>
+        <w:rFonts w:ascii="Courier New" w:hAnsi="Courier New" w:hint="default"/>
+        <w:sz w:val="20"/>
+      </w:rPr>
+    </w:lvl>
+    <w:lvl w:ilvl="2" w:tentative="1">
+      <w:start w:val="1"/>
+      <w:numFmt w:val="bullet"/>
+      <w:lvlText w:val=""/>
+      <w:lvlJc w:val="left"/>
+      <w:pPr>
+        <w:tabs>
+          <w:tab w:val="num" w:pos="2160"/>
+        </w:tabs>
+        <w:ind w:left="2160" w:hanging="360"/>
+      </w:pPr>
+      <w:rPr>
+        <w:rFonts w:ascii="Wingdings" w:hAnsi="Wingdings" w:hint="default"/>
+        <w:sz w:val="20"/>
+      </w:rPr>
+    </w:lvl>
+    <w:lvl w:ilvl="3" w:tentative="1">
+      <w:start w:val="1"/>
+      <w:numFmt w:val="bullet"/>
+      <w:lvlText w:val=""/>
+      <w:lvlJc w:val="left"/>
+      <w:pPr>
+        <w:tabs>
+          <w:tab w:val="num" w:pos="2880"/>
+        </w:tabs>
+        <w:ind w:left="2880" w:hanging="360"/>
+      </w:pPr>
+      <w:rPr>
+        <w:rFonts w:ascii="Wingdings" w:hAnsi="Wingdings" w:hint="default"/>
+        <w:sz w:val="20"/>
+      </w:rPr>
+    </w:lvl>
+    <w:lvl w:ilvl="4" w:tentative="1">
+      <w:start w:val="1"/>
+      <w:numFmt w:val="bullet"/>
+      <w:lvlText w:val=""/>
+      <w:lvlJc w:val="left"/>
+      <w:pPr>
+        <w:tabs>
+          <w:tab w:val="num" w:pos="3600"/>
+        </w:tabs>
+        <w:ind w:left="3600" w:hanging="360"/>
+      </w:pPr>
+      <w:rPr>
+        <w:rFonts w:ascii="Wingdings" w:hAnsi="Wingdings" w:hint="default"/>
+        <w:sz w:val="20"/>
+      </w:rPr>
+    </w:lvl>
+    <w:lvl w:ilvl="5" w:tentative="1">
+      <w:start w:val="1"/>
+      <w:numFmt w:val="bullet"/>
+      <w:lvlText w:val=""/>
+      <w:lvlJc w:val="left"/>
+      <w:pPr>
+        <w:tabs>
+          <w:tab w:val="num" w:pos="4320"/>
+        </w:tabs>
+        <w:ind w:left="4320" w:hanging="360"/>
+      </w:pPr>
+      <w:rPr>
+        <w:rFonts w:ascii="Wingdings" w:hAnsi="Wingdings" w:hint="default"/>
+        <w:sz w:val="20"/>
+      </w:rPr>
+    </w:lvl>
+    <w:lvl w:ilvl="6" w:tentative="1">
+      <w:start w:val="1"/>
+      <w:numFmt w:val="bullet"/>
+      <w:lvlText w:val=""/>
+      <w:lvlJc w:val="left"/>
+      <w:pPr>
+        <w:tabs>
+          <w:tab w:val="num" w:pos="5040"/>
+        </w:tabs>
+        <w:ind w:left="5040" w:hanging="360"/>
+      </w:pPr>
+      <w:rPr>
+        <w:rFonts w:ascii="Wingdings" w:hAnsi="Wingdings" w:hint="default"/>
+        <w:sz w:val="20"/>
+      </w:rPr>
+    </w:lvl>
+    <w:lvl w:ilvl="7" w:tentative="1">
+      <w:start w:val="1"/>
+      <w:numFmt w:val="bullet"/>
+      <w:lvlText w:val=""/>
+      <w:lvlJc w:val="left"/>
+      <w:pPr>
+        <w:tabs>
+          <w:tab w:val="num" w:pos="5760"/>
+        </w:tabs>
+        <w:ind w:left="5760" w:hanging="360"/>
+      </w:pPr>
+      <w:rPr>
+        <w:rFonts w:ascii="Wingdings" w:hAnsi="Wingdings" w:hint="default"/>
+        <w:sz w:val="20"/>
+      </w:rPr>
+    </w:lvl>
+    <w:lvl w:ilvl="8" w:tentative="1">
+      <w:start w:val="1"/>
+      <w:numFmt w:val="bullet"/>
+      <w:lvlText w:val=""/>
+      <w:lvlJc w:val="left"/>
+      <w:pPr>
+        <w:tabs>
+          <w:tab w:val="num" w:pos="6480"/>
+        </w:tabs>
+        <w:ind w:left="6480" w:hanging="360"/>
+      </w:pPr>
+      <w:rPr>
+        <w:rFonts w:ascii="Wingdings" w:hAnsi="Wingdings" w:hint="default"/>
+        <w:sz w:val="20"/>
+      </w:rPr>
+    </w:lvl>
+  </w:abstractNum>
+  <w:abstractNum w:abstractNumId="9" w15:restartNumberingAfterBreak="0">
     <w:nsid w:val="70AE0F10"/>
     <w:multiLevelType w:val="hybridMultilevel"/>
     <w:tmpl w:val="6CBE34D0"/>
@@ -7365,7 +8414,7 @@
       </w:pPr>
     </w:lvl>
   </w:abstractNum>
-  <w:abstractNum w:abstractNumId="9" w15:restartNumberingAfterBreak="0">
+  <w:abstractNum w:abstractNumId="10" w15:restartNumberingAfterBreak="0">
     <w:nsid w:val="762F327D"/>
     <w:multiLevelType w:val="hybridMultilevel"/>
     <w:tmpl w:val="3F146536"/>
@@ -7485,7 +8534,7 @@
     <w:abstractNumId w:val="6"/>
   </w:num>
   <w:num w:numId="3" w16cid:durableId="49767029">
-    <w:abstractNumId w:val="8"/>
+    <w:abstractNumId w:val="9"/>
   </w:num>
   <w:num w:numId="4" w16cid:durableId="374893099">
     <w:abstractNumId w:val="1"/>
@@ -7494,7 +8543,7 @@
     <w:abstractNumId w:val="7"/>
   </w:num>
   <w:num w:numId="6" w16cid:durableId="211429764">
-    <w:abstractNumId w:val="9"/>
+    <w:abstractNumId w:val="10"/>
   </w:num>
   <w:num w:numId="7" w16cid:durableId="205803120">
     <w:abstractNumId w:val="5"/>
@@ -7507,6 +8556,9 @@
   </w:num>
   <w:num w:numId="10" w16cid:durableId="393817826">
     <w:abstractNumId w:val="2"/>
+  </w:num>
+  <w:num w:numId="11" w16cid:durableId="2122912253">
+    <w:abstractNumId w:val="8"/>
   </w:num>
 </w:numbering>
 </file>

</xml_diff>

<commit_message>
Day 3: Notes uploaded
</commit_message>
<xml_diff>
--- a/notes/AGENTIC AI DAILY WORK.docx
+++ b/notes/AGENTIC AI DAILY WORK.docx
@@ -472,7 +472,17 @@
           <w:sz w:val="24"/>
           <w:szCs w:val="24"/>
         </w:rPr>
-        <w:t>generate_content</w:t>
+        <w:t>generate_</w:t>
+      </w:r>
+      <w:proofErr w:type="gramStart"/>
+      <w:r>
+        <w:rPr>
+          <w:rFonts w:ascii="Aptos" w:hAnsi="Aptos"/>
+          <w:color w:val="7030A0"/>
+          <w:sz w:val="24"/>
+          <w:szCs w:val="24"/>
+        </w:rPr>
+        <w:t>content</w:t>
       </w:r>
       <w:proofErr w:type="spellEnd"/>
       <w:r>
@@ -482,7 +492,17 @@
           <w:sz w:val="24"/>
           <w:szCs w:val="24"/>
         </w:rPr>
-        <w:t>()?</w:t>
+        <w:t>(</w:t>
+      </w:r>
+      <w:proofErr w:type="gramEnd"/>
+      <w:r>
+        <w:rPr>
+          <w:rFonts w:ascii="Aptos" w:hAnsi="Aptos"/>
+          <w:color w:val="7030A0"/>
+          <w:sz w:val="24"/>
+          <w:szCs w:val="24"/>
+        </w:rPr>
+        <w:t>)?</w:t>
       </w:r>
     </w:p>
     <w:p>
@@ -2402,7 +2422,25 @@
           <w:sz w:val="24"/>
           <w:szCs w:val="24"/>
         </w:rPr>
-        <w:t xml:space="preserve">a numerical representation of text where words or concepts with similar meanings are mapped to vectors that are close to each other in a multi-dimensional space. It acts as a "meaning map" that translates human language into a language machines can process mathematically. </w:t>
+        <w:t xml:space="preserve">a numerical representation of text where words or concepts with similar meanings are mapped to vectors that are close to each other in a multi-dimensional space. It acts as a "meaning map" that translates human language into a </w:t>
+      </w:r>
+      <w:proofErr w:type="gramStart"/>
+      <w:r>
+        <w:rPr>
+          <w:rFonts w:ascii="Aptos" w:hAnsi="Aptos"/>
+          <w:sz w:val="24"/>
+          <w:szCs w:val="24"/>
+        </w:rPr>
+        <w:t>language machines</w:t>
+      </w:r>
+      <w:proofErr w:type="gramEnd"/>
+      <w:r>
+        <w:rPr>
+          <w:rFonts w:ascii="Aptos" w:hAnsi="Aptos"/>
+          <w:sz w:val="24"/>
+          <w:szCs w:val="24"/>
+        </w:rPr>
+        <w:t xml:space="preserve"> can process mathematically. </w:t>
       </w:r>
     </w:p>
     <w:p>
@@ -2804,6 +2842,7 @@
                 <w:szCs w:val="24"/>
               </w:rPr>
             </w:pPr>
+            <w:proofErr w:type="gramStart"/>
             <w:r>
               <w:rPr>
                 <w:rFonts w:ascii="Aptos" w:hAnsi="Aptos"/>
@@ -2822,6 +2861,7 @@
               <w:t>venv</w:t>
             </w:r>
             <w:proofErr w:type="spellEnd"/>
+            <w:proofErr w:type="gramEnd"/>
           </w:p>
         </w:tc>
         <w:tc>
@@ -2866,6 +2906,7 @@
                 <w:szCs w:val="24"/>
               </w:rPr>
             </w:pPr>
+            <w:proofErr w:type="gramStart"/>
             <w:r>
               <w:rPr>
                 <w:rFonts w:ascii="Aptos" w:hAnsi="Aptos"/>
@@ -2874,6 +2915,7 @@
               </w:rPr>
               <w:t>.env</w:t>
             </w:r>
+            <w:proofErr w:type="gramEnd"/>
           </w:p>
         </w:tc>
         <w:tc>
@@ -2918,6 +2960,7 @@
                 <w:szCs w:val="24"/>
               </w:rPr>
             </w:pPr>
+            <w:proofErr w:type="gramStart"/>
             <w:r>
               <w:rPr>
                 <w:rFonts w:ascii="Aptos" w:hAnsi="Aptos"/>
@@ -2936,6 +2979,7 @@
               <w:t>gitignore</w:t>
             </w:r>
             <w:proofErr w:type="spellEnd"/>
+            <w:proofErr w:type="gramEnd"/>
           </w:p>
         </w:tc>
         <w:tc>
@@ -3126,6 +3170,7 @@
         <w:t xml:space="preserve">python -m </w:t>
       </w:r>
       <w:proofErr w:type="spellStart"/>
+      <w:proofErr w:type="gramStart"/>
       <w:r>
         <w:rPr>
           <w:rFonts w:ascii="Aptos" w:hAnsi="Aptos"/>
@@ -3156,6 +3201,7 @@
         <w:t>venv</w:t>
       </w:r>
       <w:proofErr w:type="spellEnd"/>
+      <w:proofErr w:type="gramEnd"/>
     </w:p>
     <w:p>
       <w:pPr>
@@ -3246,6 +3292,7 @@
           <w:szCs w:val="24"/>
         </w:rPr>
       </w:pPr>
+      <w:proofErr w:type="gramStart"/>
       <w:r>
         <w:rPr>
           <w:rFonts w:ascii="Aptos" w:hAnsi="Aptos"/>
@@ -3264,6 +3311,7 @@
         <w:t>venv</w:t>
       </w:r>
       <w:proofErr w:type="spellEnd"/>
+      <w:proofErr w:type="gramEnd"/>
       <w:r>
         <w:rPr>
           <w:rFonts w:ascii="Aptos" w:hAnsi="Aptos"/>
@@ -3622,7 +3670,25 @@
           <w:sz w:val="24"/>
           <w:szCs w:val="24"/>
         </w:rPr>
-        <w:t xml:space="preserve"> → Reads API keys from .env.</w:t>
+        <w:t xml:space="preserve"> → Reads API keys </w:t>
+      </w:r>
+      <w:proofErr w:type="gramStart"/>
+      <w:r>
+        <w:rPr>
+          <w:rFonts w:ascii="Aptos" w:hAnsi="Aptos"/>
+          <w:sz w:val="24"/>
+          <w:szCs w:val="24"/>
+        </w:rPr>
+        <w:t>from .env</w:t>
+      </w:r>
+      <w:proofErr w:type="gramEnd"/>
+      <w:r>
+        <w:rPr>
+          <w:rFonts w:ascii="Aptos" w:hAnsi="Aptos"/>
+          <w:sz w:val="24"/>
+          <w:szCs w:val="24"/>
+        </w:rPr>
+        <w:t>.</w:t>
       </w:r>
     </w:p>
     <w:p>
@@ -3704,6 +3770,7 @@
           <w:szCs w:val="24"/>
         </w:rPr>
       </w:pPr>
+      <w:proofErr w:type="gramStart"/>
       <w:r>
         <w:rPr>
           <w:rFonts w:ascii="Aptos" w:hAnsi="Aptos"/>
@@ -3714,6 +3781,7 @@
         </w:rPr>
         <w:t>Create .env</w:t>
       </w:r>
+      <w:proofErr w:type="gramEnd"/>
     </w:p>
     <w:p>
       <w:pPr>
@@ -3767,6 +3835,7 @@
           <w:szCs w:val="24"/>
         </w:rPr>
       </w:pPr>
+      <w:proofErr w:type="gramStart"/>
       <w:r>
         <w:rPr>
           <w:rFonts w:ascii="Aptos" w:hAnsi="Aptos"/>
@@ -3789,6 +3858,7 @@
         <w:t>gitignore</w:t>
       </w:r>
       <w:proofErr w:type="spellEnd"/>
+      <w:proofErr w:type="gramEnd"/>
     </w:p>
     <w:p>
       <w:pPr>
@@ -4470,7 +4540,16 @@
                 <w:sz w:val="24"/>
                 <w:szCs w:val="24"/>
               </w:rPr>
-              <w:t>load_dotenv</w:t>
+              <w:t>load_</w:t>
+            </w:r>
+            <w:proofErr w:type="gramStart"/>
+            <w:r>
+              <w:rPr>
+                <w:rFonts w:ascii="Aptos" w:hAnsi="Aptos"/>
+                <w:sz w:val="24"/>
+                <w:szCs w:val="24"/>
+              </w:rPr>
+              <w:t>dotenv</w:t>
             </w:r>
             <w:proofErr w:type="spellEnd"/>
             <w:r>
@@ -4479,7 +4558,16 @@
                 <w:sz w:val="24"/>
                 <w:szCs w:val="24"/>
               </w:rPr>
-              <w:t>()</w:t>
+              <w:t>(</w:t>
+            </w:r>
+            <w:proofErr w:type="gramEnd"/>
+            <w:r>
+              <w:rPr>
+                <w:rFonts w:ascii="Aptos" w:hAnsi="Aptos"/>
+                <w:sz w:val="24"/>
+                <w:szCs w:val="24"/>
+              </w:rPr>
+              <w:t>)</w:t>
             </w:r>
           </w:p>
         </w:tc>
@@ -4497,13 +4585,23 @@
                 <w:szCs w:val="24"/>
               </w:rPr>
             </w:pPr>
+            <w:proofErr w:type="gramStart"/>
             <w:r>
               <w:rPr>
                 <w:rFonts w:ascii="Aptos" w:hAnsi="Aptos"/>
                 <w:sz w:val="24"/>
                 <w:szCs w:val="24"/>
               </w:rPr>
-              <w:t>Load .env variables</w:t>
+              <w:t>Load .env</w:t>
+            </w:r>
+            <w:proofErr w:type="gramEnd"/>
+            <w:r>
+              <w:rPr>
+                <w:rFonts w:ascii="Aptos" w:hAnsi="Aptos"/>
+                <w:sz w:val="24"/>
+                <w:szCs w:val="24"/>
+              </w:rPr>
+              <w:t xml:space="preserve"> variables</w:t>
             </w:r>
           </w:p>
         </w:tc>
@@ -4527,6 +4625,7 @@
               </w:rPr>
             </w:pPr>
             <w:proofErr w:type="spellStart"/>
+            <w:proofErr w:type="gramStart"/>
             <w:r>
               <w:rPr>
                 <w:rFonts w:ascii="Aptos" w:hAnsi="Aptos"/>
@@ -4536,6 +4635,7 @@
               <w:t>os.getenv</w:t>
             </w:r>
             <w:proofErr w:type="spellEnd"/>
+            <w:proofErr w:type="gramEnd"/>
             <w:r>
               <w:rPr>
                 <w:rFonts w:ascii="Aptos" w:hAnsi="Aptos"/>
@@ -4590,6 +4690,7 @@
               </w:rPr>
             </w:pPr>
             <w:proofErr w:type="spellStart"/>
+            <w:proofErr w:type="gramStart"/>
             <w:r>
               <w:rPr>
                 <w:rFonts w:ascii="Aptos" w:hAnsi="Aptos"/>
@@ -4599,6 +4700,7 @@
               <w:t>genai.Client</w:t>
             </w:r>
             <w:proofErr w:type="spellEnd"/>
+            <w:proofErr w:type="gramEnd"/>
             <w:r>
               <w:rPr>
                 <w:rFonts w:ascii="Aptos" w:hAnsi="Aptos"/>
@@ -4659,7 +4761,16 @@
                 <w:sz w:val="24"/>
                 <w:szCs w:val="24"/>
               </w:rPr>
-              <w:t>generate_content</w:t>
+              <w:t>generate_</w:t>
+            </w:r>
+            <w:proofErr w:type="gramStart"/>
+            <w:r>
+              <w:rPr>
+                <w:rFonts w:ascii="Aptos" w:hAnsi="Aptos"/>
+                <w:sz w:val="24"/>
+                <w:szCs w:val="24"/>
+              </w:rPr>
+              <w:t>content</w:t>
             </w:r>
             <w:proofErr w:type="spellEnd"/>
             <w:r>
@@ -4668,7 +4779,16 @@
                 <w:sz w:val="24"/>
                 <w:szCs w:val="24"/>
               </w:rPr>
-              <w:t>()</w:t>
+              <w:t>(</w:t>
+            </w:r>
+            <w:proofErr w:type="gramEnd"/>
+            <w:r>
+              <w:rPr>
+                <w:rFonts w:ascii="Aptos" w:hAnsi="Aptos"/>
+                <w:sz w:val="24"/>
+                <w:szCs w:val="24"/>
+              </w:rPr>
+              <w:t>)</w:t>
             </w:r>
           </w:p>
         </w:tc>
@@ -5453,7 +5573,29 @@
           <w:sz w:val="24"/>
           <w:szCs w:val="24"/>
         </w:rPr>
-        <w:t>__()</w:t>
+        <w:t>_</w:t>
+      </w:r>
+      <w:proofErr w:type="gramStart"/>
+      <w:r>
+        <w:rPr>
+          <w:rFonts w:ascii="Aptos" w:hAnsi="Aptos"/>
+          <w:b/>
+          <w:bCs/>
+          <w:sz w:val="24"/>
+          <w:szCs w:val="24"/>
+        </w:rPr>
+        <w:t>_(</w:t>
+      </w:r>
+      <w:proofErr w:type="gramEnd"/>
+      <w:r>
+        <w:rPr>
+          <w:rFonts w:ascii="Aptos" w:hAnsi="Aptos"/>
+          <w:b/>
+          <w:bCs/>
+          <w:sz w:val="24"/>
+          <w:szCs w:val="24"/>
+        </w:rPr>
+        <w:t>)</w:t>
       </w:r>
       <w:r>
         <w:rPr>
@@ -5683,6 +5825,7 @@
         </w:rPr>
       </w:pPr>
       <w:proofErr w:type="spellStart"/>
+      <w:proofErr w:type="gramStart"/>
       <w:r>
         <w:rPr>
           <w:rFonts w:ascii="Aptos" w:hAnsi="Aptos"/>
@@ -5695,6 +5838,7 @@
         <w:t>json.dumps</w:t>
       </w:r>
       <w:proofErr w:type="spellEnd"/>
+      <w:proofErr w:type="gramEnd"/>
       <w:r>
         <w:rPr>
           <w:rFonts w:ascii="Aptos" w:hAnsi="Aptos"/>
@@ -5749,6 +5893,7 @@
         </w:rPr>
       </w:pPr>
       <w:proofErr w:type="spellStart"/>
+      <w:proofErr w:type="gramStart"/>
       <w:r>
         <w:rPr>
           <w:rFonts w:ascii="Aptos" w:hAnsi="Aptos"/>
@@ -5760,6 +5905,7 @@
         <w:t>json.dump</w:t>
       </w:r>
       <w:proofErr w:type="spellEnd"/>
+      <w:proofErr w:type="gramEnd"/>
       <w:r>
         <w:rPr>
           <w:rFonts w:ascii="Aptos" w:hAnsi="Aptos"/>
@@ -5814,6 +5960,7 @@
         </w:rPr>
       </w:pPr>
       <w:proofErr w:type="spellStart"/>
+      <w:proofErr w:type="gramStart"/>
       <w:r>
         <w:rPr>
           <w:rFonts w:ascii="Aptos" w:hAnsi="Aptos"/>
@@ -5825,6 +5972,7 @@
         <w:t>json.loads</w:t>
       </w:r>
       <w:proofErr w:type="spellEnd"/>
+      <w:proofErr w:type="gramEnd"/>
       <w:r>
         <w:rPr>
           <w:rFonts w:ascii="Aptos" w:hAnsi="Aptos"/>
@@ -5861,6 +6009,7 @@
         </w:rPr>
       </w:pPr>
       <w:proofErr w:type="spellStart"/>
+      <w:proofErr w:type="gramStart"/>
       <w:r>
         <w:rPr>
           <w:rFonts w:ascii="Aptos" w:hAnsi="Aptos"/>
@@ -5872,6 +6021,7 @@
         <w:t>json.load</w:t>
       </w:r>
       <w:proofErr w:type="spellEnd"/>
+      <w:proofErr w:type="gramEnd"/>
       <w:r>
         <w:rPr>
           <w:rFonts w:ascii="Aptos" w:hAnsi="Aptos"/>
@@ -6043,6 +6193,7 @@
         <w:t>*</w:t>
       </w:r>
       <w:proofErr w:type="spellStart"/>
+      <w:proofErr w:type="gramStart"/>
       <w:r>
         <w:rPr>
           <w:rFonts w:ascii="Aptos" w:hAnsi="Aptos"/>
@@ -6054,6 +6205,7 @@
         <w:t>args</w:t>
       </w:r>
       <w:proofErr w:type="spellEnd"/>
+      <w:proofErr w:type="gramEnd"/>
       <w:r>
         <w:rPr>
           <w:rFonts w:ascii="Aptos" w:hAnsi="Aptos"/>
@@ -9975,6 +10127,69 @@
         </w:rPr>
         <w:t>I built an AI Prompt Playground using the Gemini API and Python. The application allows users to choose different AI roles such as Teacher, Recruiter, Data Analyst, or Software Engineer. Based on the selected role, the program dynamically loads a corresponding system prompt and combines it with the user's question before sending it to Gemini. This demonstrates prompt engineering, dynamic prompt generation, modular programming using separate files, secure API key management through environment variables, and exception handling for API communication.</w:t>
       </w:r>
+    </w:p>
+    <w:p>
+      <w:pPr>
+        <w:rPr>
+          <w:rFonts w:ascii="Aptos" w:hAnsi="Aptos"/>
+          <w:sz w:val="24"/>
+          <w:szCs w:val="24"/>
+        </w:rPr>
+      </w:pPr>
+    </w:p>
+    <w:p>
+      <w:pPr>
+        <w:rPr>
+          <w:rFonts w:ascii="Aptos" w:hAnsi="Aptos"/>
+          <w:b/>
+          <w:bCs/>
+          <w:color w:val="0070C0"/>
+          <w:sz w:val="24"/>
+          <w:szCs w:val="24"/>
+        </w:rPr>
+      </w:pPr>
+      <w:r>
+        <w:rPr>
+          <w:rFonts w:ascii="Aptos" w:hAnsi="Aptos"/>
+          <w:b/>
+          <w:bCs/>
+          <w:color w:val="0070C0"/>
+          <w:sz w:val="24"/>
+          <w:szCs w:val="24"/>
+        </w:rPr>
+        <w:t xml:space="preserve">Day </w:t>
+      </w:r>
+      <w:r>
+        <w:rPr>
+          <w:rFonts w:ascii="Aptos" w:hAnsi="Aptos"/>
+          <w:b/>
+          <w:bCs/>
+          <w:color w:val="0070C0"/>
+          <w:sz w:val="24"/>
+          <w:szCs w:val="24"/>
+        </w:rPr>
+        <w:t>3</w:t>
+      </w:r>
+      <w:r>
+        <w:rPr>
+          <w:rFonts w:ascii="Aptos" w:hAnsi="Aptos"/>
+          <w:b/>
+          <w:bCs/>
+          <w:color w:val="0070C0"/>
+          <w:sz w:val="24"/>
+          <w:szCs w:val="24"/>
+        </w:rPr>
+        <w:t>:</w:t>
+      </w:r>
+    </w:p>
+    <w:p>
+      <w:pPr>
+        <w:rPr>
+          <w:rFonts w:ascii="Aptos" w:hAnsi="Aptos"/>
+          <w:sz w:val="24"/>
+          <w:szCs w:val="24"/>
+        </w:rPr>
+      </w:pPr>
     </w:p>
     <w:sectPr>
       <w:pgSz w:w="11906" w:h="16838"/>
@@ -12143,6 +12358,7 @@
   <w:style w:type="character" w:default="1" w:styleId="DefaultParagraphFont">
     <w:name w:val="Default Paragraph Font"/>
     <w:uiPriority w:val="1"/>
+    <w:semiHidden/>
     <w:unhideWhenUsed/>
   </w:style>
   <w:style w:type="table" w:default="1" w:styleId="TableNormal">

</xml_diff>

<commit_message>
Day 3: Notes and work uploaded
</commit_message>
<xml_diff>
--- a/notes/AGENTIC AI DAILY WORK.docx
+++ b/notes/AGENTIC AI DAILY WORK.docx
@@ -10190,6 +10190,1773 @@
           <w:szCs w:val="24"/>
         </w:rPr>
       </w:pPr>
+      <w:r>
+        <w:rPr>
+          <w:rFonts w:ascii="Aptos" w:hAnsi="Aptos"/>
+          <w:sz w:val="24"/>
+          <w:szCs w:val="24"/>
+        </w:rPr>
+        <w:t>An AI Agent has:</w:t>
+      </w:r>
+    </w:p>
+    <w:p>
+      <w:pPr>
+        <w:rPr>
+          <w:rFonts w:ascii="Aptos" w:hAnsi="Aptos"/>
+          <w:b/>
+          <w:bCs/>
+          <w:sz w:val="24"/>
+          <w:szCs w:val="24"/>
+        </w:rPr>
+      </w:pPr>
+      <w:r>
+        <w:rPr>
+          <w:rFonts w:ascii="Aptos" w:hAnsi="Aptos"/>
+          <w:b/>
+          <w:bCs/>
+          <w:sz w:val="24"/>
+          <w:szCs w:val="24"/>
+        </w:rPr>
+        <w:t>Properties</w:t>
+      </w:r>
+    </w:p>
+    <w:p>
+      <w:pPr>
+        <w:rPr>
+          <w:rFonts w:ascii="Aptos" w:hAnsi="Aptos"/>
+          <w:sz w:val="24"/>
+          <w:szCs w:val="24"/>
+        </w:rPr>
+      </w:pPr>
+      <w:r>
+        <w:rPr>
+          <w:rFonts w:ascii="Aptos" w:hAnsi="Aptos"/>
+          <w:sz w:val="24"/>
+          <w:szCs w:val="24"/>
+        </w:rPr>
+        <w:t>Name</w:t>
+      </w:r>
+      <w:r>
+        <w:rPr>
+          <w:rFonts w:ascii="Aptos" w:hAnsi="Aptos"/>
+          <w:sz w:val="24"/>
+          <w:szCs w:val="24"/>
+        </w:rPr>
+        <w:br/>
+      </w:r>
+      <w:r>
+        <w:rPr>
+          <w:rFonts w:ascii="Aptos" w:hAnsi="Aptos"/>
+          <w:sz w:val="24"/>
+          <w:szCs w:val="24"/>
+        </w:rPr>
+        <w:br/>
+        <w:t>Role</w:t>
+      </w:r>
+      <w:r>
+        <w:rPr>
+          <w:rFonts w:ascii="Aptos" w:hAnsi="Aptos"/>
+          <w:sz w:val="24"/>
+          <w:szCs w:val="24"/>
+        </w:rPr>
+        <w:br/>
+      </w:r>
+      <w:r>
+        <w:rPr>
+          <w:rFonts w:ascii="Aptos" w:hAnsi="Aptos"/>
+          <w:sz w:val="24"/>
+          <w:szCs w:val="24"/>
+        </w:rPr>
+        <w:lastRenderedPageBreak/>
+        <w:br/>
+        <w:t>Memory</w:t>
+      </w:r>
+      <w:r>
+        <w:rPr>
+          <w:rFonts w:ascii="Aptos" w:hAnsi="Aptos"/>
+          <w:sz w:val="24"/>
+          <w:szCs w:val="24"/>
+        </w:rPr>
+        <w:br/>
+      </w:r>
+      <w:r>
+        <w:rPr>
+          <w:rFonts w:ascii="Aptos" w:hAnsi="Aptos"/>
+          <w:sz w:val="24"/>
+          <w:szCs w:val="24"/>
+        </w:rPr>
+        <w:br/>
+        <w:t>Tools</w:t>
+      </w:r>
+      <w:r>
+        <w:rPr>
+          <w:rFonts w:ascii="Aptos" w:hAnsi="Aptos"/>
+          <w:sz w:val="24"/>
+          <w:szCs w:val="24"/>
+        </w:rPr>
+        <w:br/>
+      </w:r>
+      <w:r>
+        <w:rPr>
+          <w:rFonts w:ascii="Aptos" w:hAnsi="Aptos"/>
+          <w:sz w:val="24"/>
+          <w:szCs w:val="24"/>
+        </w:rPr>
+        <w:br/>
+        <w:t>Model</w:t>
+      </w:r>
+    </w:p>
+    <w:p>
+      <w:pPr>
+        <w:rPr>
+          <w:rFonts w:ascii="Aptos" w:hAnsi="Aptos"/>
+          <w:b/>
+          <w:bCs/>
+          <w:sz w:val="24"/>
+          <w:szCs w:val="24"/>
+        </w:rPr>
+      </w:pPr>
+      <w:proofErr w:type="spellStart"/>
+      <w:r>
+        <w:rPr>
+          <w:rFonts w:ascii="Aptos" w:hAnsi="Aptos"/>
+          <w:b/>
+          <w:bCs/>
+          <w:sz w:val="24"/>
+          <w:szCs w:val="24"/>
+        </w:rPr>
+        <w:t>Behaviors</w:t>
+      </w:r>
+      <w:proofErr w:type="spellEnd"/>
+    </w:p>
+    <w:p>
+      <w:pPr>
+        <w:rPr>
+          <w:rFonts w:ascii="Aptos" w:hAnsi="Aptos"/>
+          <w:sz w:val="24"/>
+          <w:szCs w:val="24"/>
+        </w:rPr>
+      </w:pPr>
+      <w:r>
+        <w:rPr>
+          <w:rFonts w:ascii="Aptos" w:hAnsi="Aptos"/>
+          <w:sz w:val="24"/>
+          <w:szCs w:val="24"/>
+        </w:rPr>
+        <w:t>Respond()</w:t>
+      </w:r>
+      <w:r>
+        <w:rPr>
+          <w:rFonts w:ascii="Aptos" w:hAnsi="Aptos"/>
+          <w:sz w:val="24"/>
+          <w:szCs w:val="24"/>
+        </w:rPr>
+        <w:br/>
+      </w:r>
+      <w:r>
+        <w:rPr>
+          <w:rFonts w:ascii="Aptos" w:hAnsi="Aptos"/>
+          <w:sz w:val="24"/>
+          <w:szCs w:val="24"/>
+        </w:rPr>
+        <w:br/>
+      </w:r>
+      <w:proofErr w:type="gramStart"/>
+      <w:r>
+        <w:rPr>
+          <w:rFonts w:ascii="Aptos" w:hAnsi="Aptos"/>
+          <w:sz w:val="24"/>
+          <w:szCs w:val="24"/>
+        </w:rPr>
+        <w:t>Think(</w:t>
+      </w:r>
+      <w:proofErr w:type="gramEnd"/>
+      <w:r>
+        <w:rPr>
+          <w:rFonts w:ascii="Aptos" w:hAnsi="Aptos"/>
+          <w:sz w:val="24"/>
+          <w:szCs w:val="24"/>
+        </w:rPr>
+        <w:t>)</w:t>
+      </w:r>
+      <w:r>
+        <w:rPr>
+          <w:rFonts w:ascii="Aptos" w:hAnsi="Aptos"/>
+          <w:sz w:val="24"/>
+          <w:szCs w:val="24"/>
+        </w:rPr>
+        <w:br/>
+      </w:r>
+      <w:r>
+        <w:rPr>
+          <w:rFonts w:ascii="Aptos" w:hAnsi="Aptos"/>
+          <w:sz w:val="24"/>
+          <w:szCs w:val="24"/>
+        </w:rPr>
+        <w:br/>
+        <w:t>Use Tool()</w:t>
+      </w:r>
+      <w:r>
+        <w:rPr>
+          <w:rFonts w:ascii="Aptos" w:hAnsi="Aptos"/>
+          <w:sz w:val="24"/>
+          <w:szCs w:val="24"/>
+        </w:rPr>
+        <w:br/>
+      </w:r>
+      <w:r>
+        <w:rPr>
+          <w:rFonts w:ascii="Aptos" w:hAnsi="Aptos"/>
+          <w:sz w:val="24"/>
+          <w:szCs w:val="24"/>
+        </w:rPr>
+        <w:br/>
+      </w:r>
+      <w:proofErr w:type="gramStart"/>
+      <w:r>
+        <w:rPr>
+          <w:rFonts w:ascii="Aptos" w:hAnsi="Aptos"/>
+          <w:sz w:val="24"/>
+          <w:szCs w:val="24"/>
+        </w:rPr>
+        <w:t>Plan(</w:t>
+      </w:r>
+      <w:proofErr w:type="gramEnd"/>
+      <w:r>
+        <w:rPr>
+          <w:rFonts w:ascii="Aptos" w:hAnsi="Aptos"/>
+          <w:sz w:val="24"/>
+          <w:szCs w:val="24"/>
+        </w:rPr>
+        <w:t>)</w:t>
+      </w:r>
+    </w:p>
+    <w:p>
+      <w:pPr>
+        <w:rPr>
+          <w:rFonts w:ascii="Aptos" w:hAnsi="Aptos"/>
+          <w:sz w:val="24"/>
+          <w:szCs w:val="24"/>
+        </w:rPr>
+      </w:pPr>
+      <w:r>
+        <w:rPr>
+          <w:rFonts w:ascii="Aptos" w:hAnsi="Aptos"/>
+          <w:sz w:val="24"/>
+          <w:szCs w:val="24"/>
+        </w:rPr>
+        <w:t xml:space="preserve">A class groups </w:t>
+      </w:r>
+      <w:r>
+        <w:rPr>
+          <w:rFonts w:ascii="Aptos" w:hAnsi="Aptos"/>
+          <w:b/>
+          <w:bCs/>
+          <w:sz w:val="24"/>
+          <w:szCs w:val="24"/>
+        </w:rPr>
+        <w:t xml:space="preserve">properties and </w:t>
+      </w:r>
+      <w:proofErr w:type="spellStart"/>
+      <w:r>
+        <w:rPr>
+          <w:rFonts w:ascii="Aptos" w:hAnsi="Aptos"/>
+          <w:b/>
+          <w:bCs/>
+          <w:sz w:val="24"/>
+          <w:szCs w:val="24"/>
+        </w:rPr>
+        <w:t>behaviors</w:t>
+      </w:r>
+      <w:proofErr w:type="spellEnd"/>
+      <w:r>
+        <w:rPr>
+          <w:rFonts w:ascii="Aptos" w:hAnsi="Aptos"/>
+          <w:b/>
+          <w:bCs/>
+          <w:sz w:val="24"/>
+          <w:szCs w:val="24"/>
+        </w:rPr>
+        <w:t xml:space="preserve"> together</w:t>
+      </w:r>
+      <w:r>
+        <w:rPr>
+          <w:rFonts w:ascii="Aptos" w:hAnsi="Aptos"/>
+          <w:sz w:val="24"/>
+          <w:szCs w:val="24"/>
+        </w:rPr>
+        <w:t>.</w:t>
+      </w:r>
+    </w:p>
+    <w:p>
+      <w:pPr>
+        <w:rPr>
+          <w:rFonts w:ascii="Aptos" w:hAnsi="Aptos"/>
+          <w:sz w:val="24"/>
+          <w:szCs w:val="24"/>
+        </w:rPr>
+      </w:pPr>
+    </w:p>
+    <w:p>
+      <w:pPr>
+        <w:rPr>
+          <w:rFonts w:ascii="Aptos" w:hAnsi="Aptos"/>
+          <w:sz w:val="24"/>
+          <w:szCs w:val="24"/>
+        </w:rPr>
+      </w:pPr>
+      <w:r>
+        <w:rPr>
+          <w:rFonts w:ascii="Aptos" w:hAnsi="Aptos"/>
+          <w:b/>
+          <w:bCs/>
+          <w:sz w:val="24"/>
+          <w:szCs w:val="24"/>
+        </w:rPr>
+        <w:t>AI Agents (Broad Category):</w:t>
+      </w:r>
+      <w:r>
+        <w:rPr>
+          <w:rFonts w:ascii="Aptos" w:hAnsi="Aptos"/>
+          <w:sz w:val="24"/>
+          <w:szCs w:val="24"/>
+        </w:rPr>
+        <w:t xml:space="preserve"> This term covers any AI system that perceives its environment and takes action. Many AI agents are </w:t>
+      </w:r>
+      <w:r>
+        <w:rPr>
+          <w:rFonts w:ascii="Aptos" w:hAnsi="Aptos"/>
+          <w:b/>
+          <w:bCs/>
+          <w:sz w:val="24"/>
+          <w:szCs w:val="24"/>
+        </w:rPr>
+        <w:t>assisted or directed</w:t>
+      </w:r>
+      <w:r>
+        <w:rPr>
+          <w:rFonts w:ascii="Aptos" w:hAnsi="Aptos"/>
+          <w:sz w:val="24"/>
+          <w:szCs w:val="24"/>
+        </w:rPr>
+        <w:t xml:space="preserve">. They require constant human prompts, operate within rigid, pre-defined rules, and only perform one isolated task at a time (e.g., a standard customer service chatbot or a grammar checker). </w:t>
+      </w:r>
+    </w:p>
+    <w:p>
+      <w:pPr>
+        <w:rPr>
+          <w:rFonts w:ascii="Aptos" w:hAnsi="Aptos"/>
+          <w:sz w:val="24"/>
+          <w:szCs w:val="24"/>
+        </w:rPr>
+      </w:pPr>
+    </w:p>
+    <w:p>
+      <w:pPr>
+        <w:rPr>
+          <w:rFonts w:ascii="Aptos" w:hAnsi="Aptos"/>
+          <w:sz w:val="24"/>
+          <w:szCs w:val="24"/>
+        </w:rPr>
+      </w:pPr>
+      <w:r>
+        <w:rPr>
+          <w:rFonts w:ascii="Aptos" w:hAnsi="Aptos"/>
+          <w:b/>
+          <w:bCs/>
+          <w:sz w:val="24"/>
+          <w:szCs w:val="24"/>
+        </w:rPr>
+        <w:t>Autonomous agent</w:t>
+      </w:r>
+      <w:r>
+        <w:rPr>
+          <w:rFonts w:ascii="Aptos" w:hAnsi="Aptos"/>
+          <w:b/>
+          <w:bCs/>
+          <w:sz w:val="24"/>
+          <w:szCs w:val="24"/>
+        </w:rPr>
+        <w:t xml:space="preserve"> </w:t>
+      </w:r>
+      <w:r>
+        <w:rPr>
+          <w:rFonts w:ascii="Aptos" w:hAnsi="Aptos"/>
+          <w:b/>
+          <w:bCs/>
+          <w:sz w:val="24"/>
+          <w:szCs w:val="24"/>
+        </w:rPr>
+        <w:t>(Specific Subset)</w:t>
+      </w:r>
+      <w:r>
+        <w:rPr>
+          <w:rFonts w:ascii="Aptos" w:hAnsi="Aptos"/>
+          <w:sz w:val="24"/>
+          <w:szCs w:val="24"/>
+        </w:rPr>
+        <w:t xml:space="preserve">- </w:t>
+      </w:r>
+      <w:r>
+        <w:rPr>
+          <w:rFonts w:ascii="Aptos" w:hAnsi="Aptos"/>
+          <w:sz w:val="24"/>
+          <w:szCs w:val="24"/>
+        </w:rPr>
+        <w:t>an AI system that perceives its environment, reasons about its goals, and takes multi-step actions independently.</w:t>
+      </w:r>
+      <w:r>
+        <w:rPr>
+          <w:rFonts w:ascii="Aptos" w:hAnsi="Aptos"/>
+          <w:sz w:val="24"/>
+          <w:szCs w:val="24"/>
+        </w:rPr>
+        <w:t xml:space="preserve"> </w:t>
+      </w:r>
+      <w:r>
+        <w:rPr>
+          <w:rFonts w:ascii="Aptos" w:hAnsi="Aptos"/>
+          <w:sz w:val="24"/>
+          <w:szCs w:val="24"/>
+        </w:rPr>
+        <w:t>(e.g., "Research and book the best 3-day itinerary to Tokyo within a ₹1,00,000 budget")</w:t>
+      </w:r>
+    </w:p>
+    <w:p>
+      <w:pPr>
+        <w:rPr>
+          <w:rFonts w:ascii="Aptos" w:hAnsi="Aptos"/>
+          <w:sz w:val="24"/>
+          <w:szCs w:val="24"/>
+        </w:rPr>
+      </w:pPr>
+      <w:r>
+        <w:rPr>
+          <w:rFonts w:ascii="Aptos" w:hAnsi="Aptos"/>
+          <w:sz w:val="24"/>
+          <w:szCs w:val="24"/>
+        </w:rPr>
+        <w:t xml:space="preserve">At their core, true autonomous agents operate on a continuous observe-think-act loop. They rely on a few key capabilities: </w:t>
+      </w:r>
+    </w:p>
+    <w:p>
+      <w:pPr>
+        <w:numPr>
+          <w:ilvl w:val="0"/>
+          <w:numId w:val="14"/>
+        </w:numPr>
+        <w:rPr>
+          <w:rFonts w:ascii="Aptos" w:hAnsi="Aptos"/>
+          <w:sz w:val="24"/>
+          <w:szCs w:val="24"/>
+        </w:rPr>
+      </w:pPr>
+      <w:r>
+        <w:rPr>
+          <w:rFonts w:ascii="Aptos" w:hAnsi="Aptos"/>
+          <w:b/>
+          <w:bCs/>
+          <w:sz w:val="24"/>
+          <w:szCs w:val="24"/>
+        </w:rPr>
+        <w:t>Perception:</w:t>
+      </w:r>
+      <w:r>
+        <w:rPr>
+          <w:rFonts w:ascii="Aptos" w:hAnsi="Aptos"/>
+          <w:sz w:val="24"/>
+          <w:szCs w:val="24"/>
+        </w:rPr>
+        <w:t xml:space="preserve"> They gather context and data from their environment.</w:t>
+      </w:r>
+    </w:p>
+    <w:p>
+      <w:pPr>
+        <w:numPr>
+          <w:ilvl w:val="0"/>
+          <w:numId w:val="14"/>
+        </w:numPr>
+        <w:rPr>
+          <w:rFonts w:ascii="Aptos" w:hAnsi="Aptos"/>
+          <w:sz w:val="24"/>
+          <w:szCs w:val="24"/>
+        </w:rPr>
+      </w:pPr>
+      <w:r>
+        <w:rPr>
+          <w:rFonts w:ascii="Aptos" w:hAnsi="Aptos"/>
+          <w:b/>
+          <w:bCs/>
+          <w:sz w:val="24"/>
+          <w:szCs w:val="24"/>
+        </w:rPr>
+        <w:t>Reasoning:</w:t>
+      </w:r>
+      <w:r>
+        <w:rPr>
+          <w:rFonts w:ascii="Aptos" w:hAnsi="Aptos"/>
+          <w:sz w:val="24"/>
+          <w:szCs w:val="24"/>
+        </w:rPr>
+        <w:t xml:space="preserve"> Using large language models (LLMs) and machine learning, they break down a main objective into smaller, sequential steps.</w:t>
+      </w:r>
+    </w:p>
+    <w:p>
+      <w:pPr>
+        <w:numPr>
+          <w:ilvl w:val="0"/>
+          <w:numId w:val="14"/>
+        </w:numPr>
+        <w:rPr>
+          <w:rFonts w:ascii="Aptos" w:hAnsi="Aptos"/>
+          <w:sz w:val="24"/>
+          <w:szCs w:val="24"/>
+        </w:rPr>
+      </w:pPr>
+      <w:r>
+        <w:rPr>
+          <w:rFonts w:ascii="Aptos" w:hAnsi="Aptos"/>
+          <w:b/>
+          <w:bCs/>
+          <w:sz w:val="24"/>
+          <w:szCs w:val="24"/>
+        </w:rPr>
+        <w:t>Action:</w:t>
+      </w:r>
+      <w:r>
+        <w:rPr>
+          <w:rFonts w:ascii="Aptos" w:hAnsi="Aptos"/>
+          <w:sz w:val="24"/>
+          <w:szCs w:val="24"/>
+        </w:rPr>
+        <w:t xml:space="preserve"> They use integrated tools (APIs, search functions, or software platforms) to accomplish tasks.</w:t>
+      </w:r>
+    </w:p>
+    <w:p>
+      <w:pPr>
+        <w:numPr>
+          <w:ilvl w:val="0"/>
+          <w:numId w:val="14"/>
+        </w:numPr>
+        <w:rPr>
+          <w:rFonts w:ascii="Aptos" w:hAnsi="Aptos"/>
+          <w:sz w:val="24"/>
+          <w:szCs w:val="24"/>
+        </w:rPr>
+      </w:pPr>
+      <w:r>
+        <w:rPr>
+          <w:rFonts w:ascii="Aptos" w:hAnsi="Aptos"/>
+          <w:b/>
+          <w:bCs/>
+          <w:sz w:val="24"/>
+          <w:szCs w:val="24"/>
+        </w:rPr>
+        <w:t>Memory &amp; Learning:</w:t>
+      </w:r>
+      <w:r>
+        <w:rPr>
+          <w:rFonts w:ascii="Aptos" w:hAnsi="Aptos"/>
+          <w:sz w:val="24"/>
+          <w:szCs w:val="24"/>
+        </w:rPr>
+        <w:t xml:space="preserve"> They store past interactions and continuously refine their decision-making processes based on feedback. </w:t>
+      </w:r>
+    </w:p>
+    <w:p>
+      <w:pPr>
+        <w:rPr>
+          <w:rFonts w:ascii="Aptos" w:hAnsi="Aptos"/>
+          <w:sz w:val="24"/>
+          <w:szCs w:val="24"/>
+        </w:rPr>
+      </w:pPr>
+    </w:p>
+    <w:p>
+      <w:pPr>
+        <w:rPr>
+          <w:rFonts w:ascii="Aptos" w:hAnsi="Aptos"/>
+          <w:sz w:val="24"/>
+          <w:szCs w:val="24"/>
+        </w:rPr>
+      </w:pPr>
+      <w:r>
+        <w:rPr>
+          <w:rFonts w:ascii="Aptos" w:hAnsi="Aptos"/>
+          <w:b/>
+          <w:bCs/>
+          <w:sz w:val="24"/>
+          <w:szCs w:val="24"/>
+        </w:rPr>
+        <w:lastRenderedPageBreak/>
+        <w:t>Autonomous Agent (The Individual):</w:t>
+      </w:r>
+      <w:r>
+        <w:rPr>
+          <w:rFonts w:ascii="Aptos" w:hAnsi="Aptos"/>
+          <w:sz w:val="24"/>
+          <w:szCs w:val="24"/>
+        </w:rPr>
+        <w:t xml:space="preserve"> This is a single AI system designed to achieve a goal independently. It focuses on how one agent perceives its environment, makes decisions, and executes actions on its own. </w:t>
+      </w:r>
+    </w:p>
+    <w:p>
+      <w:pPr>
+        <w:rPr>
+          <w:rFonts w:ascii="Aptos" w:hAnsi="Aptos"/>
+          <w:sz w:val="24"/>
+          <w:szCs w:val="24"/>
+        </w:rPr>
+      </w:pPr>
+      <w:r>
+        <w:rPr>
+          <w:rFonts w:ascii="Aptos" w:hAnsi="Aptos"/>
+          <w:b/>
+          <w:bCs/>
+          <w:sz w:val="24"/>
+          <w:szCs w:val="24"/>
+        </w:rPr>
+        <w:t>Multi-Agent System (The Community):</w:t>
+      </w:r>
+      <w:r>
+        <w:rPr>
+          <w:rFonts w:ascii="Aptos" w:hAnsi="Aptos"/>
+          <w:sz w:val="24"/>
+          <w:szCs w:val="24"/>
+        </w:rPr>
+        <w:t xml:space="preserve"> This is an environment where multiple agents—which may or may not be fully autonomous—interact, communicate, and coordinate with each other. The focus shifts from individual decision-making to teamwork, negotiation, and collective problem-solving.</w:t>
+      </w:r>
+    </w:p>
+    <w:p>
+      <w:pPr>
+        <w:rPr>
+          <w:rFonts w:ascii="Aptos" w:hAnsi="Aptos"/>
+          <w:sz w:val="24"/>
+          <w:szCs w:val="24"/>
+        </w:rPr>
+      </w:pPr>
+    </w:p>
+    <w:p>
+      <w:pPr>
+        <w:rPr>
+          <w:rFonts w:ascii="Aptos" w:hAnsi="Aptos"/>
+          <w:sz w:val="24"/>
+          <w:szCs w:val="24"/>
+        </w:rPr>
+      </w:pPr>
+      <w:r>
+        <w:rPr>
+          <w:rFonts w:ascii="Aptos" w:hAnsi="Aptos"/>
+          <w:sz w:val="24"/>
+          <w:szCs w:val="24"/>
+        </w:rPr>
+        <w:t xml:space="preserve">Think of an </w:t>
+      </w:r>
+      <w:r>
+        <w:rPr>
+          <w:rFonts w:ascii="Aptos" w:hAnsi="Aptos"/>
+          <w:b/>
+          <w:bCs/>
+          <w:sz w:val="24"/>
+          <w:szCs w:val="24"/>
+        </w:rPr>
+        <w:t>autonomous agent</w:t>
+      </w:r>
+      <w:r>
+        <w:rPr>
+          <w:rFonts w:ascii="Aptos" w:hAnsi="Aptos"/>
+          <w:sz w:val="24"/>
+          <w:szCs w:val="24"/>
+        </w:rPr>
+        <w:t xml:space="preserve"> as a single, highly skilled freelance software developer. They can take a project brief, manage their own time, write the code, and deliver the final product without someone micro-managing them. </w:t>
+      </w:r>
+    </w:p>
+    <w:p>
+      <w:pPr>
+        <w:rPr>
+          <w:rFonts w:ascii="Aptos" w:hAnsi="Aptos"/>
+          <w:sz w:val="24"/>
+          <w:szCs w:val="24"/>
+        </w:rPr>
+      </w:pPr>
+      <w:r>
+        <w:rPr>
+          <w:rFonts w:ascii="Aptos" w:hAnsi="Aptos"/>
+          <w:sz w:val="24"/>
+          <w:szCs w:val="24"/>
+        </w:rPr>
+        <w:t xml:space="preserve">A </w:t>
+      </w:r>
+      <w:r>
+        <w:rPr>
+          <w:rFonts w:ascii="Aptos" w:hAnsi="Aptos"/>
+          <w:b/>
+          <w:bCs/>
+          <w:sz w:val="24"/>
+          <w:szCs w:val="24"/>
+        </w:rPr>
+        <w:t>multi-agent system</w:t>
+      </w:r>
+      <w:r>
+        <w:rPr>
+          <w:rFonts w:ascii="Aptos" w:hAnsi="Aptos"/>
+          <w:sz w:val="24"/>
+          <w:szCs w:val="24"/>
+        </w:rPr>
+        <w:t xml:space="preserve"> is like an entire software development company. It contains multiple specialist agents: one AI agent acts as the Product Manager, </w:t>
+      </w:r>
+      <w:proofErr w:type="gramStart"/>
+      <w:r>
+        <w:rPr>
+          <w:rFonts w:ascii="Aptos" w:hAnsi="Aptos"/>
+          <w:sz w:val="24"/>
+          <w:szCs w:val="24"/>
+        </w:rPr>
+        <w:t>another</w:t>
+      </w:r>
+      <w:proofErr w:type="gramEnd"/>
+      <w:r>
+        <w:rPr>
+          <w:rFonts w:ascii="Aptos" w:hAnsi="Aptos"/>
+          <w:sz w:val="24"/>
+          <w:szCs w:val="24"/>
+        </w:rPr>
+        <w:t xml:space="preserve"> acts as the Frontend Developer, a third acts as the Backend Developer, and a fourth acts as the QA Tester. They pass messages back and forth, review each other's work, and collaborate to build a massive enterprise application that no single agent could easily build alone.</w:t>
+      </w:r>
+    </w:p>
+    <w:p>
+      <w:pPr>
+        <w:rPr>
+          <w:rFonts w:ascii="Aptos" w:hAnsi="Aptos"/>
+          <w:sz w:val="24"/>
+          <w:szCs w:val="24"/>
+        </w:rPr>
+      </w:pPr>
+    </w:p>
+    <w:p>
+      <w:pPr>
+        <w:rPr>
+          <w:rFonts w:ascii="Aptos" w:hAnsi="Aptos"/>
+          <w:sz w:val="24"/>
+          <w:szCs w:val="24"/>
+        </w:rPr>
+      </w:pPr>
+      <w:r>
+        <w:rPr>
+          <w:rFonts w:ascii="Aptos" w:hAnsi="Aptos"/>
+          <w:noProof/>
+          <w:sz w:val="24"/>
+          <w:szCs w:val="24"/>
+        </w:rPr>
+        <w:drawing>
+          <wp:inline distT="0" distB="0" distL="0" distR="0" wp14:anchorId="04ABE147" wp14:editId="53B4341A">
+            <wp:extent cx="5036820" cy="3142557"/>
+            <wp:effectExtent l="0" t="0" r="0" b="1270"/>
+            <wp:docPr id="1250851871" name="Picture 1"/>
+            <wp:cNvGraphicFramePr>
+              <a:graphicFrameLocks xmlns:a="http://schemas.openxmlformats.org/drawingml/2006/main" noChangeAspect="1"/>
+            </wp:cNvGraphicFramePr>
+            <a:graphic xmlns:a="http://schemas.openxmlformats.org/drawingml/2006/main">
+              <a:graphicData uri="http://schemas.openxmlformats.org/drawingml/2006/picture">
+                <pic:pic xmlns:pic="http://schemas.openxmlformats.org/drawingml/2006/picture">
+                  <pic:nvPicPr>
+                    <pic:cNvPr id="1250851871" name=""/>
+                    <pic:cNvPicPr/>
+                  </pic:nvPicPr>
+                  <pic:blipFill>
+                    <a:blip r:embed="rId7"/>
+                    <a:stretch>
+                      <a:fillRect/>
+                    </a:stretch>
+                  </pic:blipFill>
+                  <pic:spPr>
+                    <a:xfrm>
+                      <a:off x="0" y="0"/>
+                      <a:ext cx="5050861" cy="3151318"/>
+                    </a:xfrm>
+                    <a:prstGeom prst="rect">
+                      <a:avLst/>
+                    </a:prstGeom>
+                  </pic:spPr>
+                </pic:pic>
+              </a:graphicData>
+            </a:graphic>
+          </wp:inline>
+        </w:drawing>
+      </w:r>
+    </w:p>
+    <w:p>
+      <w:pPr>
+        <w:rPr>
+          <w:rFonts w:ascii="Aptos" w:hAnsi="Aptos"/>
+          <w:sz w:val="24"/>
+          <w:szCs w:val="24"/>
+        </w:rPr>
+      </w:pPr>
+      <w:r>
+        <w:rPr>
+          <w:rFonts w:ascii="Aptos" w:hAnsi="Aptos"/>
+          <w:noProof/>
+          <w:sz w:val="24"/>
+          <w:szCs w:val="24"/>
+        </w:rPr>
+        <w:lastRenderedPageBreak/>
+        <w:drawing>
+          <wp:inline distT="0" distB="0" distL="0" distR="0" wp14:anchorId="6329BFCB" wp14:editId="53AFCA9B">
+            <wp:extent cx="4887007" cy="4810796"/>
+            <wp:effectExtent l="0" t="0" r="8890" b="8890"/>
+            <wp:docPr id="756574647" name="Picture 1"/>
+            <wp:cNvGraphicFramePr>
+              <a:graphicFrameLocks xmlns:a="http://schemas.openxmlformats.org/drawingml/2006/main" noChangeAspect="1"/>
+            </wp:cNvGraphicFramePr>
+            <a:graphic xmlns:a="http://schemas.openxmlformats.org/drawingml/2006/main">
+              <a:graphicData uri="http://schemas.openxmlformats.org/drawingml/2006/picture">
+                <pic:pic xmlns:pic="http://schemas.openxmlformats.org/drawingml/2006/picture">
+                  <pic:nvPicPr>
+                    <pic:cNvPr id="756574647" name=""/>
+                    <pic:cNvPicPr/>
+                  </pic:nvPicPr>
+                  <pic:blipFill>
+                    <a:blip r:embed="rId8"/>
+                    <a:stretch>
+                      <a:fillRect/>
+                    </a:stretch>
+                  </pic:blipFill>
+                  <pic:spPr>
+                    <a:xfrm>
+                      <a:off x="0" y="0"/>
+                      <a:ext cx="4887007" cy="4810796"/>
+                    </a:xfrm>
+                    <a:prstGeom prst="rect">
+                      <a:avLst/>
+                    </a:prstGeom>
+                  </pic:spPr>
+                </pic:pic>
+              </a:graphicData>
+            </a:graphic>
+          </wp:inline>
+        </w:drawing>
+      </w:r>
+    </w:p>
+    <w:p>
+      <w:pPr>
+        <w:rPr>
+          <w:rFonts w:ascii="Aptos" w:hAnsi="Aptos"/>
+          <w:sz w:val="24"/>
+          <w:szCs w:val="24"/>
+        </w:rPr>
+      </w:pPr>
+    </w:p>
+    <w:p>
+      <w:pPr>
+        <w:rPr>
+          <w:rFonts w:ascii="Aptos" w:hAnsi="Aptos"/>
+          <w:sz w:val="24"/>
+          <w:szCs w:val="24"/>
+        </w:rPr>
+      </w:pPr>
+      <w:r>
+        <w:rPr>
+          <w:rFonts w:ascii="Aptos" w:hAnsi="Aptos"/>
+          <w:b/>
+          <w:bCs/>
+          <w:sz w:val="24"/>
+          <w:szCs w:val="24"/>
+        </w:rPr>
+        <w:t>Agent Orchestration:</w:t>
+      </w:r>
+      <w:r>
+        <w:rPr>
+          <w:rFonts w:ascii="Aptos" w:hAnsi="Aptos"/>
+          <w:sz w:val="24"/>
+          <w:szCs w:val="24"/>
+        </w:rPr>
+        <w:t xml:space="preserve"> This is the logic of </w:t>
+      </w:r>
+      <w:r>
+        <w:rPr>
+          <w:rFonts w:ascii="Aptos" w:hAnsi="Aptos"/>
+          <w:i/>
+          <w:iCs/>
+          <w:sz w:val="24"/>
+          <w:szCs w:val="24"/>
+        </w:rPr>
+        <w:t>how</w:t>
+      </w:r>
+      <w:r>
+        <w:rPr>
+          <w:rFonts w:ascii="Aptos" w:hAnsi="Aptos"/>
+          <w:sz w:val="24"/>
+          <w:szCs w:val="24"/>
+        </w:rPr>
+        <w:t xml:space="preserve"> agents talk to each other in a multi-agent system. Do they work in a straight assembly line (</w:t>
+      </w:r>
+      <w:r>
+        <w:rPr>
+          <w:rFonts w:ascii="Aptos" w:hAnsi="Aptos"/>
+          <w:b/>
+          <w:bCs/>
+          <w:sz w:val="24"/>
+          <w:szCs w:val="24"/>
+        </w:rPr>
+        <w:t>Sequential</w:t>
+      </w:r>
+      <w:r>
+        <w:rPr>
+          <w:rFonts w:ascii="Aptos" w:hAnsi="Aptos"/>
+          <w:sz w:val="24"/>
+          <w:szCs w:val="24"/>
+        </w:rPr>
+        <w:t>)? Does one boss agent hand out tasks to worker agents (</w:t>
+      </w:r>
+      <w:r>
+        <w:rPr>
+          <w:rFonts w:ascii="Aptos" w:hAnsi="Aptos"/>
+          <w:b/>
+          <w:bCs/>
+          <w:sz w:val="24"/>
+          <w:szCs w:val="24"/>
+        </w:rPr>
+        <w:t>Hierarchical</w:t>
+      </w:r>
+      <w:r>
+        <w:rPr>
+          <w:rFonts w:ascii="Aptos" w:hAnsi="Aptos"/>
+          <w:sz w:val="24"/>
+          <w:szCs w:val="24"/>
+        </w:rPr>
+        <w:t>)? Or do they talk freely to solve problems (</w:t>
+      </w:r>
+      <w:r>
+        <w:rPr>
+          <w:rFonts w:ascii="Aptos" w:hAnsi="Aptos"/>
+          <w:b/>
+          <w:bCs/>
+          <w:sz w:val="24"/>
+          <w:szCs w:val="24"/>
+        </w:rPr>
+        <w:t>Peer-to-Peer</w:t>
+      </w:r>
+      <w:r>
+        <w:rPr>
+          <w:rFonts w:ascii="Aptos" w:hAnsi="Aptos"/>
+          <w:sz w:val="24"/>
+          <w:szCs w:val="24"/>
+        </w:rPr>
+        <w:t>)?</w:t>
+      </w:r>
+    </w:p>
+    <w:p>
+      <w:pPr>
+        <w:rPr>
+          <w:rFonts w:ascii="Aptos" w:hAnsi="Aptos"/>
+          <w:sz w:val="24"/>
+          <w:szCs w:val="24"/>
+        </w:rPr>
+      </w:pPr>
+      <w:r>
+        <w:rPr>
+          <w:rFonts w:ascii="Aptos" w:hAnsi="Aptos"/>
+          <w:b/>
+          <w:bCs/>
+          <w:sz w:val="24"/>
+          <w:szCs w:val="24"/>
+        </w:rPr>
+        <w:t>Building Frameworks:</w:t>
+      </w:r>
+      <w:r>
+        <w:rPr>
+          <w:rFonts w:ascii="Aptos" w:hAnsi="Aptos"/>
+          <w:sz w:val="24"/>
+          <w:szCs w:val="24"/>
+        </w:rPr>
+        <w:t xml:space="preserve"> This is the practical side. Programmers don't build these complex systems from scratch anymore. They use specialized software frameworks like </w:t>
+      </w:r>
+      <w:hyperlink r:id="rId9" w:tgtFrame="_blank" w:history="1">
+        <w:proofErr w:type="spellStart"/>
+        <w:r>
+          <w:rPr>
+            <w:rStyle w:val="Hyperlink"/>
+            <w:rFonts w:ascii="Aptos" w:hAnsi="Aptos"/>
+            <w:sz w:val="24"/>
+            <w:szCs w:val="24"/>
+          </w:rPr>
+          <w:t>CrewAI</w:t>
+        </w:r>
+        <w:proofErr w:type="spellEnd"/>
+      </w:hyperlink>
+      <w:r>
+        <w:rPr>
+          <w:rFonts w:ascii="Aptos" w:hAnsi="Aptos"/>
+          <w:sz w:val="24"/>
+          <w:szCs w:val="24"/>
+        </w:rPr>
+        <w:t xml:space="preserve"> or Microsoft's </w:t>
+      </w:r>
+      <w:hyperlink r:id="rId10" w:tgtFrame="_blank" w:history="1">
+        <w:proofErr w:type="spellStart"/>
+        <w:r>
+          <w:rPr>
+            <w:rStyle w:val="Hyperlink"/>
+            <w:rFonts w:ascii="Aptos" w:hAnsi="Aptos"/>
+            <w:sz w:val="24"/>
+            <w:szCs w:val="24"/>
+          </w:rPr>
+          <w:t>AutoGen</w:t>
+        </w:r>
+        <w:proofErr w:type="spellEnd"/>
+      </w:hyperlink>
+      <w:r>
+        <w:rPr>
+          <w:rFonts w:ascii="Aptos" w:hAnsi="Aptos"/>
+          <w:sz w:val="24"/>
+          <w:szCs w:val="24"/>
+        </w:rPr>
+        <w:t xml:space="preserve"> to connect multiple agents together.</w:t>
+      </w:r>
+    </w:p>
+    <w:p>
+      <w:pPr>
+        <w:rPr>
+          <w:rFonts w:ascii="Aptos" w:hAnsi="Aptos"/>
+          <w:sz w:val="24"/>
+          <w:szCs w:val="24"/>
+        </w:rPr>
+      </w:pPr>
+    </w:p>
+    <w:p>
+      <w:pPr>
+        <w:pStyle w:val="ListParagraph"/>
+        <w:numPr>
+          <w:ilvl w:val="0"/>
+          <w:numId w:val="14"/>
+        </w:numPr>
+        <w:rPr>
+          <w:rFonts w:ascii="Aptos" w:hAnsi="Aptos"/>
+          <w:sz w:val="24"/>
+          <w:szCs w:val="24"/>
+        </w:rPr>
+      </w:pPr>
+      <w:r>
+        <w:rPr>
+          <w:rFonts w:ascii="Aptos" w:hAnsi="Aptos"/>
+          <w:b/>
+          <w:bCs/>
+          <w:sz w:val="24"/>
+          <w:szCs w:val="24"/>
+        </w:rPr>
+        <w:t>Generative AI</w:t>
+      </w:r>
+      <w:r>
+        <w:rPr>
+          <w:rFonts w:ascii="Aptos" w:hAnsi="Aptos"/>
+          <w:sz w:val="24"/>
+          <w:szCs w:val="24"/>
+        </w:rPr>
+        <w:t xml:space="preserve"> is the underlying </w:t>
+      </w:r>
+      <w:r>
+        <w:rPr>
+          <w:rFonts w:ascii="Aptos" w:hAnsi="Aptos"/>
+          <w:i/>
+          <w:iCs/>
+          <w:sz w:val="24"/>
+          <w:szCs w:val="24"/>
+        </w:rPr>
+        <w:t>technology</w:t>
+      </w:r>
+      <w:r>
+        <w:rPr>
+          <w:rFonts w:ascii="Aptos" w:hAnsi="Aptos"/>
+          <w:sz w:val="24"/>
+          <w:szCs w:val="24"/>
+        </w:rPr>
+        <w:t xml:space="preserve"> that reads, writes, and understands logic.</w:t>
+      </w:r>
+    </w:p>
+    <w:p>
+      <w:pPr>
+        <w:pStyle w:val="ListParagraph"/>
+        <w:numPr>
+          <w:ilvl w:val="0"/>
+          <w:numId w:val="14"/>
+        </w:numPr>
+        <w:rPr>
+          <w:rFonts w:ascii="Aptos" w:hAnsi="Aptos"/>
+          <w:sz w:val="24"/>
+          <w:szCs w:val="24"/>
+        </w:rPr>
+      </w:pPr>
+      <w:r>
+        <w:rPr>
+          <w:rFonts w:ascii="Aptos" w:hAnsi="Aptos"/>
+          <w:b/>
+          <w:bCs/>
+          <w:sz w:val="24"/>
+          <w:szCs w:val="24"/>
+        </w:rPr>
+        <w:t>AI Agents</w:t>
+      </w:r>
+      <w:r>
+        <w:rPr>
+          <w:rFonts w:ascii="Aptos" w:hAnsi="Aptos"/>
+          <w:sz w:val="24"/>
+          <w:szCs w:val="24"/>
+        </w:rPr>
+        <w:t xml:space="preserve"> are the </w:t>
+      </w:r>
+      <w:r>
+        <w:rPr>
+          <w:rFonts w:ascii="Aptos" w:hAnsi="Aptos"/>
+          <w:i/>
+          <w:iCs/>
+          <w:sz w:val="24"/>
+          <w:szCs w:val="24"/>
+        </w:rPr>
+        <w:t>systems</w:t>
+      </w:r>
+      <w:r>
+        <w:rPr>
+          <w:rFonts w:ascii="Aptos" w:hAnsi="Aptos"/>
+          <w:sz w:val="24"/>
+          <w:szCs w:val="24"/>
+        </w:rPr>
+        <w:t xml:space="preserve"> built on top of Gen AI that can actively execute software tasks.</w:t>
+      </w:r>
+    </w:p>
+    <w:p>
+      <w:pPr>
+        <w:pStyle w:val="ListParagraph"/>
+        <w:numPr>
+          <w:ilvl w:val="0"/>
+          <w:numId w:val="14"/>
+        </w:numPr>
+        <w:rPr>
+          <w:rFonts w:ascii="Aptos" w:hAnsi="Aptos"/>
+          <w:sz w:val="24"/>
+          <w:szCs w:val="24"/>
+        </w:rPr>
+      </w:pPr>
+      <w:r>
+        <w:rPr>
+          <w:rFonts w:ascii="Aptos" w:hAnsi="Aptos"/>
+          <w:b/>
+          <w:bCs/>
+          <w:sz w:val="24"/>
+          <w:szCs w:val="24"/>
+        </w:rPr>
+        <w:t>Autonomous Agents</w:t>
+      </w:r>
+      <w:r>
+        <w:rPr>
+          <w:rFonts w:ascii="Aptos" w:hAnsi="Aptos"/>
+          <w:sz w:val="24"/>
+          <w:szCs w:val="24"/>
+        </w:rPr>
+        <w:t xml:space="preserve"> are AI Agents that can run those tasks fully on their own.</w:t>
+      </w:r>
+    </w:p>
+    <w:p>
+      <w:pPr>
+        <w:pStyle w:val="ListParagraph"/>
+        <w:numPr>
+          <w:ilvl w:val="0"/>
+          <w:numId w:val="14"/>
+        </w:numPr>
+        <w:rPr>
+          <w:rFonts w:ascii="Aptos" w:hAnsi="Aptos"/>
+          <w:sz w:val="24"/>
+          <w:szCs w:val="24"/>
+        </w:rPr>
+      </w:pPr>
+      <w:r>
+        <w:rPr>
+          <w:rFonts w:ascii="Aptos" w:hAnsi="Aptos"/>
+          <w:b/>
+          <w:bCs/>
+          <w:sz w:val="24"/>
+          <w:szCs w:val="24"/>
+        </w:rPr>
+        <w:t>Multi-Agent Systems</w:t>
+      </w:r>
+      <w:r>
+        <w:rPr>
+          <w:rFonts w:ascii="Aptos" w:hAnsi="Aptos"/>
+          <w:sz w:val="24"/>
+          <w:szCs w:val="24"/>
+        </w:rPr>
+        <w:t xml:space="preserve"> are networks where these autonomous </w:t>
+      </w:r>
+      <w:proofErr w:type="gramStart"/>
+      <w:r>
+        <w:rPr>
+          <w:rFonts w:ascii="Aptos" w:hAnsi="Aptos"/>
+          <w:sz w:val="24"/>
+          <w:szCs w:val="24"/>
+        </w:rPr>
+        <w:t>agents</w:t>
+      </w:r>
+      <w:proofErr w:type="gramEnd"/>
+      <w:r>
+        <w:rPr>
+          <w:rFonts w:ascii="Aptos" w:hAnsi="Aptos"/>
+          <w:sz w:val="24"/>
+          <w:szCs w:val="24"/>
+        </w:rPr>
+        <w:t xml:space="preserve"> team up</w:t>
+      </w:r>
+    </w:p>
+    <w:p>
+      <w:pPr>
+        <w:rPr>
+          <w:rFonts w:ascii="Aptos" w:hAnsi="Aptos"/>
+          <w:sz w:val="24"/>
+          <w:szCs w:val="24"/>
+        </w:rPr>
+      </w:pPr>
+    </w:p>
+    <w:p>
+      <w:pPr>
+        <w:rPr>
+          <w:rFonts w:ascii="Aptos" w:hAnsi="Aptos"/>
+          <w:b/>
+          <w:bCs/>
+          <w:color w:val="7030A0"/>
+          <w:sz w:val="24"/>
+          <w:szCs w:val="24"/>
+        </w:rPr>
+      </w:pPr>
+      <w:r>
+        <w:rPr>
+          <w:rFonts w:ascii="Aptos" w:hAnsi="Aptos"/>
+          <w:b/>
+          <w:bCs/>
+          <w:color w:val="7030A0"/>
+          <w:sz w:val="24"/>
+          <w:szCs w:val="24"/>
+        </w:rPr>
+        <w:lastRenderedPageBreak/>
+        <w:t>Part 2: Python for AI</w:t>
+      </w:r>
+    </w:p>
+    <w:p>
+      <w:pPr>
+        <w:rPr>
+          <w:rFonts w:ascii="Aptos" w:hAnsi="Aptos"/>
+          <w:sz w:val="24"/>
+          <w:szCs w:val="24"/>
+        </w:rPr>
+      </w:pPr>
+      <w:r>
+        <w:rPr>
+          <w:rFonts w:ascii="Aptos" w:hAnsi="Aptos"/>
+          <w:b/>
+          <w:bCs/>
+          <w:sz w:val="24"/>
+          <w:szCs w:val="24"/>
+        </w:rPr>
+        <w:t>I</w:t>
+      </w:r>
+      <w:r>
+        <w:rPr>
+          <w:rFonts w:ascii="Aptos" w:hAnsi="Aptos"/>
+          <w:b/>
+          <w:bCs/>
+          <w:sz w:val="24"/>
+          <w:szCs w:val="24"/>
+        </w:rPr>
+        <w:t>nstance method</w:t>
+      </w:r>
+      <w:r>
+        <w:rPr>
+          <w:rFonts w:ascii="Aptos" w:hAnsi="Aptos"/>
+          <w:b/>
+          <w:bCs/>
+          <w:sz w:val="24"/>
+          <w:szCs w:val="24"/>
+        </w:rPr>
+        <w:t>-</w:t>
+      </w:r>
+      <w:r>
+        <w:rPr>
+          <w:rFonts w:ascii="Aptos" w:hAnsi="Aptos"/>
+          <w:sz w:val="24"/>
+          <w:szCs w:val="24"/>
+        </w:rPr>
+        <w:t xml:space="preserve"> is a function defined inside a class that operates directly on individual objects (instances) created from that class. It is the default method type in Python. It can read, write, and modify the specific state of an individual object via its first parameter, which is conventionally named self.</w:t>
+      </w:r>
+    </w:p>
+    <w:p>
+      <w:pPr>
+        <w:rPr>
+          <w:rFonts w:ascii="Aptos" w:hAnsi="Aptos"/>
+          <w:sz w:val="24"/>
+          <w:szCs w:val="24"/>
+        </w:rPr>
+      </w:pPr>
+      <w:r>
+        <w:rPr>
+          <w:rFonts w:ascii="Aptos" w:hAnsi="Aptos"/>
+          <w:b/>
+          <w:bCs/>
+          <w:sz w:val="24"/>
+          <w:szCs w:val="24"/>
+        </w:rPr>
+        <w:t>S</w:t>
+      </w:r>
+      <w:r>
+        <w:rPr>
+          <w:rFonts w:ascii="Aptos" w:hAnsi="Aptos"/>
+          <w:b/>
+          <w:bCs/>
+          <w:sz w:val="24"/>
+          <w:szCs w:val="24"/>
+        </w:rPr>
+        <w:t>tatic method</w:t>
+      </w:r>
+      <w:r>
+        <w:rPr>
+          <w:rFonts w:ascii="Aptos" w:hAnsi="Aptos"/>
+          <w:sz w:val="24"/>
+          <w:szCs w:val="24"/>
+        </w:rPr>
+        <w:t xml:space="preserve"> in Python is a method defined inside a class that behaves exactly like a normal function but belongs to the class's namespace. It is created using the </w:t>
+      </w:r>
+      <w:r>
+        <w:rPr>
+          <w:rFonts w:ascii="Aptos" w:hAnsi="Aptos"/>
+          <w:b/>
+          <w:bCs/>
+          <w:sz w:val="24"/>
+          <w:szCs w:val="24"/>
+        </w:rPr>
+        <w:t>@staticmethod decorator</w:t>
+      </w:r>
+      <w:r>
+        <w:rPr>
+          <w:rFonts w:ascii="Aptos" w:hAnsi="Aptos"/>
+          <w:sz w:val="24"/>
+          <w:szCs w:val="24"/>
+        </w:rPr>
+        <w:t xml:space="preserve"> and does not implicitly receive a first argument like self (the object instance) or </w:t>
+      </w:r>
+      <w:proofErr w:type="spellStart"/>
+      <w:r>
+        <w:rPr>
+          <w:rFonts w:ascii="Aptos" w:hAnsi="Aptos"/>
+          <w:sz w:val="24"/>
+          <w:szCs w:val="24"/>
+        </w:rPr>
+        <w:t>cls</w:t>
+      </w:r>
+      <w:proofErr w:type="spellEnd"/>
+      <w:r>
+        <w:rPr>
+          <w:rFonts w:ascii="Aptos" w:hAnsi="Aptos"/>
+          <w:sz w:val="24"/>
+          <w:szCs w:val="24"/>
+        </w:rPr>
+        <w:t xml:space="preserve"> (the class itself)</w:t>
+      </w:r>
+      <w:r>
+        <w:rPr>
+          <w:rFonts w:ascii="Aptos" w:hAnsi="Aptos"/>
+          <w:sz w:val="24"/>
+          <w:szCs w:val="24"/>
+        </w:rPr>
+        <w:t>.</w:t>
+      </w:r>
+    </w:p>
+    <w:tbl>
+      <w:tblPr>
+        <w:tblW w:w="0" w:type="auto"/>
+        <w:tblCellSpacing w:w="15" w:type="dxa"/>
+        <w:tblCellMar>
+          <w:top w:w="15" w:type="dxa"/>
+          <w:left w:w="15" w:type="dxa"/>
+          <w:bottom w:w="15" w:type="dxa"/>
+          <w:right w:w="15" w:type="dxa"/>
+        </w:tblCellMar>
+        <w:tblLook w:val="04A0" w:firstRow="1" w:lastRow="0" w:firstColumn="1" w:lastColumn="0" w:noHBand="0" w:noVBand="1"/>
+      </w:tblPr>
+      <w:tblGrid>
+        <w:gridCol w:w="3261"/>
+        <w:gridCol w:w="4961"/>
+      </w:tblGrid>
+      <w:tr>
+        <w:trPr>
+          <w:tblHeader/>
+          <w:tblCellSpacing w:w="15" w:type="dxa"/>
+        </w:trPr>
+        <w:tc>
+          <w:tcPr>
+            <w:tcW w:w="3216" w:type="dxa"/>
+            <w:vAlign w:val="center"/>
+            <w:hideMark/>
+          </w:tcPr>
+          <w:p>
+            <w:pPr>
+              <w:rPr>
+                <w:rFonts w:ascii="Aptos" w:hAnsi="Aptos"/>
+                <w:b/>
+                <w:bCs/>
+                <w:sz w:val="24"/>
+                <w:szCs w:val="24"/>
+              </w:rPr>
+            </w:pPr>
+            <w:r>
+              <w:rPr>
+                <w:rFonts w:ascii="Aptos" w:hAnsi="Aptos"/>
+                <w:b/>
+                <w:bCs/>
+                <w:sz w:val="24"/>
+                <w:szCs w:val="24"/>
+              </w:rPr>
+              <w:t>Instance Method</w:t>
+            </w:r>
+          </w:p>
+        </w:tc>
+        <w:tc>
+          <w:tcPr>
+            <w:tcW w:w="4916" w:type="dxa"/>
+            <w:vAlign w:val="center"/>
+            <w:hideMark/>
+          </w:tcPr>
+          <w:p>
+            <w:pPr>
+              <w:rPr>
+                <w:rFonts w:ascii="Aptos" w:hAnsi="Aptos"/>
+                <w:b/>
+                <w:bCs/>
+                <w:sz w:val="24"/>
+                <w:szCs w:val="24"/>
+              </w:rPr>
+            </w:pPr>
+            <w:r>
+              <w:rPr>
+                <w:rFonts w:ascii="Aptos" w:hAnsi="Aptos"/>
+                <w:b/>
+                <w:bCs/>
+                <w:sz w:val="24"/>
+                <w:szCs w:val="24"/>
+              </w:rPr>
+              <w:t>Static Method</w:t>
+            </w:r>
+          </w:p>
+        </w:tc>
+      </w:tr>
+      <w:tr>
+        <w:trPr>
+          <w:tblCellSpacing w:w="15" w:type="dxa"/>
+        </w:trPr>
+        <w:tc>
+          <w:tcPr>
+            <w:tcW w:w="3216" w:type="dxa"/>
+            <w:vAlign w:val="center"/>
+            <w:hideMark/>
+          </w:tcPr>
+          <w:p>
+            <w:pPr>
+              <w:rPr>
+                <w:rFonts w:ascii="Aptos" w:hAnsi="Aptos"/>
+                <w:sz w:val="24"/>
+                <w:szCs w:val="24"/>
+              </w:rPr>
+            </w:pPr>
+            <w:r>
+              <w:rPr>
+                <w:rFonts w:ascii="Aptos" w:hAnsi="Aptos"/>
+                <w:sz w:val="24"/>
+                <w:szCs w:val="24"/>
+              </w:rPr>
+              <w:t>Uses self</w:t>
+            </w:r>
+          </w:p>
+        </w:tc>
+        <w:tc>
+          <w:tcPr>
+            <w:tcW w:w="4916" w:type="dxa"/>
+            <w:vAlign w:val="center"/>
+            <w:hideMark/>
+          </w:tcPr>
+          <w:p>
+            <w:pPr>
+              <w:rPr>
+                <w:rFonts w:ascii="Aptos" w:hAnsi="Aptos"/>
+                <w:sz w:val="24"/>
+                <w:szCs w:val="24"/>
+              </w:rPr>
+            </w:pPr>
+            <w:r>
+              <w:rPr>
+                <w:rFonts w:ascii="Aptos" w:hAnsi="Aptos"/>
+                <w:sz w:val="24"/>
+                <w:szCs w:val="24"/>
+              </w:rPr>
+              <w:t>No self</w:t>
+            </w:r>
+          </w:p>
+        </w:tc>
+      </w:tr>
+      <w:tr>
+        <w:trPr>
+          <w:tblCellSpacing w:w="15" w:type="dxa"/>
+        </w:trPr>
+        <w:tc>
+          <w:tcPr>
+            <w:tcW w:w="3216" w:type="dxa"/>
+            <w:vAlign w:val="center"/>
+            <w:hideMark/>
+          </w:tcPr>
+          <w:p>
+            <w:pPr>
+              <w:rPr>
+                <w:rFonts w:ascii="Aptos" w:hAnsi="Aptos"/>
+                <w:sz w:val="24"/>
+                <w:szCs w:val="24"/>
+              </w:rPr>
+            </w:pPr>
+            <w:r>
+              <w:rPr>
+                <w:rFonts w:ascii="Aptos" w:hAnsi="Aptos"/>
+                <w:sz w:val="24"/>
+                <w:szCs w:val="24"/>
+              </w:rPr>
+              <w:t>Works with object data</w:t>
+            </w:r>
+          </w:p>
+        </w:tc>
+        <w:tc>
+          <w:tcPr>
+            <w:tcW w:w="4916" w:type="dxa"/>
+            <w:vAlign w:val="center"/>
+            <w:hideMark/>
+          </w:tcPr>
+          <w:p>
+            <w:pPr>
+              <w:rPr>
+                <w:rFonts w:ascii="Aptos" w:hAnsi="Aptos"/>
+                <w:sz w:val="24"/>
+                <w:szCs w:val="24"/>
+              </w:rPr>
+            </w:pPr>
+            <w:r>
+              <w:rPr>
+                <w:rFonts w:ascii="Aptos" w:hAnsi="Aptos"/>
+                <w:sz w:val="24"/>
+                <w:szCs w:val="24"/>
+              </w:rPr>
+              <w:t>Doesn't use object data</w:t>
+            </w:r>
+          </w:p>
+        </w:tc>
+      </w:tr>
+      <w:tr>
+        <w:trPr>
+          <w:tblCellSpacing w:w="15" w:type="dxa"/>
+        </w:trPr>
+        <w:tc>
+          <w:tcPr>
+            <w:tcW w:w="3216" w:type="dxa"/>
+            <w:vAlign w:val="center"/>
+            <w:hideMark/>
+          </w:tcPr>
+          <w:p>
+            <w:pPr>
+              <w:rPr>
+                <w:rFonts w:ascii="Aptos" w:hAnsi="Aptos"/>
+                <w:sz w:val="24"/>
+                <w:szCs w:val="24"/>
+              </w:rPr>
+            </w:pPr>
+            <w:r>
+              <w:rPr>
+                <w:rFonts w:ascii="Aptos" w:hAnsi="Aptos"/>
+                <w:sz w:val="24"/>
+                <w:szCs w:val="24"/>
+              </w:rPr>
+              <w:t>Requires an object</w:t>
+            </w:r>
+          </w:p>
+        </w:tc>
+        <w:tc>
+          <w:tcPr>
+            <w:tcW w:w="4916" w:type="dxa"/>
+            <w:vAlign w:val="center"/>
+            <w:hideMark/>
+          </w:tcPr>
+          <w:p>
+            <w:pPr>
+              <w:rPr>
+                <w:rFonts w:ascii="Aptos" w:hAnsi="Aptos"/>
+                <w:sz w:val="24"/>
+                <w:szCs w:val="24"/>
+              </w:rPr>
+            </w:pPr>
+            <w:r>
+              <w:rPr>
+                <w:rFonts w:ascii="Aptos" w:hAnsi="Aptos"/>
+                <w:sz w:val="24"/>
+                <w:szCs w:val="24"/>
+              </w:rPr>
+              <w:t>Can be called directly from the class</w:t>
+            </w:r>
+          </w:p>
+        </w:tc>
+      </w:tr>
+      <w:tr>
+        <w:trPr>
+          <w:tblCellSpacing w:w="15" w:type="dxa"/>
+        </w:trPr>
+        <w:tc>
+          <w:tcPr>
+            <w:tcW w:w="3216" w:type="dxa"/>
+            <w:vAlign w:val="center"/>
+            <w:hideMark/>
+          </w:tcPr>
+          <w:p>
+            <w:pPr>
+              <w:rPr>
+                <w:rFonts w:ascii="Aptos" w:hAnsi="Aptos"/>
+                <w:sz w:val="24"/>
+                <w:szCs w:val="24"/>
+              </w:rPr>
+            </w:pPr>
+            <w:r>
+              <w:rPr>
+                <w:rFonts w:ascii="Aptos" w:hAnsi="Aptos"/>
+                <w:sz w:val="24"/>
+                <w:szCs w:val="24"/>
+              </w:rPr>
+              <w:t xml:space="preserve">Example: </w:t>
+            </w:r>
+            <w:proofErr w:type="gramStart"/>
+            <w:r>
+              <w:rPr>
+                <w:rFonts w:ascii="Aptos" w:hAnsi="Aptos"/>
+                <w:sz w:val="24"/>
+                <w:szCs w:val="24"/>
+              </w:rPr>
+              <w:t>respond(</w:t>
+            </w:r>
+            <w:proofErr w:type="gramEnd"/>
+            <w:r>
+              <w:rPr>
+                <w:rFonts w:ascii="Aptos" w:hAnsi="Aptos"/>
+                <w:sz w:val="24"/>
+                <w:szCs w:val="24"/>
+              </w:rPr>
+              <w:t>)</w:t>
+            </w:r>
+          </w:p>
+        </w:tc>
+        <w:tc>
+          <w:tcPr>
+            <w:tcW w:w="4916" w:type="dxa"/>
+            <w:vAlign w:val="center"/>
+            <w:hideMark/>
+          </w:tcPr>
+          <w:p>
+            <w:pPr>
+              <w:rPr>
+                <w:rFonts w:ascii="Aptos" w:hAnsi="Aptos"/>
+                <w:sz w:val="24"/>
+                <w:szCs w:val="24"/>
+              </w:rPr>
+            </w:pPr>
+            <w:r>
+              <w:rPr>
+                <w:rFonts w:ascii="Aptos" w:hAnsi="Aptos"/>
+                <w:sz w:val="24"/>
+                <w:szCs w:val="24"/>
+              </w:rPr>
+              <w:t xml:space="preserve">Example: </w:t>
+            </w:r>
+            <w:proofErr w:type="gramStart"/>
+            <w:r>
+              <w:rPr>
+                <w:rFonts w:ascii="Aptos" w:hAnsi="Aptos"/>
+                <w:sz w:val="24"/>
+                <w:szCs w:val="24"/>
+              </w:rPr>
+              <w:t>calculate(</w:t>
+            </w:r>
+            <w:proofErr w:type="gramEnd"/>
+            <w:r>
+              <w:rPr>
+                <w:rFonts w:ascii="Aptos" w:hAnsi="Aptos"/>
+                <w:sz w:val="24"/>
+                <w:szCs w:val="24"/>
+              </w:rPr>
+              <w:t>)</w:t>
+            </w:r>
+          </w:p>
+        </w:tc>
+      </w:tr>
+    </w:tbl>
+    <w:p>
+      <w:pPr>
+        <w:rPr>
+          <w:rFonts w:ascii="Aptos" w:hAnsi="Aptos"/>
+          <w:sz w:val="24"/>
+          <w:szCs w:val="24"/>
+        </w:rPr>
+      </w:pPr>
+    </w:p>
+    <w:p>
+      <w:pPr>
+        <w:rPr>
+          <w:rFonts w:ascii="Aptos" w:hAnsi="Aptos"/>
+          <w:sz w:val="24"/>
+          <w:szCs w:val="24"/>
+        </w:rPr>
+      </w:pPr>
+      <w:r>
+        <w:rPr>
+          <w:rFonts w:ascii="Aptos" w:hAnsi="Aptos"/>
+          <w:b/>
+          <w:bCs/>
+          <w:sz w:val="24"/>
+          <w:szCs w:val="24"/>
+        </w:rPr>
+        <w:t>H</w:t>
+      </w:r>
+      <w:r>
+        <w:rPr>
+          <w:rFonts w:ascii="Aptos" w:hAnsi="Aptos"/>
+          <w:b/>
+          <w:bCs/>
+          <w:sz w:val="24"/>
+          <w:szCs w:val="24"/>
+        </w:rPr>
+        <w:t>elper function</w:t>
+      </w:r>
+      <w:r>
+        <w:rPr>
+          <w:rFonts w:ascii="Aptos" w:hAnsi="Aptos"/>
+          <w:sz w:val="24"/>
+          <w:szCs w:val="24"/>
+        </w:rPr>
+        <w:t xml:space="preserve"> is a small, reusable utility function designed to perform a specific, repetitive task on behalf of a larger, main function. Using helper functions breaks down complex data logic into readable chunks, keeps your program organized, and follows the DRY (Don't Repeat Yourself) programming principle.</w:t>
+      </w:r>
+    </w:p>
+    <w:p>
+      <w:pPr>
+        <w:rPr>
+          <w:rFonts w:ascii="Aptos" w:hAnsi="Aptos"/>
+          <w:sz w:val="24"/>
+          <w:szCs w:val="24"/>
+        </w:rPr>
+      </w:pPr>
+    </w:p>
+    <w:p>
+      <w:pPr>
+        <w:rPr>
+          <w:rFonts w:ascii="Aptos" w:hAnsi="Aptos"/>
+          <w:sz w:val="24"/>
+          <w:szCs w:val="24"/>
+        </w:rPr>
+      </w:pPr>
     </w:p>
     <w:sectPr>
       <w:pgSz w:w="11906" w:h="16838"/>
@@ -10442,208 +12209,9 @@
     </w:lvl>
   </w:abstractNum>
   <w:abstractNum w:abstractNumId="2" w15:restartNumberingAfterBreak="0">
-    <w:nsid w:val="237B6F3B"/>
+    <w:nsid w:val="191D250B"/>
     <w:multiLevelType w:val="multilevel"/>
-    <w:tmpl w:val="EDF2DEE2"/>
-    <w:lvl w:ilvl="0">
-      <w:start w:val="1"/>
-      <w:numFmt w:val="decimal"/>
-      <w:lvlText w:val="%1."/>
-      <w:lvlJc w:val="left"/>
-      <w:pPr>
-        <w:tabs>
-          <w:tab w:val="num" w:pos="720"/>
-        </w:tabs>
-        <w:ind w:left="720" w:hanging="360"/>
-      </w:pPr>
-    </w:lvl>
-    <w:lvl w:ilvl="1" w:tentative="1">
-      <w:start w:val="1"/>
-      <w:numFmt w:val="decimal"/>
-      <w:lvlText w:val="%2."/>
-      <w:lvlJc w:val="left"/>
-      <w:pPr>
-        <w:tabs>
-          <w:tab w:val="num" w:pos="1440"/>
-        </w:tabs>
-        <w:ind w:left="1440" w:hanging="360"/>
-      </w:pPr>
-    </w:lvl>
-    <w:lvl w:ilvl="2" w:tentative="1">
-      <w:start w:val="1"/>
-      <w:numFmt w:val="decimal"/>
-      <w:lvlText w:val="%3."/>
-      <w:lvlJc w:val="left"/>
-      <w:pPr>
-        <w:tabs>
-          <w:tab w:val="num" w:pos="2160"/>
-        </w:tabs>
-        <w:ind w:left="2160" w:hanging="360"/>
-      </w:pPr>
-    </w:lvl>
-    <w:lvl w:ilvl="3" w:tentative="1">
-      <w:start w:val="1"/>
-      <w:numFmt w:val="decimal"/>
-      <w:lvlText w:val="%4."/>
-      <w:lvlJc w:val="left"/>
-      <w:pPr>
-        <w:tabs>
-          <w:tab w:val="num" w:pos="2880"/>
-        </w:tabs>
-        <w:ind w:left="2880" w:hanging="360"/>
-      </w:pPr>
-    </w:lvl>
-    <w:lvl w:ilvl="4" w:tentative="1">
-      <w:start w:val="1"/>
-      <w:numFmt w:val="decimal"/>
-      <w:lvlText w:val="%5."/>
-      <w:lvlJc w:val="left"/>
-      <w:pPr>
-        <w:tabs>
-          <w:tab w:val="num" w:pos="3600"/>
-        </w:tabs>
-        <w:ind w:left="3600" w:hanging="360"/>
-      </w:pPr>
-    </w:lvl>
-    <w:lvl w:ilvl="5" w:tentative="1">
-      <w:start w:val="1"/>
-      <w:numFmt w:val="decimal"/>
-      <w:lvlText w:val="%6."/>
-      <w:lvlJc w:val="left"/>
-      <w:pPr>
-        <w:tabs>
-          <w:tab w:val="num" w:pos="4320"/>
-        </w:tabs>
-        <w:ind w:left="4320" w:hanging="360"/>
-      </w:pPr>
-    </w:lvl>
-    <w:lvl w:ilvl="6" w:tentative="1">
-      <w:start w:val="1"/>
-      <w:numFmt w:val="decimal"/>
-      <w:lvlText w:val="%7."/>
-      <w:lvlJc w:val="left"/>
-      <w:pPr>
-        <w:tabs>
-          <w:tab w:val="num" w:pos="5040"/>
-        </w:tabs>
-        <w:ind w:left="5040" w:hanging="360"/>
-      </w:pPr>
-    </w:lvl>
-    <w:lvl w:ilvl="7" w:tentative="1">
-      <w:start w:val="1"/>
-      <w:numFmt w:val="decimal"/>
-      <w:lvlText w:val="%8."/>
-      <w:lvlJc w:val="left"/>
-      <w:pPr>
-        <w:tabs>
-          <w:tab w:val="num" w:pos="5760"/>
-        </w:tabs>
-        <w:ind w:left="5760" w:hanging="360"/>
-      </w:pPr>
-    </w:lvl>
-    <w:lvl w:ilvl="8" w:tentative="1">
-      <w:start w:val="1"/>
-      <w:numFmt w:val="decimal"/>
-      <w:lvlText w:val="%9."/>
-      <w:lvlJc w:val="left"/>
-      <w:pPr>
-        <w:tabs>
-          <w:tab w:val="num" w:pos="6480"/>
-        </w:tabs>
-        <w:ind w:left="6480" w:hanging="360"/>
-      </w:pPr>
-    </w:lvl>
-  </w:abstractNum>
-  <w:abstractNum w:abstractNumId="3" w15:restartNumberingAfterBreak="0">
-    <w:nsid w:val="2B4D6E6F"/>
-    <w:multiLevelType w:val="hybridMultilevel"/>
-    <w:tmpl w:val="BC5209C8"/>
-    <w:lvl w:ilvl="0" w:tplc="4009000F">
-      <w:start w:val="1"/>
-      <w:numFmt w:val="decimal"/>
-      <w:lvlText w:val="%1."/>
-      <w:lvlJc w:val="left"/>
-      <w:pPr>
-        <w:ind w:left="720" w:hanging="360"/>
-      </w:pPr>
-    </w:lvl>
-    <w:lvl w:ilvl="1" w:tplc="40090019" w:tentative="1">
-      <w:start w:val="1"/>
-      <w:numFmt w:val="lowerLetter"/>
-      <w:lvlText w:val="%2."/>
-      <w:lvlJc w:val="left"/>
-      <w:pPr>
-        <w:ind w:left="1440" w:hanging="360"/>
-      </w:pPr>
-    </w:lvl>
-    <w:lvl w:ilvl="2" w:tplc="4009001B" w:tentative="1">
-      <w:start w:val="1"/>
-      <w:numFmt w:val="lowerRoman"/>
-      <w:lvlText w:val="%3."/>
-      <w:lvlJc w:val="right"/>
-      <w:pPr>
-        <w:ind w:left="2160" w:hanging="180"/>
-      </w:pPr>
-    </w:lvl>
-    <w:lvl w:ilvl="3" w:tplc="4009000F" w:tentative="1">
-      <w:start w:val="1"/>
-      <w:numFmt w:val="decimal"/>
-      <w:lvlText w:val="%4."/>
-      <w:lvlJc w:val="left"/>
-      <w:pPr>
-        <w:ind w:left="2880" w:hanging="360"/>
-      </w:pPr>
-    </w:lvl>
-    <w:lvl w:ilvl="4" w:tplc="40090019" w:tentative="1">
-      <w:start w:val="1"/>
-      <w:numFmt w:val="lowerLetter"/>
-      <w:lvlText w:val="%5."/>
-      <w:lvlJc w:val="left"/>
-      <w:pPr>
-        <w:ind w:left="3600" w:hanging="360"/>
-      </w:pPr>
-    </w:lvl>
-    <w:lvl w:ilvl="5" w:tplc="4009001B" w:tentative="1">
-      <w:start w:val="1"/>
-      <w:numFmt w:val="lowerRoman"/>
-      <w:lvlText w:val="%6."/>
-      <w:lvlJc w:val="right"/>
-      <w:pPr>
-        <w:ind w:left="4320" w:hanging="180"/>
-      </w:pPr>
-    </w:lvl>
-    <w:lvl w:ilvl="6" w:tplc="4009000F" w:tentative="1">
-      <w:start w:val="1"/>
-      <w:numFmt w:val="decimal"/>
-      <w:lvlText w:val="%7."/>
-      <w:lvlJc w:val="left"/>
-      <w:pPr>
-        <w:ind w:left="5040" w:hanging="360"/>
-      </w:pPr>
-    </w:lvl>
-    <w:lvl w:ilvl="7" w:tplc="40090019" w:tentative="1">
-      <w:start w:val="1"/>
-      <w:numFmt w:val="lowerLetter"/>
-      <w:lvlText w:val="%8."/>
-      <w:lvlJc w:val="left"/>
-      <w:pPr>
-        <w:ind w:left="5760" w:hanging="360"/>
-      </w:pPr>
-    </w:lvl>
-    <w:lvl w:ilvl="8" w:tplc="4009001B" w:tentative="1">
-      <w:start w:val="1"/>
-      <w:numFmt w:val="lowerRoman"/>
-      <w:lvlText w:val="%9."/>
-      <w:lvlJc w:val="right"/>
-      <w:pPr>
-        <w:ind w:left="6480" w:hanging="180"/>
-      </w:pPr>
-    </w:lvl>
-  </w:abstractNum>
-  <w:abstractNum w:abstractNumId="4" w15:restartNumberingAfterBreak="0">
-    <w:nsid w:val="382C35D8"/>
-    <w:multiLevelType w:val="multilevel"/>
-    <w:tmpl w:val="AAAAEC82"/>
+    <w:tmpl w:val="97F65D54"/>
     <w:lvl w:ilvl="0">
       <w:start w:val="1"/>
       <w:numFmt w:val="bullet"/>
@@ -10651,9 +12219,9 @@
       <w:lvlJc w:val="left"/>
       <w:pPr>
         <w:tabs>
-          <w:tab w:val="num" w:pos="1778"/>
+          <w:tab w:val="num" w:pos="720"/>
         </w:tabs>
-        <w:ind w:left="1778" w:hanging="360"/>
+        <w:ind w:left="720" w:hanging="360"/>
       </w:pPr>
       <w:rPr>
         <w:rFonts w:ascii="Symbol" w:hAnsi="Symbol" w:hint="default"/>
@@ -10667,9 +12235,9 @@
       <w:lvlJc w:val="left"/>
       <w:pPr>
         <w:tabs>
-          <w:tab w:val="num" w:pos="2498"/>
+          <w:tab w:val="num" w:pos="1440"/>
         </w:tabs>
-        <w:ind w:left="2498" w:hanging="360"/>
+        <w:ind w:left="1440" w:hanging="360"/>
       </w:pPr>
       <w:rPr>
         <w:rFonts w:ascii="Courier New" w:hAnsi="Courier New" w:hint="default"/>
@@ -10683,9 +12251,9 @@
       <w:lvlJc w:val="left"/>
       <w:pPr>
         <w:tabs>
-          <w:tab w:val="num" w:pos="3218"/>
+          <w:tab w:val="num" w:pos="2160"/>
         </w:tabs>
-        <w:ind w:left="3218" w:hanging="360"/>
+        <w:ind w:left="2160" w:hanging="360"/>
       </w:pPr>
       <w:rPr>
         <w:rFonts w:ascii="Wingdings" w:hAnsi="Wingdings" w:hint="default"/>
@@ -10699,9 +12267,9 @@
       <w:lvlJc w:val="left"/>
       <w:pPr>
         <w:tabs>
-          <w:tab w:val="num" w:pos="3938"/>
+          <w:tab w:val="num" w:pos="2880"/>
         </w:tabs>
-        <w:ind w:left="3938" w:hanging="360"/>
+        <w:ind w:left="2880" w:hanging="360"/>
       </w:pPr>
       <w:rPr>
         <w:rFonts w:ascii="Wingdings" w:hAnsi="Wingdings" w:hint="default"/>
@@ -10715,9 +12283,9 @@
       <w:lvlJc w:val="left"/>
       <w:pPr>
         <w:tabs>
-          <w:tab w:val="num" w:pos="4658"/>
+          <w:tab w:val="num" w:pos="3600"/>
         </w:tabs>
-        <w:ind w:left="4658" w:hanging="360"/>
+        <w:ind w:left="3600" w:hanging="360"/>
       </w:pPr>
       <w:rPr>
         <w:rFonts w:ascii="Wingdings" w:hAnsi="Wingdings" w:hint="default"/>
@@ -10731,9 +12299,9 @@
       <w:lvlJc w:val="left"/>
       <w:pPr>
         <w:tabs>
-          <w:tab w:val="num" w:pos="5378"/>
+          <w:tab w:val="num" w:pos="4320"/>
         </w:tabs>
-        <w:ind w:left="5378" w:hanging="360"/>
+        <w:ind w:left="4320" w:hanging="360"/>
       </w:pPr>
       <w:rPr>
         <w:rFonts w:ascii="Wingdings" w:hAnsi="Wingdings" w:hint="default"/>
@@ -10747,9 +12315,9 @@
       <w:lvlJc w:val="left"/>
       <w:pPr>
         <w:tabs>
-          <w:tab w:val="num" w:pos="6098"/>
+          <w:tab w:val="num" w:pos="5040"/>
         </w:tabs>
-        <w:ind w:left="6098" w:hanging="360"/>
+        <w:ind w:left="5040" w:hanging="360"/>
       </w:pPr>
       <w:rPr>
         <w:rFonts w:ascii="Wingdings" w:hAnsi="Wingdings" w:hint="default"/>
@@ -10763,9 +12331,9 @@
       <w:lvlJc w:val="left"/>
       <w:pPr>
         <w:tabs>
-          <w:tab w:val="num" w:pos="6818"/>
+          <w:tab w:val="num" w:pos="5760"/>
         </w:tabs>
-        <w:ind w:left="6818" w:hanging="360"/>
+        <w:ind w:left="5760" w:hanging="360"/>
       </w:pPr>
       <w:rPr>
         <w:rFonts w:ascii="Wingdings" w:hAnsi="Wingdings" w:hint="default"/>
@@ -10779,9 +12347,9 @@
       <w:lvlJc w:val="left"/>
       <w:pPr>
         <w:tabs>
-          <w:tab w:val="num" w:pos="7538"/>
+          <w:tab w:val="num" w:pos="6480"/>
         </w:tabs>
-        <w:ind w:left="7538" w:hanging="360"/>
+        <w:ind w:left="6480" w:hanging="360"/>
       </w:pPr>
       <w:rPr>
         <w:rFonts w:ascii="Wingdings" w:hAnsi="Wingdings" w:hint="default"/>
@@ -10789,10 +12357,123 @@
       </w:rPr>
     </w:lvl>
   </w:abstractNum>
-  <w:abstractNum w:abstractNumId="5" w15:restartNumberingAfterBreak="0">
-    <w:nsid w:val="451F0311"/>
+  <w:abstractNum w:abstractNumId="3" w15:restartNumberingAfterBreak="0">
+    <w:nsid w:val="237B6F3B"/>
+    <w:multiLevelType w:val="multilevel"/>
+    <w:tmpl w:val="EDF2DEE2"/>
+    <w:lvl w:ilvl="0">
+      <w:start w:val="1"/>
+      <w:numFmt w:val="decimal"/>
+      <w:lvlText w:val="%1."/>
+      <w:lvlJc w:val="left"/>
+      <w:pPr>
+        <w:tabs>
+          <w:tab w:val="num" w:pos="720"/>
+        </w:tabs>
+        <w:ind w:left="720" w:hanging="360"/>
+      </w:pPr>
+    </w:lvl>
+    <w:lvl w:ilvl="1" w:tentative="1">
+      <w:start w:val="1"/>
+      <w:numFmt w:val="decimal"/>
+      <w:lvlText w:val="%2."/>
+      <w:lvlJc w:val="left"/>
+      <w:pPr>
+        <w:tabs>
+          <w:tab w:val="num" w:pos="1440"/>
+        </w:tabs>
+        <w:ind w:left="1440" w:hanging="360"/>
+      </w:pPr>
+    </w:lvl>
+    <w:lvl w:ilvl="2" w:tentative="1">
+      <w:start w:val="1"/>
+      <w:numFmt w:val="decimal"/>
+      <w:lvlText w:val="%3."/>
+      <w:lvlJc w:val="left"/>
+      <w:pPr>
+        <w:tabs>
+          <w:tab w:val="num" w:pos="2160"/>
+        </w:tabs>
+        <w:ind w:left="2160" w:hanging="360"/>
+      </w:pPr>
+    </w:lvl>
+    <w:lvl w:ilvl="3" w:tentative="1">
+      <w:start w:val="1"/>
+      <w:numFmt w:val="decimal"/>
+      <w:lvlText w:val="%4."/>
+      <w:lvlJc w:val="left"/>
+      <w:pPr>
+        <w:tabs>
+          <w:tab w:val="num" w:pos="2880"/>
+        </w:tabs>
+        <w:ind w:left="2880" w:hanging="360"/>
+      </w:pPr>
+    </w:lvl>
+    <w:lvl w:ilvl="4" w:tentative="1">
+      <w:start w:val="1"/>
+      <w:numFmt w:val="decimal"/>
+      <w:lvlText w:val="%5."/>
+      <w:lvlJc w:val="left"/>
+      <w:pPr>
+        <w:tabs>
+          <w:tab w:val="num" w:pos="3600"/>
+        </w:tabs>
+        <w:ind w:left="3600" w:hanging="360"/>
+      </w:pPr>
+    </w:lvl>
+    <w:lvl w:ilvl="5" w:tentative="1">
+      <w:start w:val="1"/>
+      <w:numFmt w:val="decimal"/>
+      <w:lvlText w:val="%6."/>
+      <w:lvlJc w:val="left"/>
+      <w:pPr>
+        <w:tabs>
+          <w:tab w:val="num" w:pos="4320"/>
+        </w:tabs>
+        <w:ind w:left="4320" w:hanging="360"/>
+      </w:pPr>
+    </w:lvl>
+    <w:lvl w:ilvl="6" w:tentative="1">
+      <w:start w:val="1"/>
+      <w:numFmt w:val="decimal"/>
+      <w:lvlText w:val="%7."/>
+      <w:lvlJc w:val="left"/>
+      <w:pPr>
+        <w:tabs>
+          <w:tab w:val="num" w:pos="5040"/>
+        </w:tabs>
+        <w:ind w:left="5040" w:hanging="360"/>
+      </w:pPr>
+    </w:lvl>
+    <w:lvl w:ilvl="7" w:tentative="1">
+      <w:start w:val="1"/>
+      <w:numFmt w:val="decimal"/>
+      <w:lvlText w:val="%8."/>
+      <w:lvlJc w:val="left"/>
+      <w:pPr>
+        <w:tabs>
+          <w:tab w:val="num" w:pos="5760"/>
+        </w:tabs>
+        <w:ind w:left="5760" w:hanging="360"/>
+      </w:pPr>
+    </w:lvl>
+    <w:lvl w:ilvl="8" w:tentative="1">
+      <w:start w:val="1"/>
+      <w:numFmt w:val="decimal"/>
+      <w:lvlText w:val="%9."/>
+      <w:lvlJc w:val="left"/>
+      <w:pPr>
+        <w:tabs>
+          <w:tab w:val="num" w:pos="6480"/>
+        </w:tabs>
+        <w:ind w:left="6480" w:hanging="360"/>
+      </w:pPr>
+    </w:lvl>
+  </w:abstractNum>
+  <w:abstractNum w:abstractNumId="4" w15:restartNumberingAfterBreak="0">
+    <w:nsid w:val="2B4D6E6F"/>
     <w:multiLevelType w:val="hybridMultilevel"/>
-    <w:tmpl w:val="C292EB6C"/>
+    <w:tmpl w:val="BC5209C8"/>
     <w:lvl w:ilvl="0" w:tplc="4009000F">
       <w:start w:val="1"/>
       <w:numFmt w:val="decimal"/>
@@ -10801,9 +12482,6 @@
       <w:pPr>
         <w:ind w:left="720" w:hanging="360"/>
       </w:pPr>
-      <w:rPr>
-        <w:rFonts w:hint="default"/>
-      </w:rPr>
     </w:lvl>
     <w:lvl w:ilvl="1" w:tplc="40090019" w:tentative="1">
       <w:start w:val="1"/>
@@ -10878,10 +12556,10 @@
       </w:pPr>
     </w:lvl>
   </w:abstractNum>
-  <w:abstractNum w:abstractNumId="6" w15:restartNumberingAfterBreak="0">
-    <w:nsid w:val="4EEA3E7B"/>
+  <w:abstractNum w:abstractNumId="5" w15:restartNumberingAfterBreak="0">
+    <w:nsid w:val="382C35D8"/>
     <w:multiLevelType w:val="multilevel"/>
-    <w:tmpl w:val="5F1893DE"/>
+    <w:tmpl w:val="AAAAEC82"/>
     <w:lvl w:ilvl="0">
       <w:start w:val="1"/>
       <w:numFmt w:val="bullet"/>
@@ -10889,9 +12567,9 @@
       <w:lvlJc w:val="left"/>
       <w:pPr>
         <w:tabs>
-          <w:tab w:val="num" w:pos="720"/>
+          <w:tab w:val="num" w:pos="1778"/>
         </w:tabs>
-        <w:ind w:left="720" w:hanging="360"/>
+        <w:ind w:left="1778" w:hanging="360"/>
       </w:pPr>
       <w:rPr>
         <w:rFonts w:ascii="Symbol" w:hAnsi="Symbol" w:hint="default"/>
@@ -10905,9 +12583,9 @@
       <w:lvlJc w:val="left"/>
       <w:pPr>
         <w:tabs>
-          <w:tab w:val="num" w:pos="1440"/>
+          <w:tab w:val="num" w:pos="2498"/>
         </w:tabs>
-        <w:ind w:left="1440" w:hanging="360"/>
+        <w:ind w:left="2498" w:hanging="360"/>
       </w:pPr>
       <w:rPr>
         <w:rFonts w:ascii="Courier New" w:hAnsi="Courier New" w:hint="default"/>
@@ -10921,9 +12599,9 @@
       <w:lvlJc w:val="left"/>
       <w:pPr>
         <w:tabs>
-          <w:tab w:val="num" w:pos="2160"/>
+          <w:tab w:val="num" w:pos="3218"/>
         </w:tabs>
-        <w:ind w:left="2160" w:hanging="360"/>
+        <w:ind w:left="3218" w:hanging="360"/>
       </w:pPr>
       <w:rPr>
         <w:rFonts w:ascii="Wingdings" w:hAnsi="Wingdings" w:hint="default"/>
@@ -10937,9 +12615,9 @@
       <w:lvlJc w:val="left"/>
       <w:pPr>
         <w:tabs>
-          <w:tab w:val="num" w:pos="2880"/>
+          <w:tab w:val="num" w:pos="3938"/>
         </w:tabs>
-        <w:ind w:left="2880" w:hanging="360"/>
+        <w:ind w:left="3938" w:hanging="360"/>
       </w:pPr>
       <w:rPr>
         <w:rFonts w:ascii="Wingdings" w:hAnsi="Wingdings" w:hint="default"/>
@@ -10953,9 +12631,9 @@
       <w:lvlJc w:val="left"/>
       <w:pPr>
         <w:tabs>
-          <w:tab w:val="num" w:pos="3600"/>
+          <w:tab w:val="num" w:pos="4658"/>
         </w:tabs>
-        <w:ind w:left="3600" w:hanging="360"/>
+        <w:ind w:left="4658" w:hanging="360"/>
       </w:pPr>
       <w:rPr>
         <w:rFonts w:ascii="Wingdings" w:hAnsi="Wingdings" w:hint="default"/>
@@ -10969,9 +12647,9 @@
       <w:lvlJc w:val="left"/>
       <w:pPr>
         <w:tabs>
-          <w:tab w:val="num" w:pos="4320"/>
+          <w:tab w:val="num" w:pos="5378"/>
         </w:tabs>
-        <w:ind w:left="4320" w:hanging="360"/>
+        <w:ind w:left="5378" w:hanging="360"/>
       </w:pPr>
       <w:rPr>
         <w:rFonts w:ascii="Wingdings" w:hAnsi="Wingdings" w:hint="default"/>
@@ -10985,9 +12663,9 @@
       <w:lvlJc w:val="left"/>
       <w:pPr>
         <w:tabs>
-          <w:tab w:val="num" w:pos="5040"/>
+          <w:tab w:val="num" w:pos="6098"/>
         </w:tabs>
-        <w:ind w:left="5040" w:hanging="360"/>
+        <w:ind w:left="6098" w:hanging="360"/>
       </w:pPr>
       <w:rPr>
         <w:rFonts w:ascii="Wingdings" w:hAnsi="Wingdings" w:hint="default"/>
@@ -11001,9 +12679,9 @@
       <w:lvlJc w:val="left"/>
       <w:pPr>
         <w:tabs>
-          <w:tab w:val="num" w:pos="5760"/>
+          <w:tab w:val="num" w:pos="6818"/>
         </w:tabs>
-        <w:ind w:left="5760" w:hanging="360"/>
+        <w:ind w:left="6818" w:hanging="360"/>
       </w:pPr>
       <w:rPr>
         <w:rFonts w:ascii="Wingdings" w:hAnsi="Wingdings" w:hint="default"/>
@@ -11017,9 +12695,9 @@
       <w:lvlJc w:val="left"/>
       <w:pPr>
         <w:tabs>
-          <w:tab w:val="num" w:pos="6480"/>
+          <w:tab w:val="num" w:pos="7538"/>
         </w:tabs>
-        <w:ind w:left="6480" w:hanging="360"/>
+        <w:ind w:left="7538" w:hanging="360"/>
       </w:pPr>
       <w:rPr>
         <w:rFonts w:ascii="Wingdings" w:hAnsi="Wingdings" w:hint="default"/>
@@ -11027,235 +12705,99 @@
       </w:rPr>
     </w:lvl>
   </w:abstractNum>
-  <w:abstractNum w:abstractNumId="7" w15:restartNumberingAfterBreak="0">
-    <w:nsid w:val="58CF4881"/>
+  <w:abstractNum w:abstractNumId="6" w15:restartNumberingAfterBreak="0">
+    <w:nsid w:val="451F0311"/>
     <w:multiLevelType w:val="hybridMultilevel"/>
-    <w:tmpl w:val="77EE7A1C"/>
-    <w:lvl w:ilvl="0" w:tplc="D51E7008">
-      <w:numFmt w:val="bullet"/>
-      <w:lvlText w:val=""/>
+    <w:tmpl w:val="C292EB6C"/>
+    <w:lvl w:ilvl="0" w:tplc="4009000F">
+      <w:start w:val="1"/>
+      <w:numFmt w:val="decimal"/>
+      <w:lvlText w:val="%1."/>
       <w:lvlJc w:val="left"/>
       <w:pPr>
         <w:ind w:left="720" w:hanging="360"/>
       </w:pPr>
       <w:rPr>
-        <w:rFonts w:ascii="Aptos" w:eastAsiaTheme="minorHAnsi" w:hAnsi="Aptos" w:cstheme="minorBidi" w:hint="default"/>
+        <w:rFonts w:hint="default"/>
       </w:rPr>
     </w:lvl>
-    <w:lvl w:ilvl="1" w:tplc="40090003" w:tentative="1">
+    <w:lvl w:ilvl="1" w:tplc="40090019" w:tentative="1">
       <w:start w:val="1"/>
-      <w:numFmt w:val="bullet"/>
-      <w:lvlText w:val="o"/>
+      <w:numFmt w:val="lowerLetter"/>
+      <w:lvlText w:val="%2."/>
       <w:lvlJc w:val="left"/>
       <w:pPr>
         <w:ind w:left="1440" w:hanging="360"/>
       </w:pPr>
-      <w:rPr>
-        <w:rFonts w:ascii="Courier New" w:hAnsi="Courier New" w:cs="Courier New" w:hint="default"/>
-      </w:rPr>
     </w:lvl>
-    <w:lvl w:ilvl="2" w:tplc="40090005" w:tentative="1">
+    <w:lvl w:ilvl="2" w:tplc="4009001B" w:tentative="1">
       <w:start w:val="1"/>
-      <w:numFmt w:val="bullet"/>
-      <w:lvlText w:val=""/>
+      <w:numFmt w:val="lowerRoman"/>
+      <w:lvlText w:val="%3."/>
+      <w:lvlJc w:val="right"/>
+      <w:pPr>
+        <w:ind w:left="2160" w:hanging="180"/>
+      </w:pPr>
+    </w:lvl>
+    <w:lvl w:ilvl="3" w:tplc="4009000F" w:tentative="1">
+      <w:start w:val="1"/>
+      <w:numFmt w:val="decimal"/>
+      <w:lvlText w:val="%4."/>
       <w:lvlJc w:val="left"/>
       <w:pPr>
-        <w:ind w:left="2160" w:hanging="360"/>
-      </w:pPr>
-      <w:rPr>
-        <w:rFonts w:ascii="Wingdings" w:hAnsi="Wingdings" w:hint="default"/>
-      </w:rPr>
+        <w:ind w:left="2880" w:hanging="360"/>
+      </w:pPr>
     </w:lvl>
-    <w:lvl w:ilvl="3" w:tplc="40090001" w:tentative="1">
+    <w:lvl w:ilvl="4" w:tplc="40090019" w:tentative="1">
       <w:start w:val="1"/>
-      <w:numFmt w:val="bullet"/>
-      <w:lvlText w:val=""/>
+      <w:numFmt w:val="lowerLetter"/>
+      <w:lvlText w:val="%5."/>
       <w:lvlJc w:val="left"/>
       <w:pPr>
-        <w:ind w:left="2880" w:hanging="360"/>
-      </w:pPr>
-      <w:rPr>
-        <w:rFonts w:ascii="Symbol" w:hAnsi="Symbol" w:hint="default"/>
-      </w:rPr>
+        <w:ind w:left="3600" w:hanging="360"/>
+      </w:pPr>
     </w:lvl>
-    <w:lvl w:ilvl="4" w:tplc="40090003" w:tentative="1">
+    <w:lvl w:ilvl="5" w:tplc="4009001B" w:tentative="1">
       <w:start w:val="1"/>
-      <w:numFmt w:val="bullet"/>
-      <w:lvlText w:val="o"/>
+      <w:numFmt w:val="lowerRoman"/>
+      <w:lvlText w:val="%6."/>
+      <w:lvlJc w:val="right"/>
+      <w:pPr>
+        <w:ind w:left="4320" w:hanging="180"/>
+      </w:pPr>
+    </w:lvl>
+    <w:lvl w:ilvl="6" w:tplc="4009000F" w:tentative="1">
+      <w:start w:val="1"/>
+      <w:numFmt w:val="decimal"/>
+      <w:lvlText w:val="%7."/>
       <w:lvlJc w:val="left"/>
       <w:pPr>
-        <w:ind w:left="3600" w:hanging="360"/>
-      </w:pPr>
-      <w:rPr>
-        <w:rFonts w:ascii="Courier New" w:hAnsi="Courier New" w:cs="Courier New" w:hint="default"/>
-      </w:rPr>
+        <w:ind w:left="5040" w:hanging="360"/>
+      </w:pPr>
     </w:lvl>
-    <w:lvl w:ilvl="5" w:tplc="40090005" w:tentative="1">
+    <w:lvl w:ilvl="7" w:tplc="40090019" w:tentative="1">
       <w:start w:val="1"/>
-      <w:numFmt w:val="bullet"/>
-      <w:lvlText w:val=""/>
+      <w:numFmt w:val="lowerLetter"/>
+      <w:lvlText w:val="%8."/>
       <w:lvlJc w:val="left"/>
       <w:pPr>
-        <w:ind w:left="4320" w:hanging="360"/>
-      </w:pPr>
-      <w:rPr>
-        <w:rFonts w:ascii="Wingdings" w:hAnsi="Wingdings" w:hint="default"/>
-      </w:rPr>
+        <w:ind w:left="5760" w:hanging="360"/>
+      </w:pPr>
     </w:lvl>
-    <w:lvl w:ilvl="6" w:tplc="40090001" w:tentative="1">
+    <w:lvl w:ilvl="8" w:tplc="4009001B" w:tentative="1">
       <w:start w:val="1"/>
-      <w:numFmt w:val="bullet"/>
-      <w:lvlText w:val=""/>
-      <w:lvlJc w:val="left"/>
-      <w:pPr>
-        <w:ind w:left="5040" w:hanging="360"/>
-      </w:pPr>
-      <w:rPr>
-        <w:rFonts w:ascii="Symbol" w:hAnsi="Symbol" w:hint="default"/>
-      </w:rPr>
-    </w:lvl>
-    <w:lvl w:ilvl="7" w:tplc="40090003" w:tentative="1">
-      <w:start w:val="1"/>
-      <w:numFmt w:val="bullet"/>
-      <w:lvlText w:val="o"/>
-      <w:lvlJc w:val="left"/>
-      <w:pPr>
-        <w:ind w:left="5760" w:hanging="360"/>
-      </w:pPr>
-      <w:rPr>
-        <w:rFonts w:ascii="Courier New" w:hAnsi="Courier New" w:cs="Courier New" w:hint="default"/>
-      </w:rPr>
-    </w:lvl>
-    <w:lvl w:ilvl="8" w:tplc="40090005" w:tentative="1">
-      <w:start w:val="1"/>
-      <w:numFmt w:val="bullet"/>
-      <w:lvlText w:val=""/>
-      <w:lvlJc w:val="left"/>
-      <w:pPr>
-        <w:ind w:left="6480" w:hanging="360"/>
-      </w:pPr>
-      <w:rPr>
-        <w:rFonts w:ascii="Wingdings" w:hAnsi="Wingdings" w:hint="default"/>
-      </w:rPr>
+      <w:numFmt w:val="lowerRoman"/>
+      <w:lvlText w:val="%9."/>
+      <w:lvlJc w:val="right"/>
+      <w:pPr>
+        <w:ind w:left="6480" w:hanging="180"/>
+      </w:pPr>
     </w:lvl>
   </w:abstractNum>
-  <w:abstractNum w:abstractNumId="8" w15:restartNumberingAfterBreak="0">
-    <w:nsid w:val="66227C1A"/>
-    <w:multiLevelType w:val="hybridMultilevel"/>
-    <w:tmpl w:val="82068D66"/>
-    <w:lvl w:ilvl="0" w:tplc="40090001">
-      <w:start w:val="1"/>
-      <w:numFmt w:val="bullet"/>
-      <w:lvlText w:val=""/>
-      <w:lvlJc w:val="left"/>
-      <w:pPr>
-        <w:ind w:left="720" w:hanging="360"/>
-      </w:pPr>
-      <w:rPr>
-        <w:rFonts w:ascii="Symbol" w:hAnsi="Symbol" w:hint="default"/>
-      </w:rPr>
-    </w:lvl>
-    <w:lvl w:ilvl="1" w:tplc="40090003" w:tentative="1">
-      <w:start w:val="1"/>
-      <w:numFmt w:val="bullet"/>
-      <w:lvlText w:val="o"/>
-      <w:lvlJc w:val="left"/>
-      <w:pPr>
-        <w:ind w:left="1440" w:hanging="360"/>
-      </w:pPr>
-      <w:rPr>
-        <w:rFonts w:ascii="Courier New" w:hAnsi="Courier New" w:cs="Courier New" w:hint="default"/>
-      </w:rPr>
-    </w:lvl>
-    <w:lvl w:ilvl="2" w:tplc="40090005" w:tentative="1">
-      <w:start w:val="1"/>
-      <w:numFmt w:val="bullet"/>
-      <w:lvlText w:val=""/>
-      <w:lvlJc w:val="left"/>
-      <w:pPr>
-        <w:ind w:left="2160" w:hanging="360"/>
-      </w:pPr>
-      <w:rPr>
-        <w:rFonts w:ascii="Wingdings" w:hAnsi="Wingdings" w:hint="default"/>
-      </w:rPr>
-    </w:lvl>
-    <w:lvl w:ilvl="3" w:tplc="40090001" w:tentative="1">
-      <w:start w:val="1"/>
-      <w:numFmt w:val="bullet"/>
-      <w:lvlText w:val=""/>
-      <w:lvlJc w:val="left"/>
-      <w:pPr>
-        <w:ind w:left="2880" w:hanging="360"/>
-      </w:pPr>
-      <w:rPr>
-        <w:rFonts w:ascii="Symbol" w:hAnsi="Symbol" w:hint="default"/>
-      </w:rPr>
-    </w:lvl>
-    <w:lvl w:ilvl="4" w:tplc="40090003" w:tentative="1">
-      <w:start w:val="1"/>
-      <w:numFmt w:val="bullet"/>
-      <w:lvlText w:val="o"/>
-      <w:lvlJc w:val="left"/>
-      <w:pPr>
-        <w:ind w:left="3600" w:hanging="360"/>
-      </w:pPr>
-      <w:rPr>
-        <w:rFonts w:ascii="Courier New" w:hAnsi="Courier New" w:cs="Courier New" w:hint="default"/>
-      </w:rPr>
-    </w:lvl>
-    <w:lvl w:ilvl="5" w:tplc="40090005" w:tentative="1">
-      <w:start w:val="1"/>
-      <w:numFmt w:val="bullet"/>
-      <w:lvlText w:val=""/>
-      <w:lvlJc w:val="left"/>
-      <w:pPr>
-        <w:ind w:left="4320" w:hanging="360"/>
-      </w:pPr>
-      <w:rPr>
-        <w:rFonts w:ascii="Wingdings" w:hAnsi="Wingdings" w:hint="default"/>
-      </w:rPr>
-    </w:lvl>
-    <w:lvl w:ilvl="6" w:tplc="40090001" w:tentative="1">
-      <w:start w:val="1"/>
-      <w:numFmt w:val="bullet"/>
-      <w:lvlText w:val=""/>
-      <w:lvlJc w:val="left"/>
-      <w:pPr>
-        <w:ind w:left="5040" w:hanging="360"/>
-      </w:pPr>
-      <w:rPr>
-        <w:rFonts w:ascii="Symbol" w:hAnsi="Symbol" w:hint="default"/>
-      </w:rPr>
-    </w:lvl>
-    <w:lvl w:ilvl="7" w:tplc="40090003" w:tentative="1">
-      <w:start w:val="1"/>
-      <w:numFmt w:val="bullet"/>
-      <w:lvlText w:val="o"/>
-      <w:lvlJc w:val="left"/>
-      <w:pPr>
-        <w:ind w:left="5760" w:hanging="360"/>
-      </w:pPr>
-      <w:rPr>
-        <w:rFonts w:ascii="Courier New" w:hAnsi="Courier New" w:cs="Courier New" w:hint="default"/>
-      </w:rPr>
-    </w:lvl>
-    <w:lvl w:ilvl="8" w:tplc="40090005" w:tentative="1">
-      <w:start w:val="1"/>
-      <w:numFmt w:val="bullet"/>
-      <w:lvlText w:val=""/>
-      <w:lvlJc w:val="left"/>
-      <w:pPr>
-        <w:ind w:left="6480" w:hanging="360"/>
-      </w:pPr>
-      <w:rPr>
-        <w:rFonts w:ascii="Wingdings" w:hAnsi="Wingdings" w:hint="default"/>
-      </w:rPr>
-    </w:lvl>
-  </w:abstractNum>
-  <w:abstractNum w:abstractNumId="9" w15:restartNumberingAfterBreak="0">
-    <w:nsid w:val="6B457B84"/>
+  <w:abstractNum w:abstractNumId="7" w15:restartNumberingAfterBreak="0">
+    <w:nsid w:val="4EEA3E7B"/>
     <w:multiLevelType w:val="multilevel"/>
-    <w:tmpl w:val="83E2DB6A"/>
+    <w:tmpl w:val="5F1893DE"/>
     <w:lvl w:ilvl="0">
       <w:start w:val="1"/>
       <w:numFmt w:val="bullet"/>
@@ -11401,96 +12943,122 @@
       </w:rPr>
     </w:lvl>
   </w:abstractNum>
-  <w:abstractNum w:abstractNumId="10" w15:restartNumberingAfterBreak="0">
-    <w:nsid w:val="70AE0F10"/>
+  <w:abstractNum w:abstractNumId="8" w15:restartNumberingAfterBreak="0">
+    <w:nsid w:val="58CF4881"/>
     <w:multiLevelType w:val="hybridMultilevel"/>
-    <w:tmpl w:val="6CBE34D0"/>
-    <w:lvl w:ilvl="0" w:tplc="4009000F">
+    <w:tmpl w:val="77EE7A1C"/>
+    <w:lvl w:ilvl="0" w:tplc="D51E7008">
+      <w:numFmt w:val="bullet"/>
+      <w:lvlText w:val=""/>
+      <w:lvlJc w:val="left"/>
+      <w:pPr>
+        <w:ind w:left="720" w:hanging="360"/>
+      </w:pPr>
+      <w:rPr>
+        <w:rFonts w:ascii="Aptos" w:eastAsiaTheme="minorHAnsi" w:hAnsi="Aptos" w:cstheme="minorBidi" w:hint="default"/>
+      </w:rPr>
+    </w:lvl>
+    <w:lvl w:ilvl="1" w:tplc="40090003" w:tentative="1">
       <w:start w:val="1"/>
-      <w:numFmt w:val="decimal"/>
-      <w:lvlText w:val="%1."/>
+      <w:numFmt w:val="bullet"/>
+      <w:lvlText w:val="o"/>
       <w:lvlJc w:val="left"/>
       <w:pPr>
-        <w:ind w:left="720" w:hanging="360"/>
-      </w:pPr>
+        <w:ind w:left="1440" w:hanging="360"/>
+      </w:pPr>
+      <w:rPr>
+        <w:rFonts w:ascii="Courier New" w:hAnsi="Courier New" w:cs="Courier New" w:hint="default"/>
+      </w:rPr>
     </w:lvl>
-    <w:lvl w:ilvl="1" w:tplc="40090019" w:tentative="1">
+    <w:lvl w:ilvl="2" w:tplc="40090005" w:tentative="1">
       <w:start w:val="1"/>
-      <w:numFmt w:val="lowerLetter"/>
-      <w:lvlText w:val="%2."/>
+      <w:numFmt w:val="bullet"/>
+      <w:lvlText w:val=""/>
       <w:lvlJc w:val="left"/>
       <w:pPr>
-        <w:ind w:left="1440" w:hanging="360"/>
-      </w:pPr>
+        <w:ind w:left="2160" w:hanging="360"/>
+      </w:pPr>
+      <w:rPr>
+        <w:rFonts w:ascii="Wingdings" w:hAnsi="Wingdings" w:hint="default"/>
+      </w:rPr>
     </w:lvl>
-    <w:lvl w:ilvl="2" w:tplc="4009001B" w:tentative="1">
+    <w:lvl w:ilvl="3" w:tplc="40090001" w:tentative="1">
       <w:start w:val="1"/>
-      <w:numFmt w:val="lowerRoman"/>
-      <w:lvlText w:val="%3."/>
-      <w:lvlJc w:val="right"/>
-      <w:pPr>
-        <w:ind w:left="2160" w:hanging="180"/>
-      </w:pPr>
+      <w:numFmt w:val="bullet"/>
+      <w:lvlText w:val=""/>
+      <w:lvlJc w:val="left"/>
+      <w:pPr>
+        <w:ind w:left="2880" w:hanging="360"/>
+      </w:pPr>
+      <w:rPr>
+        <w:rFonts w:ascii="Symbol" w:hAnsi="Symbol" w:hint="default"/>
+      </w:rPr>
     </w:lvl>
-    <w:lvl w:ilvl="3" w:tplc="4009000F" w:tentative="1">
+    <w:lvl w:ilvl="4" w:tplc="40090003" w:tentative="1">
       <w:start w:val="1"/>
-      <w:numFmt w:val="decimal"/>
-      <w:lvlText w:val="%4."/>
+      <w:numFmt w:val="bullet"/>
+      <w:lvlText w:val="o"/>
       <w:lvlJc w:val="left"/>
       <w:pPr>
-        <w:ind w:left="2880" w:hanging="360"/>
-      </w:pPr>
+        <w:ind w:left="3600" w:hanging="360"/>
+      </w:pPr>
+      <w:rPr>
+        <w:rFonts w:ascii="Courier New" w:hAnsi="Courier New" w:cs="Courier New" w:hint="default"/>
+      </w:rPr>
     </w:lvl>
-    <w:lvl w:ilvl="4" w:tplc="40090019" w:tentative="1">
+    <w:lvl w:ilvl="5" w:tplc="40090005" w:tentative="1">
       <w:start w:val="1"/>
-      <w:numFmt w:val="lowerLetter"/>
-      <w:lvlText w:val="%5."/>
+      <w:numFmt w:val="bullet"/>
+      <w:lvlText w:val=""/>
       <w:lvlJc w:val="left"/>
       <w:pPr>
-        <w:ind w:left="3600" w:hanging="360"/>
-      </w:pPr>
+        <w:ind w:left="4320" w:hanging="360"/>
+      </w:pPr>
+      <w:rPr>
+        <w:rFonts w:ascii="Wingdings" w:hAnsi="Wingdings" w:hint="default"/>
+      </w:rPr>
     </w:lvl>
-    <w:lvl w:ilvl="5" w:tplc="4009001B" w:tentative="1">
+    <w:lvl w:ilvl="6" w:tplc="40090001" w:tentative="1">
       <w:start w:val="1"/>
-      <w:numFmt w:val="lowerRoman"/>
-      <w:lvlText w:val="%6."/>
-      <w:lvlJc w:val="right"/>
-      <w:pPr>
-        <w:ind w:left="4320" w:hanging="180"/>
-      </w:pPr>
+      <w:numFmt w:val="bullet"/>
+      <w:lvlText w:val=""/>
+      <w:lvlJc w:val="left"/>
+      <w:pPr>
+        <w:ind w:left="5040" w:hanging="360"/>
+      </w:pPr>
+      <w:rPr>
+        <w:rFonts w:ascii="Symbol" w:hAnsi="Symbol" w:hint="default"/>
+      </w:rPr>
     </w:lvl>
-    <w:lvl w:ilvl="6" w:tplc="4009000F" w:tentative="1">
+    <w:lvl w:ilvl="7" w:tplc="40090003" w:tentative="1">
       <w:start w:val="1"/>
-      <w:numFmt w:val="decimal"/>
-      <w:lvlText w:val="%7."/>
+      <w:numFmt w:val="bullet"/>
+      <w:lvlText w:val="o"/>
       <w:lvlJc w:val="left"/>
       <w:pPr>
-        <w:ind w:left="5040" w:hanging="360"/>
-      </w:pPr>
+        <w:ind w:left="5760" w:hanging="360"/>
+      </w:pPr>
+      <w:rPr>
+        <w:rFonts w:ascii="Courier New" w:hAnsi="Courier New" w:cs="Courier New" w:hint="default"/>
+      </w:rPr>
     </w:lvl>
-    <w:lvl w:ilvl="7" w:tplc="40090019" w:tentative="1">
+    <w:lvl w:ilvl="8" w:tplc="40090005" w:tentative="1">
       <w:start w:val="1"/>
-      <w:numFmt w:val="lowerLetter"/>
-      <w:lvlText w:val="%8."/>
+      <w:numFmt w:val="bullet"/>
+      <w:lvlText w:val=""/>
       <w:lvlJc w:val="left"/>
       <w:pPr>
-        <w:ind w:left="5760" w:hanging="360"/>
-      </w:pPr>
-    </w:lvl>
-    <w:lvl w:ilvl="8" w:tplc="4009001B" w:tentative="1">
-      <w:start w:val="1"/>
-      <w:numFmt w:val="lowerRoman"/>
-      <w:lvlText w:val="%9."/>
-      <w:lvlJc w:val="right"/>
-      <w:pPr>
-        <w:ind w:left="6480" w:hanging="180"/>
-      </w:pPr>
+        <w:ind w:left="6480" w:hanging="360"/>
+      </w:pPr>
+      <w:rPr>
+        <w:rFonts w:ascii="Wingdings" w:hAnsi="Wingdings" w:hint="default"/>
+      </w:rPr>
     </w:lvl>
   </w:abstractNum>
-  <w:abstractNum w:abstractNumId="11" w15:restartNumberingAfterBreak="0">
-    <w:nsid w:val="762F327D"/>
+  <w:abstractNum w:abstractNumId="9" w15:restartNumberingAfterBreak="0">
+    <w:nsid w:val="66227C1A"/>
     <w:multiLevelType w:val="hybridMultilevel"/>
-    <w:tmpl w:val="3F146536"/>
+    <w:tmpl w:val="82068D66"/>
     <w:lvl w:ilvl="0" w:tplc="40090001">
       <w:start w:val="1"/>
       <w:numFmt w:val="bullet"/>
@@ -11600,7 +13168,355 @@
       </w:rPr>
     </w:lvl>
   </w:abstractNum>
+  <w:abstractNum w:abstractNumId="10" w15:restartNumberingAfterBreak="0">
+    <w:nsid w:val="6B457B84"/>
+    <w:multiLevelType w:val="multilevel"/>
+    <w:tmpl w:val="83E2DB6A"/>
+    <w:lvl w:ilvl="0">
+      <w:start w:val="1"/>
+      <w:numFmt w:val="bullet"/>
+      <w:lvlText w:val=""/>
+      <w:lvlJc w:val="left"/>
+      <w:pPr>
+        <w:tabs>
+          <w:tab w:val="num" w:pos="720"/>
+        </w:tabs>
+        <w:ind w:left="720" w:hanging="360"/>
+      </w:pPr>
+      <w:rPr>
+        <w:rFonts w:ascii="Symbol" w:hAnsi="Symbol" w:hint="default"/>
+        <w:sz w:val="20"/>
+      </w:rPr>
+    </w:lvl>
+    <w:lvl w:ilvl="1" w:tentative="1">
+      <w:start w:val="1"/>
+      <w:numFmt w:val="bullet"/>
+      <w:lvlText w:val="o"/>
+      <w:lvlJc w:val="left"/>
+      <w:pPr>
+        <w:tabs>
+          <w:tab w:val="num" w:pos="1440"/>
+        </w:tabs>
+        <w:ind w:left="1440" w:hanging="360"/>
+      </w:pPr>
+      <w:rPr>
+        <w:rFonts w:ascii="Courier New" w:hAnsi="Courier New" w:hint="default"/>
+        <w:sz w:val="20"/>
+      </w:rPr>
+    </w:lvl>
+    <w:lvl w:ilvl="2" w:tentative="1">
+      <w:start w:val="1"/>
+      <w:numFmt w:val="bullet"/>
+      <w:lvlText w:val=""/>
+      <w:lvlJc w:val="left"/>
+      <w:pPr>
+        <w:tabs>
+          <w:tab w:val="num" w:pos="2160"/>
+        </w:tabs>
+        <w:ind w:left="2160" w:hanging="360"/>
+      </w:pPr>
+      <w:rPr>
+        <w:rFonts w:ascii="Wingdings" w:hAnsi="Wingdings" w:hint="default"/>
+        <w:sz w:val="20"/>
+      </w:rPr>
+    </w:lvl>
+    <w:lvl w:ilvl="3" w:tentative="1">
+      <w:start w:val="1"/>
+      <w:numFmt w:val="bullet"/>
+      <w:lvlText w:val=""/>
+      <w:lvlJc w:val="left"/>
+      <w:pPr>
+        <w:tabs>
+          <w:tab w:val="num" w:pos="2880"/>
+        </w:tabs>
+        <w:ind w:left="2880" w:hanging="360"/>
+      </w:pPr>
+      <w:rPr>
+        <w:rFonts w:ascii="Wingdings" w:hAnsi="Wingdings" w:hint="default"/>
+        <w:sz w:val="20"/>
+      </w:rPr>
+    </w:lvl>
+    <w:lvl w:ilvl="4" w:tentative="1">
+      <w:start w:val="1"/>
+      <w:numFmt w:val="bullet"/>
+      <w:lvlText w:val=""/>
+      <w:lvlJc w:val="left"/>
+      <w:pPr>
+        <w:tabs>
+          <w:tab w:val="num" w:pos="3600"/>
+        </w:tabs>
+        <w:ind w:left="3600" w:hanging="360"/>
+      </w:pPr>
+      <w:rPr>
+        <w:rFonts w:ascii="Wingdings" w:hAnsi="Wingdings" w:hint="default"/>
+        <w:sz w:val="20"/>
+      </w:rPr>
+    </w:lvl>
+    <w:lvl w:ilvl="5" w:tentative="1">
+      <w:start w:val="1"/>
+      <w:numFmt w:val="bullet"/>
+      <w:lvlText w:val=""/>
+      <w:lvlJc w:val="left"/>
+      <w:pPr>
+        <w:tabs>
+          <w:tab w:val="num" w:pos="4320"/>
+        </w:tabs>
+        <w:ind w:left="4320" w:hanging="360"/>
+      </w:pPr>
+      <w:rPr>
+        <w:rFonts w:ascii="Wingdings" w:hAnsi="Wingdings" w:hint="default"/>
+        <w:sz w:val="20"/>
+      </w:rPr>
+    </w:lvl>
+    <w:lvl w:ilvl="6" w:tentative="1">
+      <w:start w:val="1"/>
+      <w:numFmt w:val="bullet"/>
+      <w:lvlText w:val=""/>
+      <w:lvlJc w:val="left"/>
+      <w:pPr>
+        <w:tabs>
+          <w:tab w:val="num" w:pos="5040"/>
+        </w:tabs>
+        <w:ind w:left="5040" w:hanging="360"/>
+      </w:pPr>
+      <w:rPr>
+        <w:rFonts w:ascii="Wingdings" w:hAnsi="Wingdings" w:hint="default"/>
+        <w:sz w:val="20"/>
+      </w:rPr>
+    </w:lvl>
+    <w:lvl w:ilvl="7" w:tentative="1">
+      <w:start w:val="1"/>
+      <w:numFmt w:val="bullet"/>
+      <w:lvlText w:val=""/>
+      <w:lvlJc w:val="left"/>
+      <w:pPr>
+        <w:tabs>
+          <w:tab w:val="num" w:pos="5760"/>
+        </w:tabs>
+        <w:ind w:left="5760" w:hanging="360"/>
+      </w:pPr>
+      <w:rPr>
+        <w:rFonts w:ascii="Wingdings" w:hAnsi="Wingdings" w:hint="default"/>
+        <w:sz w:val="20"/>
+      </w:rPr>
+    </w:lvl>
+    <w:lvl w:ilvl="8" w:tentative="1">
+      <w:start w:val="1"/>
+      <w:numFmt w:val="bullet"/>
+      <w:lvlText w:val=""/>
+      <w:lvlJc w:val="left"/>
+      <w:pPr>
+        <w:tabs>
+          <w:tab w:val="num" w:pos="6480"/>
+        </w:tabs>
+        <w:ind w:left="6480" w:hanging="360"/>
+      </w:pPr>
+      <w:rPr>
+        <w:rFonts w:ascii="Wingdings" w:hAnsi="Wingdings" w:hint="default"/>
+        <w:sz w:val="20"/>
+      </w:rPr>
+    </w:lvl>
+  </w:abstractNum>
+  <w:abstractNum w:abstractNumId="11" w15:restartNumberingAfterBreak="0">
+    <w:nsid w:val="70AE0F10"/>
+    <w:multiLevelType w:val="hybridMultilevel"/>
+    <w:tmpl w:val="6CBE34D0"/>
+    <w:lvl w:ilvl="0" w:tplc="4009000F">
+      <w:start w:val="1"/>
+      <w:numFmt w:val="decimal"/>
+      <w:lvlText w:val="%1."/>
+      <w:lvlJc w:val="left"/>
+      <w:pPr>
+        <w:ind w:left="720" w:hanging="360"/>
+      </w:pPr>
+    </w:lvl>
+    <w:lvl w:ilvl="1" w:tplc="40090019" w:tentative="1">
+      <w:start w:val="1"/>
+      <w:numFmt w:val="lowerLetter"/>
+      <w:lvlText w:val="%2."/>
+      <w:lvlJc w:val="left"/>
+      <w:pPr>
+        <w:ind w:left="1440" w:hanging="360"/>
+      </w:pPr>
+    </w:lvl>
+    <w:lvl w:ilvl="2" w:tplc="4009001B" w:tentative="1">
+      <w:start w:val="1"/>
+      <w:numFmt w:val="lowerRoman"/>
+      <w:lvlText w:val="%3."/>
+      <w:lvlJc w:val="right"/>
+      <w:pPr>
+        <w:ind w:left="2160" w:hanging="180"/>
+      </w:pPr>
+    </w:lvl>
+    <w:lvl w:ilvl="3" w:tplc="4009000F" w:tentative="1">
+      <w:start w:val="1"/>
+      <w:numFmt w:val="decimal"/>
+      <w:lvlText w:val="%4."/>
+      <w:lvlJc w:val="left"/>
+      <w:pPr>
+        <w:ind w:left="2880" w:hanging="360"/>
+      </w:pPr>
+    </w:lvl>
+    <w:lvl w:ilvl="4" w:tplc="40090019" w:tentative="1">
+      <w:start w:val="1"/>
+      <w:numFmt w:val="lowerLetter"/>
+      <w:lvlText w:val="%5."/>
+      <w:lvlJc w:val="left"/>
+      <w:pPr>
+        <w:ind w:left="3600" w:hanging="360"/>
+      </w:pPr>
+    </w:lvl>
+    <w:lvl w:ilvl="5" w:tplc="4009001B" w:tentative="1">
+      <w:start w:val="1"/>
+      <w:numFmt w:val="lowerRoman"/>
+      <w:lvlText w:val="%6."/>
+      <w:lvlJc w:val="right"/>
+      <w:pPr>
+        <w:ind w:left="4320" w:hanging="180"/>
+      </w:pPr>
+    </w:lvl>
+    <w:lvl w:ilvl="6" w:tplc="4009000F" w:tentative="1">
+      <w:start w:val="1"/>
+      <w:numFmt w:val="decimal"/>
+      <w:lvlText w:val="%7."/>
+      <w:lvlJc w:val="left"/>
+      <w:pPr>
+        <w:ind w:left="5040" w:hanging="360"/>
+      </w:pPr>
+    </w:lvl>
+    <w:lvl w:ilvl="7" w:tplc="40090019" w:tentative="1">
+      <w:start w:val="1"/>
+      <w:numFmt w:val="lowerLetter"/>
+      <w:lvlText w:val="%8."/>
+      <w:lvlJc w:val="left"/>
+      <w:pPr>
+        <w:ind w:left="5760" w:hanging="360"/>
+      </w:pPr>
+    </w:lvl>
+    <w:lvl w:ilvl="8" w:tplc="4009001B" w:tentative="1">
+      <w:start w:val="1"/>
+      <w:numFmt w:val="lowerRoman"/>
+      <w:lvlText w:val="%9."/>
+      <w:lvlJc w:val="right"/>
+      <w:pPr>
+        <w:ind w:left="6480" w:hanging="180"/>
+      </w:pPr>
+    </w:lvl>
+  </w:abstractNum>
   <w:abstractNum w:abstractNumId="12" w15:restartNumberingAfterBreak="0">
+    <w:nsid w:val="762F327D"/>
+    <w:multiLevelType w:val="hybridMultilevel"/>
+    <w:tmpl w:val="3F146536"/>
+    <w:lvl w:ilvl="0" w:tplc="40090001">
+      <w:start w:val="1"/>
+      <w:numFmt w:val="bullet"/>
+      <w:lvlText w:val=""/>
+      <w:lvlJc w:val="left"/>
+      <w:pPr>
+        <w:ind w:left="720" w:hanging="360"/>
+      </w:pPr>
+      <w:rPr>
+        <w:rFonts w:ascii="Symbol" w:hAnsi="Symbol" w:hint="default"/>
+      </w:rPr>
+    </w:lvl>
+    <w:lvl w:ilvl="1" w:tplc="40090003" w:tentative="1">
+      <w:start w:val="1"/>
+      <w:numFmt w:val="bullet"/>
+      <w:lvlText w:val="o"/>
+      <w:lvlJc w:val="left"/>
+      <w:pPr>
+        <w:ind w:left="1440" w:hanging="360"/>
+      </w:pPr>
+      <w:rPr>
+        <w:rFonts w:ascii="Courier New" w:hAnsi="Courier New" w:cs="Courier New" w:hint="default"/>
+      </w:rPr>
+    </w:lvl>
+    <w:lvl w:ilvl="2" w:tplc="40090005" w:tentative="1">
+      <w:start w:val="1"/>
+      <w:numFmt w:val="bullet"/>
+      <w:lvlText w:val=""/>
+      <w:lvlJc w:val="left"/>
+      <w:pPr>
+        <w:ind w:left="2160" w:hanging="360"/>
+      </w:pPr>
+      <w:rPr>
+        <w:rFonts w:ascii="Wingdings" w:hAnsi="Wingdings" w:hint="default"/>
+      </w:rPr>
+    </w:lvl>
+    <w:lvl w:ilvl="3" w:tplc="40090001" w:tentative="1">
+      <w:start w:val="1"/>
+      <w:numFmt w:val="bullet"/>
+      <w:lvlText w:val=""/>
+      <w:lvlJc w:val="left"/>
+      <w:pPr>
+        <w:ind w:left="2880" w:hanging="360"/>
+      </w:pPr>
+      <w:rPr>
+        <w:rFonts w:ascii="Symbol" w:hAnsi="Symbol" w:hint="default"/>
+      </w:rPr>
+    </w:lvl>
+    <w:lvl w:ilvl="4" w:tplc="40090003" w:tentative="1">
+      <w:start w:val="1"/>
+      <w:numFmt w:val="bullet"/>
+      <w:lvlText w:val="o"/>
+      <w:lvlJc w:val="left"/>
+      <w:pPr>
+        <w:ind w:left="3600" w:hanging="360"/>
+      </w:pPr>
+      <w:rPr>
+        <w:rFonts w:ascii="Courier New" w:hAnsi="Courier New" w:cs="Courier New" w:hint="default"/>
+      </w:rPr>
+    </w:lvl>
+    <w:lvl w:ilvl="5" w:tplc="40090005" w:tentative="1">
+      <w:start w:val="1"/>
+      <w:numFmt w:val="bullet"/>
+      <w:lvlText w:val=""/>
+      <w:lvlJc w:val="left"/>
+      <w:pPr>
+        <w:ind w:left="4320" w:hanging="360"/>
+      </w:pPr>
+      <w:rPr>
+        <w:rFonts w:ascii="Wingdings" w:hAnsi="Wingdings" w:hint="default"/>
+      </w:rPr>
+    </w:lvl>
+    <w:lvl w:ilvl="6" w:tplc="40090001" w:tentative="1">
+      <w:start w:val="1"/>
+      <w:numFmt w:val="bullet"/>
+      <w:lvlText w:val=""/>
+      <w:lvlJc w:val="left"/>
+      <w:pPr>
+        <w:ind w:left="5040" w:hanging="360"/>
+      </w:pPr>
+      <w:rPr>
+        <w:rFonts w:ascii="Symbol" w:hAnsi="Symbol" w:hint="default"/>
+      </w:rPr>
+    </w:lvl>
+    <w:lvl w:ilvl="7" w:tplc="40090003" w:tentative="1">
+      <w:start w:val="1"/>
+      <w:numFmt w:val="bullet"/>
+      <w:lvlText w:val="o"/>
+      <w:lvlJc w:val="left"/>
+      <w:pPr>
+        <w:ind w:left="5760" w:hanging="360"/>
+      </w:pPr>
+      <w:rPr>
+        <w:rFonts w:ascii="Courier New" w:hAnsi="Courier New" w:cs="Courier New" w:hint="default"/>
+      </w:rPr>
+    </w:lvl>
+    <w:lvl w:ilvl="8" w:tplc="40090005" w:tentative="1">
+      <w:start w:val="1"/>
+      <w:numFmt w:val="bullet"/>
+      <w:lvlText w:val=""/>
+      <w:lvlJc w:val="left"/>
+      <w:pPr>
+        <w:ind w:left="6480" w:hanging="360"/>
+      </w:pPr>
+      <w:rPr>
+        <w:rFonts w:ascii="Wingdings" w:hAnsi="Wingdings" w:hint="default"/>
+      </w:rPr>
+    </w:lvl>
+  </w:abstractNum>
+  <w:abstractNum w:abstractNumId="13" w15:restartNumberingAfterBreak="0">
     <w:nsid w:val="7D2F44AF"/>
     <w:multiLevelType w:val="multilevel"/>
     <w:tmpl w:val="7E42130E"/>
@@ -11713,44 +13629,163 @@
       </w:pPr>
     </w:lvl>
   </w:abstractNum>
+  <w:abstractNum w:abstractNumId="14" w15:restartNumberingAfterBreak="0">
+    <w:nsid w:val="7E6D79F1"/>
+    <w:multiLevelType w:val="hybridMultilevel"/>
+    <w:tmpl w:val="ED16F040"/>
+    <w:lvl w:ilvl="0" w:tplc="40090001">
+      <w:start w:val="1"/>
+      <w:numFmt w:val="bullet"/>
+      <w:lvlText w:val=""/>
+      <w:lvlJc w:val="left"/>
+      <w:pPr>
+        <w:ind w:left="720" w:hanging="360"/>
+      </w:pPr>
+      <w:rPr>
+        <w:rFonts w:ascii="Symbol" w:hAnsi="Symbol" w:hint="default"/>
+      </w:rPr>
+    </w:lvl>
+    <w:lvl w:ilvl="1" w:tplc="40090003" w:tentative="1">
+      <w:start w:val="1"/>
+      <w:numFmt w:val="bullet"/>
+      <w:lvlText w:val="o"/>
+      <w:lvlJc w:val="left"/>
+      <w:pPr>
+        <w:ind w:left="1440" w:hanging="360"/>
+      </w:pPr>
+      <w:rPr>
+        <w:rFonts w:ascii="Courier New" w:hAnsi="Courier New" w:cs="Courier New" w:hint="default"/>
+      </w:rPr>
+    </w:lvl>
+    <w:lvl w:ilvl="2" w:tplc="40090005" w:tentative="1">
+      <w:start w:val="1"/>
+      <w:numFmt w:val="bullet"/>
+      <w:lvlText w:val=""/>
+      <w:lvlJc w:val="left"/>
+      <w:pPr>
+        <w:ind w:left="2160" w:hanging="360"/>
+      </w:pPr>
+      <w:rPr>
+        <w:rFonts w:ascii="Wingdings" w:hAnsi="Wingdings" w:hint="default"/>
+      </w:rPr>
+    </w:lvl>
+    <w:lvl w:ilvl="3" w:tplc="40090001" w:tentative="1">
+      <w:start w:val="1"/>
+      <w:numFmt w:val="bullet"/>
+      <w:lvlText w:val=""/>
+      <w:lvlJc w:val="left"/>
+      <w:pPr>
+        <w:ind w:left="2880" w:hanging="360"/>
+      </w:pPr>
+      <w:rPr>
+        <w:rFonts w:ascii="Symbol" w:hAnsi="Symbol" w:hint="default"/>
+      </w:rPr>
+    </w:lvl>
+    <w:lvl w:ilvl="4" w:tplc="40090003" w:tentative="1">
+      <w:start w:val="1"/>
+      <w:numFmt w:val="bullet"/>
+      <w:lvlText w:val="o"/>
+      <w:lvlJc w:val="left"/>
+      <w:pPr>
+        <w:ind w:left="3600" w:hanging="360"/>
+      </w:pPr>
+      <w:rPr>
+        <w:rFonts w:ascii="Courier New" w:hAnsi="Courier New" w:cs="Courier New" w:hint="default"/>
+      </w:rPr>
+    </w:lvl>
+    <w:lvl w:ilvl="5" w:tplc="40090005" w:tentative="1">
+      <w:start w:val="1"/>
+      <w:numFmt w:val="bullet"/>
+      <w:lvlText w:val=""/>
+      <w:lvlJc w:val="left"/>
+      <w:pPr>
+        <w:ind w:left="4320" w:hanging="360"/>
+      </w:pPr>
+      <w:rPr>
+        <w:rFonts w:ascii="Wingdings" w:hAnsi="Wingdings" w:hint="default"/>
+      </w:rPr>
+    </w:lvl>
+    <w:lvl w:ilvl="6" w:tplc="40090001" w:tentative="1">
+      <w:start w:val="1"/>
+      <w:numFmt w:val="bullet"/>
+      <w:lvlText w:val=""/>
+      <w:lvlJc w:val="left"/>
+      <w:pPr>
+        <w:ind w:left="5040" w:hanging="360"/>
+      </w:pPr>
+      <w:rPr>
+        <w:rFonts w:ascii="Symbol" w:hAnsi="Symbol" w:hint="default"/>
+      </w:rPr>
+    </w:lvl>
+    <w:lvl w:ilvl="7" w:tplc="40090003" w:tentative="1">
+      <w:start w:val="1"/>
+      <w:numFmt w:val="bullet"/>
+      <w:lvlText w:val="o"/>
+      <w:lvlJc w:val="left"/>
+      <w:pPr>
+        <w:ind w:left="5760" w:hanging="360"/>
+      </w:pPr>
+      <w:rPr>
+        <w:rFonts w:ascii="Courier New" w:hAnsi="Courier New" w:cs="Courier New" w:hint="default"/>
+      </w:rPr>
+    </w:lvl>
+    <w:lvl w:ilvl="8" w:tplc="40090005" w:tentative="1">
+      <w:start w:val="1"/>
+      <w:numFmt w:val="bullet"/>
+      <w:lvlText w:val=""/>
+      <w:lvlJc w:val="left"/>
+      <w:pPr>
+        <w:ind w:left="6480" w:hanging="360"/>
+      </w:pPr>
+      <w:rPr>
+        <w:rFonts w:ascii="Wingdings" w:hAnsi="Wingdings" w:hint="default"/>
+      </w:rPr>
+    </w:lvl>
+  </w:abstractNum>
   <w:num w:numId="1" w16cid:durableId="1732650367">
-    <w:abstractNumId w:val="3"/>
+    <w:abstractNumId w:val="4"/>
   </w:num>
   <w:num w:numId="2" w16cid:durableId="1496343170">
-    <w:abstractNumId w:val="7"/>
+    <w:abstractNumId w:val="8"/>
   </w:num>
   <w:num w:numId="3" w16cid:durableId="49767029">
-    <w:abstractNumId w:val="10"/>
+    <w:abstractNumId w:val="11"/>
   </w:num>
   <w:num w:numId="4" w16cid:durableId="374893099">
     <w:abstractNumId w:val="1"/>
   </w:num>
   <w:num w:numId="5" w16cid:durableId="1740667314">
-    <w:abstractNumId w:val="8"/>
+    <w:abstractNumId w:val="9"/>
   </w:num>
   <w:num w:numId="6" w16cid:durableId="211429764">
-    <w:abstractNumId w:val="11"/>
+    <w:abstractNumId w:val="12"/>
   </w:num>
   <w:num w:numId="7" w16cid:durableId="205803120">
-    <w:abstractNumId w:val="5"/>
+    <w:abstractNumId w:val="6"/>
   </w:num>
   <w:num w:numId="8" w16cid:durableId="1639070327">
-    <w:abstractNumId w:val="4"/>
+    <w:abstractNumId w:val="5"/>
   </w:num>
   <w:num w:numId="9" w16cid:durableId="623119324">
     <w:abstractNumId w:val="0"/>
   </w:num>
   <w:num w:numId="10" w16cid:durableId="393817826">
+    <w:abstractNumId w:val="3"/>
+  </w:num>
+  <w:num w:numId="11" w16cid:durableId="2122912253">
+    <w:abstractNumId w:val="10"/>
+  </w:num>
+  <w:num w:numId="12" w16cid:durableId="553346507">
+    <w:abstractNumId w:val="13"/>
+  </w:num>
+  <w:num w:numId="13" w16cid:durableId="467816780">
+    <w:abstractNumId w:val="7"/>
+  </w:num>
+  <w:num w:numId="14" w16cid:durableId="2050490527">
     <w:abstractNumId w:val="2"/>
   </w:num>
-  <w:num w:numId="11" w16cid:durableId="2122912253">
-    <w:abstractNumId w:val="9"/>
-  </w:num>
-  <w:num w:numId="12" w16cid:durableId="553346507">
-    <w:abstractNumId w:val="12"/>
-  </w:num>
-  <w:num w:numId="13" w16cid:durableId="467816780">
-    <w:abstractNumId w:val="6"/>
+  <w:num w:numId="15" w16cid:durableId="1470320644">
+    <w:abstractNumId w:val="14"/>
   </w:num>
 </w:numbering>
 </file>
@@ -12358,7 +14393,6 @@
   <w:style w:type="character" w:default="1" w:styleId="DefaultParagraphFont">
     <w:name w:val="Default Paragraph Font"/>
     <w:uiPriority w:val="1"/>
-    <w:semiHidden/>
     <w:unhideWhenUsed/>
   </w:style>
   <w:style w:type="table" w:default="1" w:styleId="TableNormal">

</xml_diff>

<commit_message>
Day 4: Notes and work uploaded
</commit_message>
<xml_diff>
--- a/notes/AGENTIC AI DAILY WORK.docx
+++ b/notes/AGENTIC AI DAILY WORK.docx
@@ -11502,17 +11502,7 @@
           <w:sz w:val="24"/>
           <w:szCs w:val="24"/>
         </w:rPr>
-        <w:t>S</w:t>
-      </w:r>
-      <w:r>
-        <w:rPr>
-          <w:rFonts w:ascii="Aptos" w:hAnsi="Aptos"/>
-          <w:b/>
-          <w:bCs/>
-          <w:sz w:val="24"/>
-          <w:szCs w:val="24"/>
-        </w:rPr>
-        <w:t>tatic method</w:t>
+        <w:t>Static method</w:t>
       </w:r>
       <w:r>
         <w:rPr>
@@ -12350,7 +12340,7 @@
           <w:szCs w:val="24"/>
         </w:rPr>
         <w:pict w14:anchorId="02D43AE5">
-          <v:rect id="_x0000_i1057" style="width:0;height:1.5pt" o:hralign="center" o:hrstd="t" o:hr="t" fillcolor="#a0a0a0" stroked="f"/>
+          <v:rect id="_x0000_i1027" style="width:0;height:1.5pt" o:hralign="center" o:hrstd="t" o:hr="t" fillcolor="#a0a0a0" stroked="f"/>
         </w:pict>
       </w:r>
     </w:p>
@@ -12453,7 +12443,7 @@
           <w:szCs w:val="24"/>
         </w:rPr>
         <w:pict w14:anchorId="22E4273A">
-          <v:rect id="_x0000_i1058" style="width:0;height:1.5pt" o:hralign="center" o:hrstd="t" o:hr="t" fillcolor="#a0a0a0" stroked="f"/>
+          <v:rect id="_x0000_i1028" style="width:0;height:1.5pt" o:hralign="center" o:hrstd="t" o:hr="t" fillcolor="#a0a0a0" stroked="f"/>
         </w:pict>
       </w:r>
     </w:p>
@@ -13376,7 +13366,7 @@
           <w:szCs w:val="24"/>
         </w:rPr>
         <w:pict w14:anchorId="0074E919">
-          <v:rect id="_x0000_i1212" style="width:0;height:1.5pt" o:hralign="center" o:hrstd="t" o:hr="t" fillcolor="#a0a0a0" stroked="f"/>
+          <v:rect id="_x0000_i1029" style="width:0;height:1.5pt" o:hralign="center" o:hrstd="t" o:hr="t" fillcolor="#a0a0a0" stroked="f"/>
         </w:pict>
       </w:r>
     </w:p>
@@ -13747,7 +13737,7 @@
           <w:szCs w:val="24"/>
         </w:rPr>
         <w:pict w14:anchorId="66082167">
-          <v:rect id="_x0000_i1178" style="width:0;height:1.5pt" o:hralign="center" o:hrstd="t" o:hr="t" fillcolor="#a0a0a0" stroked="f"/>
+          <v:rect id="_x0000_i1030" style="width:0;height:1.5pt" o:hralign="center" o:hrstd="t" o:hr="t" fillcolor="#a0a0a0" stroked="f"/>
         </w:pict>
       </w:r>
     </w:p>
@@ -13943,7 +13933,7 @@
           <w:szCs w:val="24"/>
         </w:rPr>
         <w:pict w14:anchorId="60F65355">
-          <v:rect id="_x0000_i1179" style="width:0;height:1.5pt" o:hralign="center" o:hrstd="t" o:hr="t" fillcolor="#a0a0a0" stroked="f"/>
+          <v:rect id="_x0000_i1031" style="width:0;height:1.5pt" o:hralign="center" o:hrstd="t" o:hr="t" fillcolor="#a0a0a0" stroked="f"/>
         </w:pict>
       </w:r>
     </w:p>
@@ -14018,7 +14008,7 @@
           <w:szCs w:val="24"/>
         </w:rPr>
         <w:pict w14:anchorId="64E7BD0B">
-          <v:rect id="_x0000_i1180" style="width:0;height:1.5pt" o:hralign="center" o:hrstd="t" o:hr="t" fillcolor="#a0a0a0" stroked="f"/>
+          <v:rect id="_x0000_i1032" style="width:0;height:1.5pt" o:hralign="center" o:hrstd="t" o:hr="t" fillcolor="#a0a0a0" stroked="f"/>
         </w:pict>
       </w:r>
     </w:p>
@@ -14303,6 +14293,1536 @@
           <w:szCs w:val="24"/>
         </w:rPr>
       </w:pPr>
+    </w:p>
+    <w:p>
+      <w:pPr>
+        <w:rPr>
+          <w:rFonts w:ascii="Aptos" w:hAnsi="Aptos"/>
+          <w:b/>
+          <w:bCs/>
+          <w:color w:val="0070C0"/>
+          <w:sz w:val="24"/>
+          <w:szCs w:val="24"/>
+        </w:rPr>
+      </w:pPr>
+      <w:r>
+        <w:rPr>
+          <w:rFonts w:ascii="Aptos" w:hAnsi="Aptos"/>
+          <w:b/>
+          <w:bCs/>
+          <w:color w:val="0070C0"/>
+          <w:sz w:val="24"/>
+          <w:szCs w:val="24"/>
+        </w:rPr>
+        <w:t>Day 4</w:t>
+      </w:r>
+    </w:p>
+    <w:p>
+      <w:pPr>
+        <w:rPr>
+          <w:rFonts w:ascii="Aptos" w:hAnsi="Aptos"/>
+          <w:sz w:val="24"/>
+          <w:szCs w:val="24"/>
+        </w:rPr>
+      </w:pPr>
+      <w:r>
+        <w:rPr>
+          <w:rFonts w:ascii="Aptos" w:hAnsi="Aptos"/>
+          <w:b/>
+          <w:bCs/>
+          <w:sz w:val="24"/>
+          <w:szCs w:val="24"/>
+        </w:rPr>
+        <w:t>Structured outputs</w:t>
+      </w:r>
+      <w:r>
+        <w:rPr>
+          <w:rFonts w:ascii="Aptos" w:hAnsi="Aptos"/>
+          <w:sz w:val="24"/>
+          <w:szCs w:val="24"/>
+        </w:rPr>
+        <w:t xml:space="preserve"> refer to forcing an LLM to return data in a strict, predefined schema—like JSON or a </w:t>
+      </w:r>
+      <w:proofErr w:type="spellStart"/>
+      <w:r>
+        <w:rPr>
+          <w:rFonts w:ascii="Aptos" w:hAnsi="Aptos"/>
+          <w:sz w:val="24"/>
+          <w:szCs w:val="24"/>
+        </w:rPr>
+        <w:t>Pydantic</w:t>
+      </w:r>
+      <w:proofErr w:type="spellEnd"/>
+      <w:r>
+        <w:rPr>
+          <w:rFonts w:ascii="Aptos" w:hAnsi="Aptos"/>
+          <w:sz w:val="24"/>
+          <w:szCs w:val="24"/>
+        </w:rPr>
+        <w:t xml:space="preserve"> object—instead of free-form natural language.</w:t>
+      </w:r>
+    </w:p>
+    <w:p>
+      <w:pPr>
+        <w:rPr>
+          <w:rFonts w:ascii="Aptos" w:hAnsi="Aptos"/>
+          <w:sz w:val="24"/>
+          <w:szCs w:val="24"/>
+        </w:rPr>
+      </w:pPr>
+      <w:r>
+        <w:rPr>
+          <w:rFonts w:ascii="Aptos" w:hAnsi="Aptos"/>
+          <w:sz w:val="24"/>
+          <w:szCs w:val="24"/>
+        </w:rPr>
+        <w:lastRenderedPageBreak/>
+        <w:t>Without structured outputs, agents frequently fail because they hallucinate field names or output malformed text that breaks downstream code.</w:t>
+      </w:r>
+    </w:p>
+    <w:p>
+      <w:pPr>
+        <w:rPr>
+          <w:rFonts w:ascii="Aptos" w:hAnsi="Aptos"/>
+          <w:sz w:val="24"/>
+          <w:szCs w:val="24"/>
+        </w:rPr>
+      </w:pPr>
+      <w:r>
+        <w:rPr>
+          <w:rFonts w:ascii="Aptos" w:hAnsi="Aptos"/>
+          <w:sz w:val="24"/>
+          <w:szCs w:val="24"/>
+        </w:rPr>
+        <w:t>Without structured outputs, agents frequently fail because they hallucinate field names or output malformed text that breaks downstream code</w:t>
+      </w:r>
+    </w:p>
+    <w:p>
+      <w:pPr>
+        <w:pStyle w:val="ListParagraph"/>
+        <w:numPr>
+          <w:ilvl w:val="0"/>
+          <w:numId w:val="20"/>
+        </w:numPr>
+        <w:rPr>
+          <w:rFonts w:ascii="Aptos" w:hAnsi="Aptos"/>
+          <w:sz w:val="24"/>
+          <w:szCs w:val="24"/>
+        </w:rPr>
+      </w:pPr>
+      <w:r>
+        <w:rPr>
+          <w:rFonts w:ascii="Aptos" w:hAnsi="Aptos"/>
+          <w:sz w:val="24"/>
+          <w:szCs w:val="24"/>
+        </w:rPr>
+        <w:t>Normally, an AI talks back to you in regular sentences, like a human.</w:t>
+      </w:r>
+    </w:p>
+    <w:p>
+      <w:pPr>
+        <w:pStyle w:val="ListParagraph"/>
+        <w:numPr>
+          <w:ilvl w:val="0"/>
+          <w:numId w:val="20"/>
+        </w:numPr>
+        <w:rPr>
+          <w:rFonts w:ascii="Aptos" w:hAnsi="Aptos"/>
+          <w:sz w:val="24"/>
+          <w:szCs w:val="24"/>
+        </w:rPr>
+      </w:pPr>
+      <w:r>
+        <w:rPr>
+          <w:rFonts w:ascii="Aptos" w:hAnsi="Aptos"/>
+          <w:sz w:val="24"/>
+          <w:szCs w:val="24"/>
+        </w:rPr>
+        <w:t>Structured output means forcing the AI to fill out a rigid digital form instead.</w:t>
+      </w:r>
+    </w:p>
+    <w:p>
+      <w:pPr>
+        <w:pStyle w:val="ListParagraph"/>
+        <w:numPr>
+          <w:ilvl w:val="0"/>
+          <w:numId w:val="20"/>
+        </w:numPr>
+        <w:rPr>
+          <w:rFonts w:ascii="Aptos" w:hAnsi="Aptos"/>
+          <w:sz w:val="24"/>
+          <w:szCs w:val="24"/>
+        </w:rPr>
+      </w:pPr>
+      <w:r>
+        <w:rPr>
+          <w:rFonts w:ascii="Aptos" w:hAnsi="Aptos"/>
+          <w:sz w:val="24"/>
+          <w:szCs w:val="24"/>
+        </w:rPr>
+        <w:t>It answers only in clean, organized code blocks (like a checklist or a table).</w:t>
+      </w:r>
+    </w:p>
+    <w:p>
+      <w:pPr>
+        <w:pStyle w:val="ListParagraph"/>
+        <w:numPr>
+          <w:ilvl w:val="0"/>
+          <w:numId w:val="20"/>
+        </w:numPr>
+        <w:rPr>
+          <w:rFonts w:ascii="Aptos" w:hAnsi="Aptos"/>
+          <w:sz w:val="24"/>
+          <w:szCs w:val="24"/>
+        </w:rPr>
+      </w:pPr>
+      <w:r>
+        <w:rPr>
+          <w:rFonts w:ascii="Aptos" w:hAnsi="Aptos"/>
+          <w:sz w:val="24"/>
+          <w:szCs w:val="24"/>
+        </w:rPr>
+        <w:t>This makes it easy for a regular computer program to read the AI's answer without getting confused.</w:t>
+      </w:r>
+    </w:p>
+    <w:p>
+      <w:pPr>
+        <w:rPr>
+          <w:rFonts w:ascii="Aptos" w:hAnsi="Aptos"/>
+          <w:sz w:val="24"/>
+          <w:szCs w:val="24"/>
+        </w:rPr>
+      </w:pPr>
+    </w:p>
+    <w:p>
+      <w:pPr>
+        <w:rPr>
+          <w:rFonts w:ascii="Aptos" w:hAnsi="Aptos"/>
+          <w:b/>
+          <w:bCs/>
+          <w:sz w:val="24"/>
+          <w:szCs w:val="24"/>
+        </w:rPr>
+      </w:pPr>
+      <w:r>
+        <w:rPr>
+          <w:rFonts w:ascii="Aptos" w:hAnsi="Aptos"/>
+          <w:b/>
+          <w:bCs/>
+          <w:sz w:val="24"/>
+          <w:szCs w:val="24"/>
+        </w:rPr>
+        <w:t>Why are they critical for AI Agents?</w:t>
+      </w:r>
+    </w:p>
+    <w:p>
+      <w:pPr>
+        <w:numPr>
+          <w:ilvl w:val="0"/>
+          <w:numId w:val="22"/>
+        </w:numPr>
+        <w:rPr>
+          <w:rFonts w:ascii="Aptos" w:hAnsi="Aptos"/>
+          <w:sz w:val="24"/>
+          <w:szCs w:val="24"/>
+        </w:rPr>
+      </w:pPr>
+      <w:r>
+        <w:rPr>
+          <w:rFonts w:ascii="Aptos" w:hAnsi="Aptos"/>
+          <w:sz w:val="24"/>
+          <w:szCs w:val="24"/>
+        </w:rPr>
+        <w:t xml:space="preserve">AI agents don't just talk; they </w:t>
+      </w:r>
+      <w:r>
+        <w:rPr>
+          <w:rFonts w:ascii="Aptos" w:hAnsi="Aptos"/>
+          <w:i/>
+          <w:iCs/>
+          <w:sz w:val="24"/>
+          <w:szCs w:val="24"/>
+        </w:rPr>
+        <w:t>do things</w:t>
+      </w:r>
+      <w:r>
+        <w:rPr>
+          <w:rFonts w:ascii="Aptos" w:hAnsi="Aptos"/>
+          <w:sz w:val="24"/>
+          <w:szCs w:val="24"/>
+        </w:rPr>
+        <w:t xml:space="preserve"> like booking flights or updating spreadsheets.</w:t>
+      </w:r>
+    </w:p>
+    <w:p>
+      <w:pPr>
+        <w:numPr>
+          <w:ilvl w:val="0"/>
+          <w:numId w:val="22"/>
+        </w:numPr>
+        <w:rPr>
+          <w:rFonts w:ascii="Aptos" w:hAnsi="Aptos"/>
+          <w:sz w:val="24"/>
+          <w:szCs w:val="24"/>
+        </w:rPr>
+      </w:pPr>
+      <w:r>
+        <w:rPr>
+          <w:rFonts w:ascii="Aptos" w:hAnsi="Aptos"/>
+          <w:sz w:val="24"/>
+          <w:szCs w:val="24"/>
+        </w:rPr>
+        <w:t>Regular computer code is strict; it breaks if a single comma or word is misplaced.</w:t>
+      </w:r>
+    </w:p>
+    <w:p>
+      <w:pPr>
+        <w:numPr>
+          <w:ilvl w:val="0"/>
+          <w:numId w:val="22"/>
+        </w:numPr>
+        <w:rPr>
+          <w:rFonts w:ascii="Aptos" w:hAnsi="Aptos"/>
+          <w:sz w:val="24"/>
+          <w:szCs w:val="24"/>
+        </w:rPr>
+      </w:pPr>
+      <w:r>
+        <w:rPr>
+          <w:rFonts w:ascii="Aptos" w:hAnsi="Aptos"/>
+          <w:sz w:val="24"/>
+          <w:szCs w:val="24"/>
+        </w:rPr>
+        <w:t>If an AI talks in free text, the computer code won't understand what action to take.</w:t>
+      </w:r>
+    </w:p>
+    <w:p>
+      <w:pPr>
+        <w:numPr>
+          <w:ilvl w:val="0"/>
+          <w:numId w:val="22"/>
+        </w:numPr>
+        <w:rPr>
+          <w:rFonts w:ascii="Aptos" w:hAnsi="Aptos"/>
+          <w:sz w:val="24"/>
+          <w:szCs w:val="24"/>
+        </w:rPr>
+      </w:pPr>
+      <w:r>
+        <w:rPr>
+          <w:rFonts w:ascii="Aptos" w:hAnsi="Aptos"/>
+          <w:sz w:val="24"/>
+          <w:szCs w:val="24"/>
+        </w:rPr>
+        <w:t>Structured outputs act as a translator, turning the AI's thoughts into exact instructions that regular software can execute without crashing.</w:t>
+      </w:r>
+    </w:p>
+    <w:p>
+      <w:pPr>
+        <w:rPr>
+          <w:rFonts w:ascii="Aptos" w:hAnsi="Aptos"/>
+          <w:sz w:val="24"/>
+          <w:szCs w:val="24"/>
+        </w:rPr>
+      </w:pPr>
+    </w:p>
+    <w:p>
+      <w:pPr>
+        <w:rPr>
+          <w:rFonts w:ascii="Aptos" w:hAnsi="Aptos"/>
+          <w:b/>
+          <w:bCs/>
+          <w:sz w:val="24"/>
+          <w:szCs w:val="24"/>
+        </w:rPr>
+      </w:pPr>
+      <w:r>
+        <w:rPr>
+          <w:rFonts w:ascii="Aptos" w:hAnsi="Aptos"/>
+          <w:b/>
+          <w:bCs/>
+          <w:sz w:val="24"/>
+          <w:szCs w:val="24"/>
+        </w:rPr>
+        <w:t>Can you give me a real-world example?</w:t>
+      </w:r>
+    </w:p>
+    <w:p>
+      <w:pPr>
+        <w:numPr>
+          <w:ilvl w:val="0"/>
+          <w:numId w:val="23"/>
+        </w:numPr>
+        <w:rPr>
+          <w:rFonts w:ascii="Aptos" w:hAnsi="Aptos"/>
+          <w:sz w:val="24"/>
+          <w:szCs w:val="24"/>
+        </w:rPr>
+      </w:pPr>
+      <w:r>
+        <w:rPr>
+          <w:rFonts w:ascii="Aptos" w:hAnsi="Aptos"/>
+          <w:sz w:val="24"/>
+          <w:szCs w:val="24"/>
+        </w:rPr>
+        <w:t>Imagine an AI that reads customer complaint emails.</w:t>
+      </w:r>
+    </w:p>
+    <w:p>
+      <w:pPr>
+        <w:numPr>
+          <w:ilvl w:val="0"/>
+          <w:numId w:val="23"/>
+        </w:numPr>
+        <w:rPr>
+          <w:rFonts w:ascii="Aptos" w:hAnsi="Aptos"/>
+          <w:sz w:val="24"/>
+          <w:szCs w:val="24"/>
+        </w:rPr>
+      </w:pPr>
+      <w:r>
+        <w:rPr>
+          <w:rFonts w:ascii="Aptos" w:hAnsi="Aptos"/>
+          <w:sz w:val="24"/>
+          <w:szCs w:val="24"/>
+        </w:rPr>
+        <w:t>Instead of writing a long summary, the AI outputs a neat form: Urgency: High, Topic: Refund, Customer ID: 12345.</w:t>
+      </w:r>
+    </w:p>
+    <w:p>
+      <w:pPr>
+        <w:numPr>
+          <w:ilvl w:val="0"/>
+          <w:numId w:val="23"/>
+        </w:numPr>
+        <w:rPr>
+          <w:rFonts w:ascii="Aptos" w:hAnsi="Aptos"/>
+          <w:sz w:val="24"/>
+          <w:szCs w:val="24"/>
+        </w:rPr>
+      </w:pPr>
+      <w:r>
+        <w:rPr>
+          <w:rFonts w:ascii="Aptos" w:hAnsi="Aptos"/>
+          <w:sz w:val="24"/>
+          <w:szCs w:val="24"/>
+        </w:rPr>
+        <w:t>Because the data is so clean, the system can instantly pass the complaint to the billing team without a human needing to read it first.</w:t>
+      </w:r>
+    </w:p>
+    <w:p>
+      <w:pPr>
+        <w:rPr>
+          <w:rFonts w:ascii="Aptos" w:hAnsi="Aptos"/>
+          <w:sz w:val="24"/>
+          <w:szCs w:val="24"/>
+        </w:rPr>
+      </w:pPr>
+    </w:p>
+    <w:p>
+      <w:pPr>
+        <w:rPr>
+          <w:rFonts w:ascii="Aptos" w:hAnsi="Aptos"/>
+          <w:b/>
+          <w:bCs/>
+          <w:sz w:val="24"/>
+          <w:szCs w:val="24"/>
+        </w:rPr>
+      </w:pPr>
+      <w:r>
+        <w:rPr>
+          <w:rFonts w:ascii="Aptos" w:hAnsi="Aptos"/>
+          <w:b/>
+          <w:bCs/>
+          <w:sz w:val="24"/>
+          <w:szCs w:val="24"/>
+        </w:rPr>
+        <w:t>How do you actually make the AI do this?</w:t>
+      </w:r>
+    </w:p>
+    <w:p>
+      <w:pPr>
+        <w:numPr>
+          <w:ilvl w:val="0"/>
+          <w:numId w:val="24"/>
+        </w:numPr>
+        <w:rPr>
+          <w:rFonts w:ascii="Aptos" w:hAnsi="Aptos"/>
+          <w:sz w:val="24"/>
+          <w:szCs w:val="24"/>
+        </w:rPr>
+      </w:pPr>
+      <w:r>
+        <w:rPr>
+          <w:rFonts w:ascii="Aptos" w:hAnsi="Aptos"/>
+          <w:sz w:val="24"/>
+          <w:szCs w:val="24"/>
+        </w:rPr>
+        <w:t xml:space="preserve">You don't just ask the AI nicely in a prompt (e.g., </w:t>
+      </w:r>
+      <w:r>
+        <w:rPr>
+          <w:rFonts w:ascii="Aptos" w:hAnsi="Aptos"/>
+          <w:i/>
+          <w:iCs/>
+          <w:sz w:val="24"/>
+          <w:szCs w:val="24"/>
+        </w:rPr>
+        <w:t>"Please give me JSON"</w:t>
+      </w:r>
+      <w:r>
+        <w:rPr>
+          <w:rFonts w:ascii="Aptos" w:hAnsi="Aptos"/>
+          <w:sz w:val="24"/>
+          <w:szCs w:val="24"/>
+        </w:rPr>
+        <w:t>), because the AI might forget or make a mistake.</w:t>
+      </w:r>
+    </w:p>
+    <w:p>
+      <w:pPr>
+        <w:numPr>
+          <w:ilvl w:val="0"/>
+          <w:numId w:val="24"/>
+        </w:numPr>
+        <w:rPr>
+          <w:rFonts w:ascii="Aptos" w:hAnsi="Aptos"/>
+          <w:sz w:val="24"/>
+          <w:szCs w:val="24"/>
+        </w:rPr>
+      </w:pPr>
+      <w:r>
+        <w:rPr>
+          <w:rFonts w:ascii="Aptos" w:hAnsi="Aptos"/>
+          <w:sz w:val="24"/>
+          <w:szCs w:val="24"/>
+        </w:rPr>
+        <w:t xml:space="preserve">Instead, you use special coding tools (like </w:t>
+      </w:r>
+      <w:proofErr w:type="spellStart"/>
+      <w:r>
+        <w:rPr>
+          <w:rFonts w:ascii="Aptos" w:hAnsi="Aptos"/>
+          <w:sz w:val="24"/>
+          <w:szCs w:val="24"/>
+        </w:rPr>
+        <w:t>Pydantic</w:t>
+      </w:r>
+      <w:proofErr w:type="spellEnd"/>
+      <w:r>
+        <w:rPr>
+          <w:rFonts w:ascii="Aptos" w:hAnsi="Aptos"/>
+          <w:sz w:val="24"/>
+          <w:szCs w:val="24"/>
+        </w:rPr>
+        <w:t xml:space="preserve"> or JSON</w:t>
+      </w:r>
+      <w:r>
+        <w:rPr>
+          <w:rFonts w:ascii="Aptos" w:hAnsi="Aptos"/>
+          <w:sz w:val="24"/>
+          <w:szCs w:val="24"/>
+        </w:rPr>
+        <w:t>) to build a blueprint of the exact form you want.</w:t>
+      </w:r>
+    </w:p>
+    <w:p>
+      <w:pPr>
+        <w:numPr>
+          <w:ilvl w:val="0"/>
+          <w:numId w:val="24"/>
+        </w:numPr>
+        <w:rPr>
+          <w:rFonts w:ascii="Aptos" w:hAnsi="Aptos"/>
+          <w:sz w:val="24"/>
+          <w:szCs w:val="24"/>
+        </w:rPr>
+      </w:pPr>
+      <w:r>
+        <w:rPr>
+          <w:rFonts w:ascii="Aptos" w:hAnsi="Aptos"/>
+          <w:sz w:val="24"/>
+          <w:szCs w:val="24"/>
+        </w:rPr>
+        <w:t>You lock the AI into this blueprint using its backend settings.</w:t>
+      </w:r>
+    </w:p>
+    <w:p>
+      <w:pPr>
+        <w:numPr>
+          <w:ilvl w:val="0"/>
+          <w:numId w:val="24"/>
+        </w:numPr>
+        <w:rPr>
+          <w:rFonts w:ascii="Aptos" w:hAnsi="Aptos"/>
+          <w:sz w:val="24"/>
+          <w:szCs w:val="24"/>
+        </w:rPr>
+      </w:pPr>
+      <w:r>
+        <w:rPr>
+          <w:rFonts w:ascii="Aptos" w:hAnsi="Aptos"/>
+          <w:sz w:val="24"/>
+          <w:szCs w:val="24"/>
+        </w:rPr>
+        <w:lastRenderedPageBreak/>
+        <w:t>This literally blocks the AI from speaking in normal paragraphs, forcing it to follow your template.</w:t>
+      </w:r>
+    </w:p>
+    <w:p>
+      <w:pPr>
+        <w:rPr>
+          <w:rFonts w:ascii="Aptos" w:hAnsi="Aptos"/>
+          <w:sz w:val="24"/>
+          <w:szCs w:val="24"/>
+        </w:rPr>
+      </w:pPr>
+    </w:p>
+    <w:p>
+      <w:pPr>
+        <w:rPr>
+          <w:rFonts w:ascii="Aptos" w:hAnsi="Aptos"/>
+          <w:sz w:val="24"/>
+          <w:szCs w:val="24"/>
+        </w:rPr>
+      </w:pPr>
+      <w:r>
+        <w:rPr>
+          <w:rFonts w:ascii="Aptos" w:hAnsi="Aptos"/>
+          <w:b/>
+          <w:bCs/>
+          <w:sz w:val="24"/>
+          <w:szCs w:val="24"/>
+        </w:rPr>
+        <w:t>Response Schema</w:t>
+      </w:r>
+      <w:r>
+        <w:rPr>
+          <w:rFonts w:ascii="Aptos" w:hAnsi="Aptos"/>
+          <w:sz w:val="24"/>
+          <w:szCs w:val="24"/>
+        </w:rPr>
+        <w:t xml:space="preserve"> is the exact blueprint or template you give to an AI to tell it how to format its final answer.</w:t>
+      </w:r>
+    </w:p>
+    <w:p>
+      <w:pPr>
+        <w:rPr>
+          <w:rFonts w:ascii="Aptos" w:hAnsi="Aptos"/>
+          <w:sz w:val="24"/>
+          <w:szCs w:val="24"/>
+        </w:rPr>
+      </w:pPr>
+      <w:r>
+        <w:rPr>
+          <w:rFonts w:ascii="Aptos" w:hAnsi="Aptos"/>
+          <w:sz w:val="24"/>
+          <w:szCs w:val="24"/>
+        </w:rPr>
+        <w:t>Working:</w:t>
+      </w:r>
+    </w:p>
+    <w:p>
+      <w:pPr>
+        <w:pStyle w:val="ListParagraph"/>
+        <w:numPr>
+          <w:ilvl w:val="0"/>
+          <w:numId w:val="24"/>
+        </w:numPr>
+        <w:rPr>
+          <w:rFonts w:ascii="Aptos" w:hAnsi="Aptos"/>
+          <w:sz w:val="24"/>
+          <w:szCs w:val="24"/>
+        </w:rPr>
+      </w:pPr>
+      <w:r>
+        <w:rPr>
+          <w:rFonts w:ascii="Aptos" w:hAnsi="Aptos"/>
+          <w:b/>
+          <w:bCs/>
+          <w:sz w:val="24"/>
+          <w:szCs w:val="24"/>
+        </w:rPr>
+        <w:t>You design the form:</w:t>
+      </w:r>
+      <w:r>
+        <w:rPr>
+          <w:rFonts w:ascii="Aptos" w:hAnsi="Aptos"/>
+          <w:sz w:val="24"/>
+          <w:szCs w:val="24"/>
+        </w:rPr>
+        <w:t xml:space="preserve"> You tell the AI what specific information fields you want and what kind of data goes into them (e.g., text, numbers, or a list).</w:t>
+      </w:r>
+    </w:p>
+    <w:p>
+      <w:pPr>
+        <w:pStyle w:val="ListParagraph"/>
+        <w:numPr>
+          <w:ilvl w:val="0"/>
+          <w:numId w:val="24"/>
+        </w:numPr>
+        <w:rPr>
+          <w:rFonts w:ascii="Aptos" w:hAnsi="Aptos"/>
+          <w:sz w:val="24"/>
+          <w:szCs w:val="24"/>
+        </w:rPr>
+      </w:pPr>
+      <w:r>
+        <w:rPr>
+          <w:rFonts w:ascii="Aptos" w:hAnsi="Aptos"/>
+          <w:b/>
+          <w:bCs/>
+          <w:sz w:val="24"/>
+          <w:szCs w:val="24"/>
+        </w:rPr>
+        <w:t>The AI fills it out:</w:t>
+      </w:r>
+      <w:r>
+        <w:rPr>
+          <w:rFonts w:ascii="Aptos" w:hAnsi="Aptos"/>
+          <w:sz w:val="24"/>
+          <w:szCs w:val="24"/>
+        </w:rPr>
+        <w:t xml:space="preserve"> The AI processes the user's request, but instead of chatting back, it inputs the data directly into your fields.</w:t>
+      </w:r>
+    </w:p>
+    <w:p>
+      <w:pPr>
+        <w:pStyle w:val="ListParagraph"/>
+        <w:numPr>
+          <w:ilvl w:val="0"/>
+          <w:numId w:val="24"/>
+        </w:numPr>
+        <w:rPr>
+          <w:rFonts w:ascii="Aptos" w:hAnsi="Aptos"/>
+          <w:sz w:val="24"/>
+          <w:szCs w:val="24"/>
+        </w:rPr>
+      </w:pPr>
+      <w:r>
+        <w:rPr>
+          <w:rFonts w:ascii="Aptos" w:hAnsi="Aptos"/>
+          <w:b/>
+          <w:bCs/>
+          <w:sz w:val="24"/>
+          <w:szCs w:val="24"/>
+        </w:rPr>
+        <w:t>The code reads it instantly:</w:t>
+      </w:r>
+      <w:r>
+        <w:rPr>
+          <w:rFonts w:ascii="Aptos" w:hAnsi="Aptos"/>
+          <w:sz w:val="24"/>
+          <w:szCs w:val="24"/>
+        </w:rPr>
+        <w:t xml:space="preserve"> Because the output matches your blueprint perfectly, your software can read the data immediately without any guesswork.</w:t>
+      </w:r>
+    </w:p>
+    <w:p>
+      <w:pPr>
+        <w:rPr>
+          <w:rFonts w:ascii="Aptos" w:hAnsi="Aptos"/>
+          <w:sz w:val="24"/>
+          <w:szCs w:val="24"/>
+        </w:rPr>
+      </w:pPr>
+    </w:p>
+    <w:p>
+      <w:pPr>
+        <w:pStyle w:val="ListParagraph"/>
+        <w:numPr>
+          <w:ilvl w:val="0"/>
+          <w:numId w:val="24"/>
+        </w:numPr>
+        <w:rPr>
+          <w:rFonts w:ascii="Aptos" w:hAnsi="Aptos"/>
+          <w:sz w:val="24"/>
+          <w:szCs w:val="24"/>
+        </w:rPr>
+      </w:pPr>
+      <w:r>
+        <w:rPr>
+          <w:rFonts w:ascii="Aptos" w:hAnsi="Aptos"/>
+          <w:sz w:val="24"/>
+          <w:szCs w:val="24"/>
+        </w:rPr>
+        <w:t xml:space="preserve">A </w:t>
+      </w:r>
+      <w:r>
+        <w:rPr>
+          <w:rFonts w:ascii="Aptos" w:hAnsi="Aptos"/>
+          <w:b/>
+          <w:bCs/>
+          <w:sz w:val="24"/>
+          <w:szCs w:val="24"/>
+        </w:rPr>
+        <w:t>Response Schema</w:t>
+      </w:r>
+      <w:r>
+        <w:rPr>
+          <w:rFonts w:ascii="Aptos" w:hAnsi="Aptos"/>
+          <w:sz w:val="24"/>
+          <w:szCs w:val="24"/>
+        </w:rPr>
+        <w:t xml:space="preserve"> is the </w:t>
+      </w:r>
+      <w:r>
+        <w:rPr>
+          <w:rFonts w:ascii="Aptos" w:hAnsi="Aptos"/>
+          <w:b/>
+          <w:bCs/>
+          <w:sz w:val="24"/>
+          <w:szCs w:val="24"/>
+        </w:rPr>
+        <w:t>blueprint</w:t>
+      </w:r>
+      <w:r>
+        <w:rPr>
+          <w:rFonts w:ascii="Aptos" w:hAnsi="Aptos"/>
+          <w:sz w:val="24"/>
+          <w:szCs w:val="24"/>
+        </w:rPr>
+        <w:t xml:space="preserve"> (the design of the form) that defines exactly what data fields you want.</w:t>
+      </w:r>
+    </w:p>
+    <w:p>
+      <w:pPr>
+        <w:pStyle w:val="ListParagraph"/>
+        <w:numPr>
+          <w:ilvl w:val="0"/>
+          <w:numId w:val="24"/>
+        </w:numPr>
+        <w:rPr>
+          <w:rFonts w:ascii="Aptos" w:hAnsi="Aptos"/>
+          <w:sz w:val="24"/>
+          <w:szCs w:val="24"/>
+        </w:rPr>
+      </w:pPr>
+      <w:r>
+        <w:rPr>
+          <w:rFonts w:ascii="Aptos" w:hAnsi="Aptos"/>
+          <w:b/>
+          <w:bCs/>
+          <w:sz w:val="24"/>
+          <w:szCs w:val="24"/>
+        </w:rPr>
+        <w:t>Structured Outputs</w:t>
+      </w:r>
+      <w:r>
+        <w:rPr>
+          <w:rFonts w:ascii="Aptos" w:hAnsi="Aptos"/>
+          <w:sz w:val="24"/>
+          <w:szCs w:val="24"/>
+        </w:rPr>
+        <w:t xml:space="preserve"> is the </w:t>
+      </w:r>
+      <w:r>
+        <w:rPr>
+          <w:rFonts w:ascii="Aptos" w:hAnsi="Aptos"/>
+          <w:b/>
+          <w:bCs/>
+          <w:sz w:val="24"/>
+          <w:szCs w:val="24"/>
+        </w:rPr>
+        <w:t>feature or technology</w:t>
+      </w:r>
+      <w:r>
+        <w:rPr>
+          <w:rFonts w:ascii="Aptos" w:hAnsi="Aptos"/>
+          <w:sz w:val="24"/>
+          <w:szCs w:val="24"/>
+        </w:rPr>
+        <w:t xml:space="preserve"> (the enforcement mechanism) that mathematically forces the AI to follow that blueprint without making mistakes.</w:t>
+      </w:r>
+    </w:p>
+    <w:p>
+      <w:pPr>
+        <w:rPr>
+          <w:rFonts w:ascii="Aptos" w:hAnsi="Aptos"/>
+          <w:sz w:val="24"/>
+          <w:szCs w:val="24"/>
+        </w:rPr>
+      </w:pPr>
+      <w:r>
+        <w:rPr>
+          <w:rFonts w:ascii="Aptos" w:hAnsi="Aptos"/>
+          <w:i/>
+          <w:iCs/>
+          <w:sz w:val="24"/>
+          <w:szCs w:val="24"/>
+        </w:rPr>
+        <w:t xml:space="preserve">"To get reliable data from an AI, I first define a </w:t>
+      </w:r>
+      <w:r>
+        <w:rPr>
+          <w:rFonts w:ascii="Aptos" w:hAnsi="Aptos"/>
+          <w:b/>
+          <w:bCs/>
+          <w:i/>
+          <w:iCs/>
+          <w:sz w:val="24"/>
+          <w:szCs w:val="24"/>
+        </w:rPr>
+        <w:t>Response Schema</w:t>
+      </w:r>
+      <w:r>
+        <w:rPr>
+          <w:rFonts w:ascii="Aptos" w:hAnsi="Aptos"/>
+          <w:i/>
+          <w:iCs/>
+          <w:sz w:val="24"/>
+          <w:szCs w:val="24"/>
+        </w:rPr>
+        <w:t xml:space="preserve"> using a tool like </w:t>
+      </w:r>
+      <w:proofErr w:type="spellStart"/>
+      <w:r>
+        <w:rPr>
+          <w:rFonts w:ascii="Aptos" w:hAnsi="Aptos"/>
+          <w:i/>
+          <w:iCs/>
+          <w:sz w:val="24"/>
+          <w:szCs w:val="24"/>
+        </w:rPr>
+        <w:t>Pydantic</w:t>
+      </w:r>
+      <w:proofErr w:type="spellEnd"/>
+      <w:r>
+        <w:rPr>
+          <w:rFonts w:ascii="Aptos" w:hAnsi="Aptos"/>
+          <w:i/>
+          <w:iCs/>
+          <w:sz w:val="24"/>
+          <w:szCs w:val="24"/>
+        </w:rPr>
+        <w:t xml:space="preserve"> to outline the exact keys and data types I need. Then, I pass that schema into the LLM provider's </w:t>
+      </w:r>
+      <w:r>
+        <w:rPr>
+          <w:rFonts w:ascii="Aptos" w:hAnsi="Aptos"/>
+          <w:b/>
+          <w:bCs/>
+          <w:i/>
+          <w:iCs/>
+          <w:sz w:val="24"/>
+          <w:szCs w:val="24"/>
+        </w:rPr>
+        <w:t>Structured Outputs</w:t>
+      </w:r>
+      <w:r>
+        <w:rPr>
+          <w:rFonts w:ascii="Aptos" w:hAnsi="Aptos"/>
+          <w:i/>
+          <w:iCs/>
+          <w:sz w:val="24"/>
+          <w:szCs w:val="24"/>
+        </w:rPr>
+        <w:t xml:space="preserve"> feature, which mathematically guarantees the model's response will match my schema perfectly."</w:t>
+      </w:r>
+    </w:p>
+    <w:p>
+      <w:pPr>
+        <w:rPr>
+          <w:rFonts w:ascii="Aptos" w:hAnsi="Aptos"/>
+          <w:sz w:val="24"/>
+          <w:szCs w:val="24"/>
+        </w:rPr>
+      </w:pPr>
+    </w:p>
+    <w:p>
+      <w:pPr>
+        <w:rPr>
+          <w:rFonts w:ascii="Aptos" w:hAnsi="Aptos"/>
+          <w:sz w:val="24"/>
+          <w:szCs w:val="24"/>
+        </w:rPr>
+      </w:pPr>
+      <w:r>
+        <w:rPr>
+          <w:rFonts w:ascii="Aptos" w:hAnsi="Aptos"/>
+          <w:b/>
+          <w:bCs/>
+          <w:sz w:val="24"/>
+          <w:szCs w:val="24"/>
+        </w:rPr>
+        <w:t>Prompt Engineering</w:t>
+      </w:r>
+      <w:r>
+        <w:rPr>
+          <w:rFonts w:ascii="Aptos" w:hAnsi="Aptos"/>
+          <w:sz w:val="24"/>
+          <w:szCs w:val="24"/>
+        </w:rPr>
+        <w:t xml:space="preserve"> is the</w:t>
+      </w:r>
+      <w:r>
+        <w:rPr>
+          <w:rFonts w:ascii="Aptos" w:hAnsi="Aptos"/>
+          <w:sz w:val="24"/>
+          <w:szCs w:val="24"/>
+        </w:rPr>
+        <w:t xml:space="preserve"> iterative</w:t>
+      </w:r>
+      <w:r>
+        <w:rPr>
+          <w:rFonts w:ascii="Aptos" w:hAnsi="Aptos"/>
+          <w:sz w:val="24"/>
+          <w:szCs w:val="24"/>
+        </w:rPr>
+        <w:t xml:space="preserve"> process of designing, testing, and refining prompts so an LLM consistently produces the desired output.</w:t>
+      </w:r>
+    </w:p>
+    <w:p>
+      <w:pPr>
+        <w:rPr>
+          <w:rFonts w:ascii="Aptos" w:hAnsi="Aptos"/>
+          <w:sz w:val="24"/>
+          <w:szCs w:val="24"/>
+        </w:rPr>
+      </w:pPr>
+    </w:p>
+    <w:p>
+      <w:pPr>
+        <w:rPr>
+          <w:rFonts w:ascii="Aptos" w:hAnsi="Aptos"/>
+          <w:b/>
+          <w:bCs/>
+          <w:sz w:val="24"/>
+          <w:szCs w:val="24"/>
+        </w:rPr>
+      </w:pPr>
+      <w:r>
+        <w:rPr>
+          <w:rFonts w:ascii="Aptos" w:hAnsi="Aptos"/>
+          <w:b/>
+          <w:bCs/>
+          <w:sz w:val="24"/>
+          <w:szCs w:val="24"/>
+        </w:rPr>
+        <w:t>Prompt Anatomy</w:t>
+      </w:r>
+      <w:r>
+        <w:rPr>
+          <w:rFonts w:ascii="Aptos" w:hAnsi="Aptos"/>
+          <w:b/>
+          <w:bCs/>
+          <w:sz w:val="24"/>
+          <w:szCs w:val="24"/>
+        </w:rPr>
+        <w:t>:</w:t>
+      </w:r>
+    </w:p>
+    <w:p>
+      <w:pPr>
+        <w:rPr>
+          <w:rFonts w:ascii="Aptos" w:hAnsi="Aptos"/>
+          <w:sz w:val="24"/>
+          <w:szCs w:val="24"/>
+        </w:rPr>
+      </w:pPr>
+      <w:r>
+        <w:rPr>
+          <w:rFonts w:ascii="Aptos" w:hAnsi="Aptos"/>
+          <w:b/>
+          <w:bCs/>
+          <w:sz w:val="24"/>
+          <w:szCs w:val="24"/>
+        </w:rPr>
+        <w:t>Role</w:t>
+      </w:r>
+      <w:r>
+        <w:rPr>
+          <w:rFonts w:ascii="Aptos" w:hAnsi="Aptos"/>
+          <w:b/>
+          <w:bCs/>
+          <w:sz w:val="24"/>
+          <w:szCs w:val="24"/>
+        </w:rPr>
+        <w:t xml:space="preserve"> -&gt; </w:t>
+      </w:r>
+      <w:r>
+        <w:rPr>
+          <w:rFonts w:ascii="Aptos" w:hAnsi="Aptos"/>
+          <w:sz w:val="24"/>
+          <w:szCs w:val="24"/>
+        </w:rPr>
+        <w:t>T</w:t>
+      </w:r>
+      <w:r>
+        <w:rPr>
+          <w:rFonts w:ascii="Aptos" w:hAnsi="Aptos"/>
+          <w:sz w:val="24"/>
+          <w:szCs w:val="24"/>
+        </w:rPr>
+        <w:t>he Role tells the AI who it should act as.</w:t>
+      </w:r>
+    </w:p>
+    <w:p>
+      <w:pPr>
+        <w:rPr>
+          <w:rFonts w:ascii="Aptos" w:hAnsi="Aptos"/>
+          <w:sz w:val="24"/>
+          <w:szCs w:val="24"/>
+        </w:rPr>
+      </w:pPr>
+      <w:r>
+        <w:rPr>
+          <w:rFonts w:ascii="Aptos" w:hAnsi="Aptos"/>
+          <w:b/>
+          <w:bCs/>
+          <w:sz w:val="24"/>
+          <w:szCs w:val="24"/>
+        </w:rPr>
+        <w:t>Context</w:t>
+      </w:r>
+      <w:r>
+        <w:rPr>
+          <w:rFonts w:ascii="Aptos" w:hAnsi="Aptos"/>
+          <w:b/>
+          <w:bCs/>
+          <w:sz w:val="24"/>
+          <w:szCs w:val="24"/>
+        </w:rPr>
+        <w:t xml:space="preserve"> -&gt; </w:t>
+      </w:r>
+      <w:r>
+        <w:rPr>
+          <w:rFonts w:ascii="Aptos" w:hAnsi="Aptos"/>
+          <w:sz w:val="24"/>
+          <w:szCs w:val="24"/>
+        </w:rPr>
+        <w:t>Context provides background information.</w:t>
+      </w:r>
+    </w:p>
+    <w:p>
+      <w:pPr>
+        <w:rPr>
+          <w:rFonts w:ascii="Aptos" w:hAnsi="Aptos"/>
+          <w:sz w:val="24"/>
+          <w:szCs w:val="24"/>
+        </w:rPr>
+      </w:pPr>
+      <w:r>
+        <w:rPr>
+          <w:rFonts w:ascii="Aptos" w:hAnsi="Aptos"/>
+          <w:b/>
+          <w:bCs/>
+          <w:sz w:val="24"/>
+          <w:szCs w:val="24"/>
+        </w:rPr>
+        <w:t>Task</w:t>
+      </w:r>
+      <w:r>
+        <w:rPr>
+          <w:rFonts w:ascii="Aptos" w:hAnsi="Aptos"/>
+          <w:b/>
+          <w:bCs/>
+          <w:sz w:val="24"/>
+          <w:szCs w:val="24"/>
+        </w:rPr>
+        <w:t xml:space="preserve"> -&gt; </w:t>
+      </w:r>
+      <w:r>
+        <w:rPr>
+          <w:rFonts w:ascii="Aptos" w:hAnsi="Aptos"/>
+          <w:sz w:val="24"/>
+          <w:szCs w:val="24"/>
+        </w:rPr>
+        <w:t>This is the actual work you want the AI to do.</w:t>
+      </w:r>
+    </w:p>
+    <w:p>
+      <w:pPr>
+        <w:rPr>
+          <w:rFonts w:ascii="Aptos" w:hAnsi="Aptos"/>
+          <w:sz w:val="24"/>
+          <w:szCs w:val="24"/>
+        </w:rPr>
+      </w:pPr>
+      <w:r>
+        <w:rPr>
+          <w:rFonts w:ascii="Aptos" w:hAnsi="Aptos"/>
+          <w:b/>
+          <w:bCs/>
+          <w:sz w:val="24"/>
+          <w:szCs w:val="24"/>
+        </w:rPr>
+        <w:t>Constraints</w:t>
+      </w:r>
+      <w:r>
+        <w:rPr>
+          <w:rFonts w:ascii="Aptos" w:hAnsi="Aptos"/>
+          <w:b/>
+          <w:bCs/>
+          <w:sz w:val="24"/>
+          <w:szCs w:val="24"/>
+        </w:rPr>
+        <w:t xml:space="preserve"> -&gt; </w:t>
+      </w:r>
+      <w:r>
+        <w:rPr>
+          <w:rFonts w:ascii="Aptos" w:hAnsi="Aptos"/>
+          <w:sz w:val="24"/>
+          <w:szCs w:val="24"/>
+        </w:rPr>
+        <w:t>Constraints define what the AI must or must not do.</w:t>
+      </w:r>
+    </w:p>
+    <w:p>
+      <w:pPr>
+        <w:rPr>
+          <w:rFonts w:ascii="Aptos" w:hAnsi="Aptos"/>
+          <w:b/>
+          <w:bCs/>
+          <w:sz w:val="24"/>
+          <w:szCs w:val="24"/>
+        </w:rPr>
+      </w:pPr>
+      <w:r>
+        <w:rPr>
+          <w:rFonts w:ascii="Aptos" w:hAnsi="Aptos"/>
+          <w:b/>
+          <w:bCs/>
+          <w:sz w:val="24"/>
+          <w:szCs w:val="24"/>
+        </w:rPr>
+        <w:t>Output Format</w:t>
+      </w:r>
+      <w:r>
+        <w:rPr>
+          <w:rFonts w:ascii="Aptos" w:hAnsi="Aptos"/>
+          <w:b/>
+          <w:bCs/>
+          <w:sz w:val="24"/>
+          <w:szCs w:val="24"/>
+        </w:rPr>
+        <w:t xml:space="preserve"> -&gt; </w:t>
+      </w:r>
+      <w:r>
+        <w:rPr>
+          <w:rFonts w:ascii="Aptos" w:hAnsi="Aptos"/>
+          <w:sz w:val="24"/>
+          <w:szCs w:val="24"/>
+        </w:rPr>
+        <w:t>This is especially important for AI applications.</w:t>
+      </w:r>
+    </w:p>
+    <w:p>
+      <w:pPr>
+        <w:rPr>
+          <w:rFonts w:ascii="Aptos" w:hAnsi="Aptos"/>
+          <w:sz w:val="24"/>
+          <w:szCs w:val="24"/>
+        </w:rPr>
+      </w:pPr>
+    </w:p>
+    <w:p>
+      <w:pPr>
+        <w:rPr>
+          <w:rFonts w:ascii="Aptos" w:hAnsi="Aptos"/>
+          <w:b/>
+          <w:bCs/>
+          <w:sz w:val="24"/>
+          <w:szCs w:val="24"/>
+        </w:rPr>
+      </w:pPr>
+      <w:r>
+        <w:rPr>
+          <w:rFonts w:ascii="Aptos" w:hAnsi="Aptos"/>
+          <w:b/>
+          <w:bCs/>
+          <w:sz w:val="24"/>
+          <w:szCs w:val="24"/>
+        </w:rPr>
+        <w:t>Prompt Iteration</w:t>
+      </w:r>
+      <w:r>
+        <w:rPr>
+          <w:rFonts w:ascii="Aptos" w:hAnsi="Aptos"/>
+          <w:b/>
+          <w:bCs/>
+          <w:sz w:val="24"/>
+          <w:szCs w:val="24"/>
+        </w:rPr>
+        <w:t>:</w:t>
+      </w:r>
+    </w:p>
+    <w:p>
+      <w:pPr>
+        <w:rPr>
+          <w:rFonts w:ascii="Aptos" w:hAnsi="Aptos"/>
+          <w:sz w:val="24"/>
+          <w:szCs w:val="24"/>
+        </w:rPr>
+      </w:pPr>
+      <w:r>
+        <w:rPr>
+          <w:rFonts w:ascii="Aptos" w:hAnsi="Aptos"/>
+          <w:sz w:val="24"/>
+          <w:szCs w:val="24"/>
+        </w:rPr>
+        <w:lastRenderedPageBreak/>
+        <w:t>Draft</w:t>
+      </w:r>
+      <w:r>
+        <w:rPr>
+          <w:rFonts w:ascii="Aptos" w:hAnsi="Aptos"/>
+          <w:sz w:val="24"/>
+          <w:szCs w:val="24"/>
+        </w:rPr>
+        <w:br/>
+        <w:t>↓</w:t>
+      </w:r>
+      <w:r>
+        <w:rPr>
+          <w:rFonts w:ascii="Aptos" w:hAnsi="Aptos"/>
+          <w:sz w:val="24"/>
+          <w:szCs w:val="24"/>
+        </w:rPr>
+        <w:br/>
+        <w:t>Test</w:t>
+      </w:r>
+      <w:r>
+        <w:rPr>
+          <w:rFonts w:ascii="Aptos" w:hAnsi="Aptos"/>
+          <w:sz w:val="24"/>
+          <w:szCs w:val="24"/>
+        </w:rPr>
+        <w:br/>
+        <w:t>↓</w:t>
+      </w:r>
+      <w:r>
+        <w:rPr>
+          <w:rFonts w:ascii="Aptos" w:hAnsi="Aptos"/>
+          <w:sz w:val="24"/>
+          <w:szCs w:val="24"/>
+        </w:rPr>
+        <w:br/>
+        <w:t>Evaluate</w:t>
+      </w:r>
+      <w:r>
+        <w:rPr>
+          <w:rFonts w:ascii="Aptos" w:hAnsi="Aptos"/>
+          <w:sz w:val="24"/>
+          <w:szCs w:val="24"/>
+        </w:rPr>
+        <w:br/>
+        <w:t>↓</w:t>
+      </w:r>
+      <w:r>
+        <w:rPr>
+          <w:rFonts w:ascii="Aptos" w:hAnsi="Aptos"/>
+          <w:sz w:val="24"/>
+          <w:szCs w:val="24"/>
+        </w:rPr>
+        <w:br/>
+        <w:t>Refine</w:t>
+      </w:r>
+      <w:r>
+        <w:rPr>
+          <w:rFonts w:ascii="Aptos" w:hAnsi="Aptos"/>
+          <w:sz w:val="24"/>
+          <w:szCs w:val="24"/>
+        </w:rPr>
+        <w:br/>
+        <w:t>↓</w:t>
+      </w:r>
+      <w:r>
+        <w:rPr>
+          <w:rFonts w:ascii="Aptos" w:hAnsi="Aptos"/>
+          <w:sz w:val="24"/>
+          <w:szCs w:val="24"/>
+        </w:rPr>
+        <w:br/>
+        <w:t>Test Again</w:t>
+      </w:r>
+      <w:r>
+        <w:rPr>
+          <w:rFonts w:ascii="Aptos" w:hAnsi="Aptos"/>
+          <w:sz w:val="24"/>
+          <w:szCs w:val="24"/>
+        </w:rPr>
+        <w:br/>
+        <w:t>↓</w:t>
+      </w:r>
+      <w:r>
+        <w:rPr>
+          <w:rFonts w:ascii="Aptos" w:hAnsi="Aptos"/>
+          <w:sz w:val="24"/>
+          <w:szCs w:val="24"/>
+        </w:rPr>
+        <w:br/>
+        <w:t>Repeat</w:t>
+      </w:r>
+    </w:p>
+    <w:p>
+      <w:pPr>
+        <w:rPr>
+          <w:rFonts w:ascii="Aptos" w:hAnsi="Aptos"/>
+          <w:sz w:val="24"/>
+          <w:szCs w:val="24"/>
+        </w:rPr>
+      </w:pPr>
+    </w:p>
+    <w:p>
+      <w:pPr>
+        <w:pStyle w:val="ListParagraph"/>
+        <w:numPr>
+          <w:ilvl w:val="0"/>
+          <w:numId w:val="27"/>
+        </w:numPr>
+        <w:rPr>
+          <w:rFonts w:ascii="Aptos" w:hAnsi="Aptos"/>
+          <w:sz w:val="24"/>
+          <w:szCs w:val="24"/>
+        </w:rPr>
+      </w:pPr>
+      <w:r>
+        <w:rPr>
+          <w:rFonts w:ascii="Aptos" w:hAnsi="Aptos"/>
+          <w:b/>
+          <w:bCs/>
+          <w:sz w:val="24"/>
+          <w:szCs w:val="24"/>
+        </w:rPr>
+        <w:t>Who should the AI act as?</w:t>
+      </w:r>
+      <w:r>
+        <w:rPr>
+          <w:rFonts w:ascii="Aptos" w:hAnsi="Aptos"/>
+          <w:sz w:val="24"/>
+          <w:szCs w:val="24"/>
+        </w:rPr>
+        <w:t xml:space="preserve"> (Role) </w:t>
+      </w:r>
+    </w:p>
+    <w:p>
+      <w:pPr>
+        <w:pStyle w:val="ListParagraph"/>
+        <w:numPr>
+          <w:ilvl w:val="0"/>
+          <w:numId w:val="27"/>
+        </w:numPr>
+        <w:rPr>
+          <w:rFonts w:ascii="Aptos" w:hAnsi="Aptos"/>
+          <w:sz w:val="24"/>
+          <w:szCs w:val="24"/>
+        </w:rPr>
+      </w:pPr>
+      <w:r>
+        <w:rPr>
+          <w:rFonts w:ascii="Aptos" w:hAnsi="Aptos"/>
+          <w:b/>
+          <w:bCs/>
+          <w:sz w:val="24"/>
+          <w:szCs w:val="24"/>
+        </w:rPr>
+        <w:t>What background does it need?</w:t>
+      </w:r>
+      <w:r>
+        <w:rPr>
+          <w:rFonts w:ascii="Aptos" w:hAnsi="Aptos"/>
+          <w:sz w:val="24"/>
+          <w:szCs w:val="24"/>
+        </w:rPr>
+        <w:t xml:space="preserve"> (Context) </w:t>
+      </w:r>
+    </w:p>
+    <w:p>
+      <w:pPr>
+        <w:pStyle w:val="ListParagraph"/>
+        <w:numPr>
+          <w:ilvl w:val="0"/>
+          <w:numId w:val="27"/>
+        </w:numPr>
+        <w:rPr>
+          <w:rFonts w:ascii="Aptos" w:hAnsi="Aptos"/>
+          <w:sz w:val="24"/>
+          <w:szCs w:val="24"/>
+        </w:rPr>
+      </w:pPr>
+      <w:r>
+        <w:rPr>
+          <w:rFonts w:ascii="Aptos" w:hAnsi="Aptos"/>
+          <w:b/>
+          <w:bCs/>
+          <w:sz w:val="24"/>
+          <w:szCs w:val="24"/>
+        </w:rPr>
+        <w:t>What exactly should it do?</w:t>
+      </w:r>
+      <w:r>
+        <w:rPr>
+          <w:rFonts w:ascii="Aptos" w:hAnsi="Aptos"/>
+          <w:sz w:val="24"/>
+          <w:szCs w:val="24"/>
+        </w:rPr>
+        <w:t xml:space="preserve"> (Task) </w:t>
+      </w:r>
+    </w:p>
+    <w:p>
+      <w:pPr>
+        <w:pStyle w:val="ListParagraph"/>
+        <w:numPr>
+          <w:ilvl w:val="0"/>
+          <w:numId w:val="27"/>
+        </w:numPr>
+        <w:rPr>
+          <w:rFonts w:ascii="Aptos" w:hAnsi="Aptos"/>
+          <w:sz w:val="24"/>
+          <w:szCs w:val="24"/>
+        </w:rPr>
+      </w:pPr>
+      <w:r>
+        <w:rPr>
+          <w:rFonts w:ascii="Aptos" w:hAnsi="Aptos"/>
+          <w:b/>
+          <w:bCs/>
+          <w:sz w:val="24"/>
+          <w:szCs w:val="24"/>
+        </w:rPr>
+        <w:t>What rules should it follow?</w:t>
+      </w:r>
+      <w:r>
+        <w:rPr>
+          <w:rFonts w:ascii="Aptos" w:hAnsi="Aptos"/>
+          <w:sz w:val="24"/>
+          <w:szCs w:val="24"/>
+        </w:rPr>
+        <w:t xml:space="preserve"> (Constraints) </w:t>
+      </w:r>
+    </w:p>
+    <w:p>
+      <w:pPr>
+        <w:pStyle w:val="ListParagraph"/>
+        <w:numPr>
+          <w:ilvl w:val="0"/>
+          <w:numId w:val="27"/>
+        </w:numPr>
+        <w:rPr>
+          <w:rFonts w:ascii="Aptos" w:hAnsi="Aptos"/>
+          <w:sz w:val="24"/>
+          <w:szCs w:val="24"/>
+        </w:rPr>
+      </w:pPr>
+      <w:r>
+        <w:rPr>
+          <w:rFonts w:ascii="Aptos" w:hAnsi="Aptos"/>
+          <w:b/>
+          <w:bCs/>
+          <w:sz w:val="24"/>
+          <w:szCs w:val="24"/>
+        </w:rPr>
+        <w:t>How should the result be formatted?</w:t>
+      </w:r>
+      <w:r>
+        <w:rPr>
+          <w:rFonts w:ascii="Aptos" w:hAnsi="Aptos"/>
+          <w:sz w:val="24"/>
+          <w:szCs w:val="24"/>
+        </w:rPr>
+        <w:t xml:space="preserve"> (Output Format)</w:t>
+      </w:r>
     </w:p>
     <w:p>
       <w:pPr>
@@ -14722,6 +16242,92 @@
     </w:lvl>
   </w:abstractNum>
   <w:abstractNum w:abstractNumId="3" w15:restartNumberingAfterBreak="0">
+    <w:nsid w:val="1C436C4F"/>
+    <w:multiLevelType w:val="hybridMultilevel"/>
+    <w:tmpl w:val="B1A0F752"/>
+    <w:lvl w:ilvl="0" w:tplc="4009000F">
+      <w:start w:val="1"/>
+      <w:numFmt w:val="decimal"/>
+      <w:lvlText w:val="%1."/>
+      <w:lvlJc w:val="left"/>
+      <w:pPr>
+        <w:ind w:left="1080" w:hanging="360"/>
+      </w:pPr>
+    </w:lvl>
+    <w:lvl w:ilvl="1" w:tplc="40090019" w:tentative="1">
+      <w:start w:val="1"/>
+      <w:numFmt w:val="lowerLetter"/>
+      <w:lvlText w:val="%2."/>
+      <w:lvlJc w:val="left"/>
+      <w:pPr>
+        <w:ind w:left="1800" w:hanging="360"/>
+      </w:pPr>
+    </w:lvl>
+    <w:lvl w:ilvl="2" w:tplc="4009001B" w:tentative="1">
+      <w:start w:val="1"/>
+      <w:numFmt w:val="lowerRoman"/>
+      <w:lvlText w:val="%3."/>
+      <w:lvlJc w:val="right"/>
+      <w:pPr>
+        <w:ind w:left="2520" w:hanging="180"/>
+      </w:pPr>
+    </w:lvl>
+    <w:lvl w:ilvl="3" w:tplc="4009000F" w:tentative="1">
+      <w:start w:val="1"/>
+      <w:numFmt w:val="decimal"/>
+      <w:lvlText w:val="%4."/>
+      <w:lvlJc w:val="left"/>
+      <w:pPr>
+        <w:ind w:left="3240" w:hanging="360"/>
+      </w:pPr>
+    </w:lvl>
+    <w:lvl w:ilvl="4" w:tplc="40090019" w:tentative="1">
+      <w:start w:val="1"/>
+      <w:numFmt w:val="lowerLetter"/>
+      <w:lvlText w:val="%5."/>
+      <w:lvlJc w:val="left"/>
+      <w:pPr>
+        <w:ind w:left="3960" w:hanging="360"/>
+      </w:pPr>
+    </w:lvl>
+    <w:lvl w:ilvl="5" w:tplc="4009001B" w:tentative="1">
+      <w:start w:val="1"/>
+      <w:numFmt w:val="lowerRoman"/>
+      <w:lvlText w:val="%6."/>
+      <w:lvlJc w:val="right"/>
+      <w:pPr>
+        <w:ind w:left="4680" w:hanging="180"/>
+      </w:pPr>
+    </w:lvl>
+    <w:lvl w:ilvl="6" w:tplc="4009000F" w:tentative="1">
+      <w:start w:val="1"/>
+      <w:numFmt w:val="decimal"/>
+      <w:lvlText w:val="%7."/>
+      <w:lvlJc w:val="left"/>
+      <w:pPr>
+        <w:ind w:left="5400" w:hanging="360"/>
+      </w:pPr>
+    </w:lvl>
+    <w:lvl w:ilvl="7" w:tplc="40090019" w:tentative="1">
+      <w:start w:val="1"/>
+      <w:numFmt w:val="lowerLetter"/>
+      <w:lvlText w:val="%8."/>
+      <w:lvlJc w:val="left"/>
+      <w:pPr>
+        <w:ind w:left="6120" w:hanging="360"/>
+      </w:pPr>
+    </w:lvl>
+    <w:lvl w:ilvl="8" w:tplc="4009001B" w:tentative="1">
+      <w:start w:val="1"/>
+      <w:numFmt w:val="lowerRoman"/>
+      <w:lvlText w:val="%9."/>
+      <w:lvlJc w:val="right"/>
+      <w:pPr>
+        <w:ind w:left="6840" w:hanging="180"/>
+      </w:pPr>
+    </w:lvl>
+  </w:abstractNum>
+  <w:abstractNum w:abstractNumId="4" w15:restartNumberingAfterBreak="0">
     <w:nsid w:val="237B6F3B"/>
     <w:multiLevelType w:val="multilevel"/>
     <w:tmpl w:val="EDF2DEE2"/>
@@ -14834,7 +16440,120 @@
       </w:pPr>
     </w:lvl>
   </w:abstractNum>
-  <w:abstractNum w:abstractNumId="4" w15:restartNumberingAfterBreak="0">
+  <w:abstractNum w:abstractNumId="5" w15:restartNumberingAfterBreak="0">
+    <w:nsid w:val="25E73A87"/>
+    <w:multiLevelType w:val="hybridMultilevel"/>
+    <w:tmpl w:val="220EE4CA"/>
+    <w:lvl w:ilvl="0" w:tplc="40090001">
+      <w:start w:val="1"/>
+      <w:numFmt w:val="bullet"/>
+      <w:lvlText w:val=""/>
+      <w:lvlJc w:val="left"/>
+      <w:pPr>
+        <w:ind w:left="720" w:hanging="360"/>
+      </w:pPr>
+      <w:rPr>
+        <w:rFonts w:ascii="Symbol" w:hAnsi="Symbol" w:hint="default"/>
+      </w:rPr>
+    </w:lvl>
+    <w:lvl w:ilvl="1" w:tplc="40090003" w:tentative="1">
+      <w:start w:val="1"/>
+      <w:numFmt w:val="bullet"/>
+      <w:lvlText w:val="o"/>
+      <w:lvlJc w:val="left"/>
+      <w:pPr>
+        <w:ind w:left="1440" w:hanging="360"/>
+      </w:pPr>
+      <w:rPr>
+        <w:rFonts w:ascii="Courier New" w:hAnsi="Courier New" w:cs="Courier New" w:hint="default"/>
+      </w:rPr>
+    </w:lvl>
+    <w:lvl w:ilvl="2" w:tplc="40090005" w:tentative="1">
+      <w:start w:val="1"/>
+      <w:numFmt w:val="bullet"/>
+      <w:lvlText w:val=""/>
+      <w:lvlJc w:val="left"/>
+      <w:pPr>
+        <w:ind w:left="2160" w:hanging="360"/>
+      </w:pPr>
+      <w:rPr>
+        <w:rFonts w:ascii="Wingdings" w:hAnsi="Wingdings" w:hint="default"/>
+      </w:rPr>
+    </w:lvl>
+    <w:lvl w:ilvl="3" w:tplc="40090001" w:tentative="1">
+      <w:start w:val="1"/>
+      <w:numFmt w:val="bullet"/>
+      <w:lvlText w:val=""/>
+      <w:lvlJc w:val="left"/>
+      <w:pPr>
+        <w:ind w:left="2880" w:hanging="360"/>
+      </w:pPr>
+      <w:rPr>
+        <w:rFonts w:ascii="Symbol" w:hAnsi="Symbol" w:hint="default"/>
+      </w:rPr>
+    </w:lvl>
+    <w:lvl w:ilvl="4" w:tplc="40090003" w:tentative="1">
+      <w:start w:val="1"/>
+      <w:numFmt w:val="bullet"/>
+      <w:lvlText w:val="o"/>
+      <w:lvlJc w:val="left"/>
+      <w:pPr>
+        <w:ind w:left="3600" w:hanging="360"/>
+      </w:pPr>
+      <w:rPr>
+        <w:rFonts w:ascii="Courier New" w:hAnsi="Courier New" w:cs="Courier New" w:hint="default"/>
+      </w:rPr>
+    </w:lvl>
+    <w:lvl w:ilvl="5" w:tplc="40090005" w:tentative="1">
+      <w:start w:val="1"/>
+      <w:numFmt w:val="bullet"/>
+      <w:lvlText w:val=""/>
+      <w:lvlJc w:val="left"/>
+      <w:pPr>
+        <w:ind w:left="4320" w:hanging="360"/>
+      </w:pPr>
+      <w:rPr>
+        <w:rFonts w:ascii="Wingdings" w:hAnsi="Wingdings" w:hint="default"/>
+      </w:rPr>
+    </w:lvl>
+    <w:lvl w:ilvl="6" w:tplc="40090001" w:tentative="1">
+      <w:start w:val="1"/>
+      <w:numFmt w:val="bullet"/>
+      <w:lvlText w:val=""/>
+      <w:lvlJc w:val="left"/>
+      <w:pPr>
+        <w:ind w:left="5040" w:hanging="360"/>
+      </w:pPr>
+      <w:rPr>
+        <w:rFonts w:ascii="Symbol" w:hAnsi="Symbol" w:hint="default"/>
+      </w:rPr>
+    </w:lvl>
+    <w:lvl w:ilvl="7" w:tplc="40090003" w:tentative="1">
+      <w:start w:val="1"/>
+      <w:numFmt w:val="bullet"/>
+      <w:lvlText w:val="o"/>
+      <w:lvlJc w:val="left"/>
+      <w:pPr>
+        <w:ind w:left="5760" w:hanging="360"/>
+      </w:pPr>
+      <w:rPr>
+        <w:rFonts w:ascii="Courier New" w:hAnsi="Courier New" w:cs="Courier New" w:hint="default"/>
+      </w:rPr>
+    </w:lvl>
+    <w:lvl w:ilvl="8" w:tplc="40090005" w:tentative="1">
+      <w:start w:val="1"/>
+      <w:numFmt w:val="bullet"/>
+      <w:lvlText w:val=""/>
+      <w:lvlJc w:val="left"/>
+      <w:pPr>
+        <w:ind w:left="6480" w:hanging="360"/>
+      </w:pPr>
+      <w:rPr>
+        <w:rFonts w:ascii="Wingdings" w:hAnsi="Wingdings" w:hint="default"/>
+      </w:rPr>
+    </w:lvl>
+  </w:abstractNum>
+  <w:abstractNum w:abstractNumId="6" w15:restartNumberingAfterBreak="0">
     <w:nsid w:val="2B4D6E6F"/>
     <w:multiLevelType w:val="hybridMultilevel"/>
     <w:tmpl w:val="BC5209C8"/>
@@ -14920,7 +16639,7 @@
       </w:pPr>
     </w:lvl>
   </w:abstractNum>
-  <w:abstractNum w:abstractNumId="5" w15:restartNumberingAfterBreak="0">
+  <w:abstractNum w:abstractNumId="7" w15:restartNumberingAfterBreak="0">
     <w:nsid w:val="382C35D8"/>
     <w:multiLevelType w:val="multilevel"/>
     <w:tmpl w:val="AAAAEC82"/>
@@ -15069,7 +16788,7 @@
       </w:rPr>
     </w:lvl>
   </w:abstractNum>
-  <w:abstractNum w:abstractNumId="6" w15:restartNumberingAfterBreak="0">
+  <w:abstractNum w:abstractNumId="8" w15:restartNumberingAfterBreak="0">
     <w:nsid w:val="3CDA3236"/>
     <w:multiLevelType w:val="multilevel"/>
     <w:tmpl w:val="03F04D1C"/>
@@ -15218,10 +16937,10 @@
       </w:rPr>
     </w:lvl>
   </w:abstractNum>
-  <w:abstractNum w:abstractNumId="7" w15:restartNumberingAfterBreak="0">
+  <w:abstractNum w:abstractNumId="9" w15:restartNumberingAfterBreak="0">
     <w:nsid w:val="451F0311"/>
     <w:multiLevelType w:val="hybridMultilevel"/>
-    <w:tmpl w:val="C292EB6C"/>
+    <w:tmpl w:val="35E857B6"/>
     <w:lvl w:ilvl="0" w:tplc="4009000F">
       <w:start w:val="1"/>
       <w:numFmt w:val="decimal"/>
@@ -15307,7 +17026,305 @@
       </w:pPr>
     </w:lvl>
   </w:abstractNum>
-  <w:abstractNum w:abstractNumId="8" w15:restartNumberingAfterBreak="0">
+  <w:abstractNum w:abstractNumId="10" w15:restartNumberingAfterBreak="0">
+    <w:nsid w:val="45C85A15"/>
+    <w:multiLevelType w:val="multilevel"/>
+    <w:tmpl w:val="289A09AE"/>
+    <w:lvl w:ilvl="0">
+      <w:start w:val="1"/>
+      <w:numFmt w:val="bullet"/>
+      <w:lvlText w:val=""/>
+      <w:lvlJc w:val="left"/>
+      <w:pPr>
+        <w:tabs>
+          <w:tab w:val="num" w:pos="720"/>
+        </w:tabs>
+        <w:ind w:left="720" w:hanging="360"/>
+      </w:pPr>
+      <w:rPr>
+        <w:rFonts w:ascii="Symbol" w:hAnsi="Symbol" w:hint="default"/>
+        <w:sz w:val="20"/>
+      </w:rPr>
+    </w:lvl>
+    <w:lvl w:ilvl="1" w:tentative="1">
+      <w:start w:val="1"/>
+      <w:numFmt w:val="bullet"/>
+      <w:lvlText w:val="o"/>
+      <w:lvlJc w:val="left"/>
+      <w:pPr>
+        <w:tabs>
+          <w:tab w:val="num" w:pos="1440"/>
+        </w:tabs>
+        <w:ind w:left="1440" w:hanging="360"/>
+      </w:pPr>
+      <w:rPr>
+        <w:rFonts w:ascii="Courier New" w:hAnsi="Courier New" w:hint="default"/>
+        <w:sz w:val="20"/>
+      </w:rPr>
+    </w:lvl>
+    <w:lvl w:ilvl="2" w:tentative="1">
+      <w:start w:val="1"/>
+      <w:numFmt w:val="bullet"/>
+      <w:lvlText w:val=""/>
+      <w:lvlJc w:val="left"/>
+      <w:pPr>
+        <w:tabs>
+          <w:tab w:val="num" w:pos="2160"/>
+        </w:tabs>
+        <w:ind w:left="2160" w:hanging="360"/>
+      </w:pPr>
+      <w:rPr>
+        <w:rFonts w:ascii="Wingdings" w:hAnsi="Wingdings" w:hint="default"/>
+        <w:sz w:val="20"/>
+      </w:rPr>
+    </w:lvl>
+    <w:lvl w:ilvl="3" w:tentative="1">
+      <w:start w:val="1"/>
+      <w:numFmt w:val="bullet"/>
+      <w:lvlText w:val=""/>
+      <w:lvlJc w:val="left"/>
+      <w:pPr>
+        <w:tabs>
+          <w:tab w:val="num" w:pos="2880"/>
+        </w:tabs>
+        <w:ind w:left="2880" w:hanging="360"/>
+      </w:pPr>
+      <w:rPr>
+        <w:rFonts w:ascii="Wingdings" w:hAnsi="Wingdings" w:hint="default"/>
+        <w:sz w:val="20"/>
+      </w:rPr>
+    </w:lvl>
+    <w:lvl w:ilvl="4" w:tentative="1">
+      <w:start w:val="1"/>
+      <w:numFmt w:val="bullet"/>
+      <w:lvlText w:val=""/>
+      <w:lvlJc w:val="left"/>
+      <w:pPr>
+        <w:tabs>
+          <w:tab w:val="num" w:pos="3600"/>
+        </w:tabs>
+        <w:ind w:left="3600" w:hanging="360"/>
+      </w:pPr>
+      <w:rPr>
+        <w:rFonts w:ascii="Wingdings" w:hAnsi="Wingdings" w:hint="default"/>
+        <w:sz w:val="20"/>
+      </w:rPr>
+    </w:lvl>
+    <w:lvl w:ilvl="5" w:tentative="1">
+      <w:start w:val="1"/>
+      <w:numFmt w:val="bullet"/>
+      <w:lvlText w:val=""/>
+      <w:lvlJc w:val="left"/>
+      <w:pPr>
+        <w:tabs>
+          <w:tab w:val="num" w:pos="4320"/>
+        </w:tabs>
+        <w:ind w:left="4320" w:hanging="360"/>
+      </w:pPr>
+      <w:rPr>
+        <w:rFonts w:ascii="Wingdings" w:hAnsi="Wingdings" w:hint="default"/>
+        <w:sz w:val="20"/>
+      </w:rPr>
+    </w:lvl>
+    <w:lvl w:ilvl="6" w:tentative="1">
+      <w:start w:val="1"/>
+      <w:numFmt w:val="bullet"/>
+      <w:lvlText w:val=""/>
+      <w:lvlJc w:val="left"/>
+      <w:pPr>
+        <w:tabs>
+          <w:tab w:val="num" w:pos="5040"/>
+        </w:tabs>
+        <w:ind w:left="5040" w:hanging="360"/>
+      </w:pPr>
+      <w:rPr>
+        <w:rFonts w:ascii="Wingdings" w:hAnsi="Wingdings" w:hint="default"/>
+        <w:sz w:val="20"/>
+      </w:rPr>
+    </w:lvl>
+    <w:lvl w:ilvl="7" w:tentative="1">
+      <w:start w:val="1"/>
+      <w:numFmt w:val="bullet"/>
+      <w:lvlText w:val=""/>
+      <w:lvlJc w:val="left"/>
+      <w:pPr>
+        <w:tabs>
+          <w:tab w:val="num" w:pos="5760"/>
+        </w:tabs>
+        <w:ind w:left="5760" w:hanging="360"/>
+      </w:pPr>
+      <w:rPr>
+        <w:rFonts w:ascii="Wingdings" w:hAnsi="Wingdings" w:hint="default"/>
+        <w:sz w:val="20"/>
+      </w:rPr>
+    </w:lvl>
+    <w:lvl w:ilvl="8" w:tentative="1">
+      <w:start w:val="1"/>
+      <w:numFmt w:val="bullet"/>
+      <w:lvlText w:val=""/>
+      <w:lvlJc w:val="left"/>
+      <w:pPr>
+        <w:tabs>
+          <w:tab w:val="num" w:pos="6480"/>
+        </w:tabs>
+        <w:ind w:left="6480" w:hanging="360"/>
+      </w:pPr>
+      <w:rPr>
+        <w:rFonts w:ascii="Wingdings" w:hAnsi="Wingdings" w:hint="default"/>
+        <w:sz w:val="20"/>
+      </w:rPr>
+    </w:lvl>
+  </w:abstractNum>
+  <w:abstractNum w:abstractNumId="11" w15:restartNumberingAfterBreak="0">
+    <w:nsid w:val="4857749C"/>
+    <w:multiLevelType w:val="multilevel"/>
+    <w:tmpl w:val="B0F09678"/>
+    <w:lvl w:ilvl="0">
+      <w:start w:val="1"/>
+      <w:numFmt w:val="bullet"/>
+      <w:lvlText w:val=""/>
+      <w:lvlJc w:val="left"/>
+      <w:pPr>
+        <w:tabs>
+          <w:tab w:val="num" w:pos="720"/>
+        </w:tabs>
+        <w:ind w:left="720" w:hanging="360"/>
+      </w:pPr>
+      <w:rPr>
+        <w:rFonts w:ascii="Symbol" w:hAnsi="Symbol" w:hint="default"/>
+        <w:sz w:val="20"/>
+      </w:rPr>
+    </w:lvl>
+    <w:lvl w:ilvl="1" w:tentative="1">
+      <w:start w:val="1"/>
+      <w:numFmt w:val="bullet"/>
+      <w:lvlText w:val="o"/>
+      <w:lvlJc w:val="left"/>
+      <w:pPr>
+        <w:tabs>
+          <w:tab w:val="num" w:pos="1440"/>
+        </w:tabs>
+        <w:ind w:left="1440" w:hanging="360"/>
+      </w:pPr>
+      <w:rPr>
+        <w:rFonts w:ascii="Courier New" w:hAnsi="Courier New" w:hint="default"/>
+        <w:sz w:val="20"/>
+      </w:rPr>
+    </w:lvl>
+    <w:lvl w:ilvl="2" w:tentative="1">
+      <w:start w:val="1"/>
+      <w:numFmt w:val="bullet"/>
+      <w:lvlText w:val=""/>
+      <w:lvlJc w:val="left"/>
+      <w:pPr>
+        <w:tabs>
+          <w:tab w:val="num" w:pos="2160"/>
+        </w:tabs>
+        <w:ind w:left="2160" w:hanging="360"/>
+      </w:pPr>
+      <w:rPr>
+        <w:rFonts w:ascii="Wingdings" w:hAnsi="Wingdings" w:hint="default"/>
+        <w:sz w:val="20"/>
+      </w:rPr>
+    </w:lvl>
+    <w:lvl w:ilvl="3" w:tentative="1">
+      <w:start w:val="1"/>
+      <w:numFmt w:val="bullet"/>
+      <w:lvlText w:val=""/>
+      <w:lvlJc w:val="left"/>
+      <w:pPr>
+        <w:tabs>
+          <w:tab w:val="num" w:pos="2880"/>
+        </w:tabs>
+        <w:ind w:left="2880" w:hanging="360"/>
+      </w:pPr>
+      <w:rPr>
+        <w:rFonts w:ascii="Wingdings" w:hAnsi="Wingdings" w:hint="default"/>
+        <w:sz w:val="20"/>
+      </w:rPr>
+    </w:lvl>
+    <w:lvl w:ilvl="4" w:tentative="1">
+      <w:start w:val="1"/>
+      <w:numFmt w:val="bullet"/>
+      <w:lvlText w:val=""/>
+      <w:lvlJc w:val="left"/>
+      <w:pPr>
+        <w:tabs>
+          <w:tab w:val="num" w:pos="3600"/>
+        </w:tabs>
+        <w:ind w:left="3600" w:hanging="360"/>
+      </w:pPr>
+      <w:rPr>
+        <w:rFonts w:ascii="Wingdings" w:hAnsi="Wingdings" w:hint="default"/>
+        <w:sz w:val="20"/>
+      </w:rPr>
+    </w:lvl>
+    <w:lvl w:ilvl="5" w:tentative="1">
+      <w:start w:val="1"/>
+      <w:numFmt w:val="bullet"/>
+      <w:lvlText w:val=""/>
+      <w:lvlJc w:val="left"/>
+      <w:pPr>
+        <w:tabs>
+          <w:tab w:val="num" w:pos="4320"/>
+        </w:tabs>
+        <w:ind w:left="4320" w:hanging="360"/>
+      </w:pPr>
+      <w:rPr>
+        <w:rFonts w:ascii="Wingdings" w:hAnsi="Wingdings" w:hint="default"/>
+        <w:sz w:val="20"/>
+      </w:rPr>
+    </w:lvl>
+    <w:lvl w:ilvl="6" w:tentative="1">
+      <w:start w:val="1"/>
+      <w:numFmt w:val="bullet"/>
+      <w:lvlText w:val=""/>
+      <w:lvlJc w:val="left"/>
+      <w:pPr>
+        <w:tabs>
+          <w:tab w:val="num" w:pos="5040"/>
+        </w:tabs>
+        <w:ind w:left="5040" w:hanging="360"/>
+      </w:pPr>
+      <w:rPr>
+        <w:rFonts w:ascii="Wingdings" w:hAnsi="Wingdings" w:hint="default"/>
+        <w:sz w:val="20"/>
+      </w:rPr>
+    </w:lvl>
+    <w:lvl w:ilvl="7" w:tentative="1">
+      <w:start w:val="1"/>
+      <w:numFmt w:val="bullet"/>
+      <w:lvlText w:val=""/>
+      <w:lvlJc w:val="left"/>
+      <w:pPr>
+        <w:tabs>
+          <w:tab w:val="num" w:pos="5760"/>
+        </w:tabs>
+        <w:ind w:left="5760" w:hanging="360"/>
+      </w:pPr>
+      <w:rPr>
+        <w:rFonts w:ascii="Wingdings" w:hAnsi="Wingdings" w:hint="default"/>
+        <w:sz w:val="20"/>
+      </w:rPr>
+    </w:lvl>
+    <w:lvl w:ilvl="8" w:tentative="1">
+      <w:start w:val="1"/>
+      <w:numFmt w:val="bullet"/>
+      <w:lvlText w:val=""/>
+      <w:lvlJc w:val="left"/>
+      <w:pPr>
+        <w:tabs>
+          <w:tab w:val="num" w:pos="6480"/>
+        </w:tabs>
+        <w:ind w:left="6480" w:hanging="360"/>
+      </w:pPr>
+      <w:rPr>
+        <w:rFonts w:ascii="Wingdings" w:hAnsi="Wingdings" w:hint="default"/>
+        <w:sz w:val="20"/>
+      </w:rPr>
+    </w:lvl>
+  </w:abstractNum>
+  <w:abstractNum w:abstractNumId="12" w15:restartNumberingAfterBreak="0">
     <w:nsid w:val="4EEA3E7B"/>
     <w:multiLevelType w:val="multilevel"/>
     <w:tmpl w:val="5F1893DE"/>
@@ -15456,7 +17473,7 @@
       </w:rPr>
     </w:lvl>
   </w:abstractNum>
-  <w:abstractNum w:abstractNumId="9" w15:restartNumberingAfterBreak="0">
+  <w:abstractNum w:abstractNumId="13" w15:restartNumberingAfterBreak="0">
     <w:nsid w:val="506F04A0"/>
     <w:multiLevelType w:val="multilevel"/>
     <w:tmpl w:val="16EA6DF4"/>
@@ -15605,7 +17622,156 @@
       </w:rPr>
     </w:lvl>
   </w:abstractNum>
-  <w:abstractNum w:abstractNumId="10" w15:restartNumberingAfterBreak="0">
+  <w:abstractNum w:abstractNumId="14" w15:restartNumberingAfterBreak="0">
+    <w:nsid w:val="54894530"/>
+    <w:multiLevelType w:val="multilevel"/>
+    <w:tmpl w:val="258AA7EE"/>
+    <w:lvl w:ilvl="0">
+      <w:start w:val="1"/>
+      <w:numFmt w:val="bullet"/>
+      <w:lvlText w:val=""/>
+      <w:lvlJc w:val="left"/>
+      <w:pPr>
+        <w:tabs>
+          <w:tab w:val="num" w:pos="720"/>
+        </w:tabs>
+        <w:ind w:left="720" w:hanging="360"/>
+      </w:pPr>
+      <w:rPr>
+        <w:rFonts w:ascii="Symbol" w:hAnsi="Symbol" w:hint="default"/>
+        <w:sz w:val="20"/>
+      </w:rPr>
+    </w:lvl>
+    <w:lvl w:ilvl="1" w:tentative="1">
+      <w:start w:val="1"/>
+      <w:numFmt w:val="bullet"/>
+      <w:lvlText w:val="o"/>
+      <w:lvlJc w:val="left"/>
+      <w:pPr>
+        <w:tabs>
+          <w:tab w:val="num" w:pos="1440"/>
+        </w:tabs>
+        <w:ind w:left="1440" w:hanging="360"/>
+      </w:pPr>
+      <w:rPr>
+        <w:rFonts w:ascii="Courier New" w:hAnsi="Courier New" w:hint="default"/>
+        <w:sz w:val="20"/>
+      </w:rPr>
+    </w:lvl>
+    <w:lvl w:ilvl="2" w:tentative="1">
+      <w:start w:val="1"/>
+      <w:numFmt w:val="bullet"/>
+      <w:lvlText w:val=""/>
+      <w:lvlJc w:val="left"/>
+      <w:pPr>
+        <w:tabs>
+          <w:tab w:val="num" w:pos="2160"/>
+        </w:tabs>
+        <w:ind w:left="2160" w:hanging="360"/>
+      </w:pPr>
+      <w:rPr>
+        <w:rFonts w:ascii="Wingdings" w:hAnsi="Wingdings" w:hint="default"/>
+        <w:sz w:val="20"/>
+      </w:rPr>
+    </w:lvl>
+    <w:lvl w:ilvl="3" w:tentative="1">
+      <w:start w:val="1"/>
+      <w:numFmt w:val="bullet"/>
+      <w:lvlText w:val=""/>
+      <w:lvlJc w:val="left"/>
+      <w:pPr>
+        <w:tabs>
+          <w:tab w:val="num" w:pos="2880"/>
+        </w:tabs>
+        <w:ind w:left="2880" w:hanging="360"/>
+      </w:pPr>
+      <w:rPr>
+        <w:rFonts w:ascii="Wingdings" w:hAnsi="Wingdings" w:hint="default"/>
+        <w:sz w:val="20"/>
+      </w:rPr>
+    </w:lvl>
+    <w:lvl w:ilvl="4" w:tentative="1">
+      <w:start w:val="1"/>
+      <w:numFmt w:val="bullet"/>
+      <w:lvlText w:val=""/>
+      <w:lvlJc w:val="left"/>
+      <w:pPr>
+        <w:tabs>
+          <w:tab w:val="num" w:pos="3600"/>
+        </w:tabs>
+        <w:ind w:left="3600" w:hanging="360"/>
+      </w:pPr>
+      <w:rPr>
+        <w:rFonts w:ascii="Wingdings" w:hAnsi="Wingdings" w:hint="default"/>
+        <w:sz w:val="20"/>
+      </w:rPr>
+    </w:lvl>
+    <w:lvl w:ilvl="5" w:tentative="1">
+      <w:start w:val="1"/>
+      <w:numFmt w:val="bullet"/>
+      <w:lvlText w:val=""/>
+      <w:lvlJc w:val="left"/>
+      <w:pPr>
+        <w:tabs>
+          <w:tab w:val="num" w:pos="4320"/>
+        </w:tabs>
+        <w:ind w:left="4320" w:hanging="360"/>
+      </w:pPr>
+      <w:rPr>
+        <w:rFonts w:ascii="Wingdings" w:hAnsi="Wingdings" w:hint="default"/>
+        <w:sz w:val="20"/>
+      </w:rPr>
+    </w:lvl>
+    <w:lvl w:ilvl="6" w:tentative="1">
+      <w:start w:val="1"/>
+      <w:numFmt w:val="bullet"/>
+      <w:lvlText w:val=""/>
+      <w:lvlJc w:val="left"/>
+      <w:pPr>
+        <w:tabs>
+          <w:tab w:val="num" w:pos="5040"/>
+        </w:tabs>
+        <w:ind w:left="5040" w:hanging="360"/>
+      </w:pPr>
+      <w:rPr>
+        <w:rFonts w:ascii="Wingdings" w:hAnsi="Wingdings" w:hint="default"/>
+        <w:sz w:val="20"/>
+      </w:rPr>
+    </w:lvl>
+    <w:lvl w:ilvl="7" w:tentative="1">
+      <w:start w:val="1"/>
+      <w:numFmt w:val="bullet"/>
+      <w:lvlText w:val=""/>
+      <w:lvlJc w:val="left"/>
+      <w:pPr>
+        <w:tabs>
+          <w:tab w:val="num" w:pos="5760"/>
+        </w:tabs>
+        <w:ind w:left="5760" w:hanging="360"/>
+      </w:pPr>
+      <w:rPr>
+        <w:rFonts w:ascii="Wingdings" w:hAnsi="Wingdings" w:hint="default"/>
+        <w:sz w:val="20"/>
+      </w:rPr>
+    </w:lvl>
+    <w:lvl w:ilvl="8" w:tentative="1">
+      <w:start w:val="1"/>
+      <w:numFmt w:val="bullet"/>
+      <w:lvlText w:val=""/>
+      <w:lvlJc w:val="left"/>
+      <w:pPr>
+        <w:tabs>
+          <w:tab w:val="num" w:pos="6480"/>
+        </w:tabs>
+        <w:ind w:left="6480" w:hanging="360"/>
+      </w:pPr>
+      <w:rPr>
+        <w:rFonts w:ascii="Wingdings" w:hAnsi="Wingdings" w:hint="default"/>
+        <w:sz w:val="20"/>
+      </w:rPr>
+    </w:lvl>
+  </w:abstractNum>
+  <w:abstractNum w:abstractNumId="15" w15:restartNumberingAfterBreak="0">
     <w:nsid w:val="58CF4881"/>
     <w:multiLevelType w:val="hybridMultilevel"/>
     <w:tmpl w:val="77EE7A1C"/>
@@ -15717,7 +17883,7 @@
       </w:rPr>
     </w:lvl>
   </w:abstractNum>
-  <w:abstractNum w:abstractNumId="11" w15:restartNumberingAfterBreak="0">
+  <w:abstractNum w:abstractNumId="16" w15:restartNumberingAfterBreak="0">
     <w:nsid w:val="60C709E3"/>
     <w:multiLevelType w:val="multilevel"/>
     <w:tmpl w:val="0148720C"/>
@@ -15866,7 +18032,7 @@
       </w:rPr>
     </w:lvl>
   </w:abstractNum>
-  <w:abstractNum w:abstractNumId="12" w15:restartNumberingAfterBreak="0">
+  <w:abstractNum w:abstractNumId="17" w15:restartNumberingAfterBreak="0">
     <w:nsid w:val="66227C1A"/>
     <w:multiLevelType w:val="hybridMultilevel"/>
     <w:tmpl w:val="82068D66"/>
@@ -15979,7 +18145,120 @@
       </w:rPr>
     </w:lvl>
   </w:abstractNum>
-  <w:abstractNum w:abstractNumId="13" w15:restartNumberingAfterBreak="0">
+  <w:abstractNum w:abstractNumId="18" w15:restartNumberingAfterBreak="0">
+    <w:nsid w:val="66407FFB"/>
+    <w:multiLevelType w:val="hybridMultilevel"/>
+    <w:tmpl w:val="48CAD502"/>
+    <w:lvl w:ilvl="0" w:tplc="40090001">
+      <w:start w:val="1"/>
+      <w:numFmt w:val="bullet"/>
+      <w:lvlText w:val=""/>
+      <w:lvlJc w:val="left"/>
+      <w:pPr>
+        <w:ind w:left="720" w:hanging="360"/>
+      </w:pPr>
+      <w:rPr>
+        <w:rFonts w:ascii="Symbol" w:hAnsi="Symbol" w:hint="default"/>
+      </w:rPr>
+    </w:lvl>
+    <w:lvl w:ilvl="1" w:tplc="40090003" w:tentative="1">
+      <w:start w:val="1"/>
+      <w:numFmt w:val="bullet"/>
+      <w:lvlText w:val="o"/>
+      <w:lvlJc w:val="left"/>
+      <w:pPr>
+        <w:ind w:left="1440" w:hanging="360"/>
+      </w:pPr>
+      <w:rPr>
+        <w:rFonts w:ascii="Courier New" w:hAnsi="Courier New" w:cs="Courier New" w:hint="default"/>
+      </w:rPr>
+    </w:lvl>
+    <w:lvl w:ilvl="2" w:tplc="40090005" w:tentative="1">
+      <w:start w:val="1"/>
+      <w:numFmt w:val="bullet"/>
+      <w:lvlText w:val=""/>
+      <w:lvlJc w:val="left"/>
+      <w:pPr>
+        <w:ind w:left="2160" w:hanging="360"/>
+      </w:pPr>
+      <w:rPr>
+        <w:rFonts w:ascii="Wingdings" w:hAnsi="Wingdings" w:hint="default"/>
+      </w:rPr>
+    </w:lvl>
+    <w:lvl w:ilvl="3" w:tplc="40090001" w:tentative="1">
+      <w:start w:val="1"/>
+      <w:numFmt w:val="bullet"/>
+      <w:lvlText w:val=""/>
+      <w:lvlJc w:val="left"/>
+      <w:pPr>
+        <w:ind w:left="2880" w:hanging="360"/>
+      </w:pPr>
+      <w:rPr>
+        <w:rFonts w:ascii="Symbol" w:hAnsi="Symbol" w:hint="default"/>
+      </w:rPr>
+    </w:lvl>
+    <w:lvl w:ilvl="4" w:tplc="40090003" w:tentative="1">
+      <w:start w:val="1"/>
+      <w:numFmt w:val="bullet"/>
+      <w:lvlText w:val="o"/>
+      <w:lvlJc w:val="left"/>
+      <w:pPr>
+        <w:ind w:left="3600" w:hanging="360"/>
+      </w:pPr>
+      <w:rPr>
+        <w:rFonts w:ascii="Courier New" w:hAnsi="Courier New" w:cs="Courier New" w:hint="default"/>
+      </w:rPr>
+    </w:lvl>
+    <w:lvl w:ilvl="5" w:tplc="40090005" w:tentative="1">
+      <w:start w:val="1"/>
+      <w:numFmt w:val="bullet"/>
+      <w:lvlText w:val=""/>
+      <w:lvlJc w:val="left"/>
+      <w:pPr>
+        <w:ind w:left="4320" w:hanging="360"/>
+      </w:pPr>
+      <w:rPr>
+        <w:rFonts w:ascii="Wingdings" w:hAnsi="Wingdings" w:hint="default"/>
+      </w:rPr>
+    </w:lvl>
+    <w:lvl w:ilvl="6" w:tplc="40090001" w:tentative="1">
+      <w:start w:val="1"/>
+      <w:numFmt w:val="bullet"/>
+      <w:lvlText w:val=""/>
+      <w:lvlJc w:val="left"/>
+      <w:pPr>
+        <w:ind w:left="5040" w:hanging="360"/>
+      </w:pPr>
+      <w:rPr>
+        <w:rFonts w:ascii="Symbol" w:hAnsi="Symbol" w:hint="default"/>
+      </w:rPr>
+    </w:lvl>
+    <w:lvl w:ilvl="7" w:tplc="40090003" w:tentative="1">
+      <w:start w:val="1"/>
+      <w:numFmt w:val="bullet"/>
+      <w:lvlText w:val="o"/>
+      <w:lvlJc w:val="left"/>
+      <w:pPr>
+        <w:ind w:left="5760" w:hanging="360"/>
+      </w:pPr>
+      <w:rPr>
+        <w:rFonts w:ascii="Courier New" w:hAnsi="Courier New" w:cs="Courier New" w:hint="default"/>
+      </w:rPr>
+    </w:lvl>
+    <w:lvl w:ilvl="8" w:tplc="40090005" w:tentative="1">
+      <w:start w:val="1"/>
+      <w:numFmt w:val="bullet"/>
+      <w:lvlText w:val=""/>
+      <w:lvlJc w:val="left"/>
+      <w:pPr>
+        <w:ind w:left="6480" w:hanging="360"/>
+      </w:pPr>
+      <w:rPr>
+        <w:rFonts w:ascii="Wingdings" w:hAnsi="Wingdings" w:hint="default"/>
+      </w:rPr>
+    </w:lvl>
+  </w:abstractNum>
+  <w:abstractNum w:abstractNumId="19" w15:restartNumberingAfterBreak="0">
     <w:nsid w:val="69117A4B"/>
     <w:multiLevelType w:val="multilevel"/>
     <w:tmpl w:val="E2AA2A12"/>
@@ -16128,7 +18407,7 @@
       </w:rPr>
     </w:lvl>
   </w:abstractNum>
-  <w:abstractNum w:abstractNumId="14" w15:restartNumberingAfterBreak="0">
+  <w:abstractNum w:abstractNumId="20" w15:restartNumberingAfterBreak="0">
     <w:nsid w:val="6B457B84"/>
     <w:multiLevelType w:val="multilevel"/>
     <w:tmpl w:val="83E2DB6A"/>
@@ -16277,7 +18556,120 @@
       </w:rPr>
     </w:lvl>
   </w:abstractNum>
-  <w:abstractNum w:abstractNumId="15" w15:restartNumberingAfterBreak="0">
+  <w:abstractNum w:abstractNumId="21" w15:restartNumberingAfterBreak="0">
+    <w:nsid w:val="6DB80407"/>
+    <w:multiLevelType w:val="hybridMultilevel"/>
+    <w:tmpl w:val="722ECE68"/>
+    <w:lvl w:ilvl="0" w:tplc="40090001">
+      <w:start w:val="1"/>
+      <w:numFmt w:val="bullet"/>
+      <w:lvlText w:val=""/>
+      <w:lvlJc w:val="left"/>
+      <w:pPr>
+        <w:ind w:left="720" w:hanging="360"/>
+      </w:pPr>
+      <w:rPr>
+        <w:rFonts w:ascii="Symbol" w:hAnsi="Symbol" w:hint="default"/>
+      </w:rPr>
+    </w:lvl>
+    <w:lvl w:ilvl="1" w:tplc="40090003" w:tentative="1">
+      <w:start w:val="1"/>
+      <w:numFmt w:val="bullet"/>
+      <w:lvlText w:val="o"/>
+      <w:lvlJc w:val="left"/>
+      <w:pPr>
+        <w:ind w:left="1440" w:hanging="360"/>
+      </w:pPr>
+      <w:rPr>
+        <w:rFonts w:ascii="Courier New" w:hAnsi="Courier New" w:cs="Courier New" w:hint="default"/>
+      </w:rPr>
+    </w:lvl>
+    <w:lvl w:ilvl="2" w:tplc="40090005" w:tentative="1">
+      <w:start w:val="1"/>
+      <w:numFmt w:val="bullet"/>
+      <w:lvlText w:val=""/>
+      <w:lvlJc w:val="left"/>
+      <w:pPr>
+        <w:ind w:left="2160" w:hanging="360"/>
+      </w:pPr>
+      <w:rPr>
+        <w:rFonts w:ascii="Wingdings" w:hAnsi="Wingdings" w:hint="default"/>
+      </w:rPr>
+    </w:lvl>
+    <w:lvl w:ilvl="3" w:tplc="40090001" w:tentative="1">
+      <w:start w:val="1"/>
+      <w:numFmt w:val="bullet"/>
+      <w:lvlText w:val=""/>
+      <w:lvlJc w:val="left"/>
+      <w:pPr>
+        <w:ind w:left="2880" w:hanging="360"/>
+      </w:pPr>
+      <w:rPr>
+        <w:rFonts w:ascii="Symbol" w:hAnsi="Symbol" w:hint="default"/>
+      </w:rPr>
+    </w:lvl>
+    <w:lvl w:ilvl="4" w:tplc="40090003" w:tentative="1">
+      <w:start w:val="1"/>
+      <w:numFmt w:val="bullet"/>
+      <w:lvlText w:val="o"/>
+      <w:lvlJc w:val="left"/>
+      <w:pPr>
+        <w:ind w:left="3600" w:hanging="360"/>
+      </w:pPr>
+      <w:rPr>
+        <w:rFonts w:ascii="Courier New" w:hAnsi="Courier New" w:cs="Courier New" w:hint="default"/>
+      </w:rPr>
+    </w:lvl>
+    <w:lvl w:ilvl="5" w:tplc="40090005" w:tentative="1">
+      <w:start w:val="1"/>
+      <w:numFmt w:val="bullet"/>
+      <w:lvlText w:val=""/>
+      <w:lvlJc w:val="left"/>
+      <w:pPr>
+        <w:ind w:left="4320" w:hanging="360"/>
+      </w:pPr>
+      <w:rPr>
+        <w:rFonts w:ascii="Wingdings" w:hAnsi="Wingdings" w:hint="default"/>
+      </w:rPr>
+    </w:lvl>
+    <w:lvl w:ilvl="6" w:tplc="40090001" w:tentative="1">
+      <w:start w:val="1"/>
+      <w:numFmt w:val="bullet"/>
+      <w:lvlText w:val=""/>
+      <w:lvlJc w:val="left"/>
+      <w:pPr>
+        <w:ind w:left="5040" w:hanging="360"/>
+      </w:pPr>
+      <w:rPr>
+        <w:rFonts w:ascii="Symbol" w:hAnsi="Symbol" w:hint="default"/>
+      </w:rPr>
+    </w:lvl>
+    <w:lvl w:ilvl="7" w:tplc="40090003" w:tentative="1">
+      <w:start w:val="1"/>
+      <w:numFmt w:val="bullet"/>
+      <w:lvlText w:val="o"/>
+      <w:lvlJc w:val="left"/>
+      <w:pPr>
+        <w:ind w:left="5760" w:hanging="360"/>
+      </w:pPr>
+      <w:rPr>
+        <w:rFonts w:ascii="Courier New" w:hAnsi="Courier New" w:cs="Courier New" w:hint="default"/>
+      </w:rPr>
+    </w:lvl>
+    <w:lvl w:ilvl="8" w:tplc="40090005" w:tentative="1">
+      <w:start w:val="1"/>
+      <w:numFmt w:val="bullet"/>
+      <w:lvlText w:val=""/>
+      <w:lvlJc w:val="left"/>
+      <w:pPr>
+        <w:ind w:left="6480" w:hanging="360"/>
+      </w:pPr>
+      <w:rPr>
+        <w:rFonts w:ascii="Wingdings" w:hAnsi="Wingdings" w:hint="default"/>
+      </w:rPr>
+    </w:lvl>
+  </w:abstractNum>
+  <w:abstractNum w:abstractNumId="22" w15:restartNumberingAfterBreak="0">
     <w:nsid w:val="70AE0F10"/>
     <w:multiLevelType w:val="hybridMultilevel"/>
     <w:tmpl w:val="6CBE34D0"/>
@@ -16363,7 +18755,7 @@
       </w:pPr>
     </w:lvl>
   </w:abstractNum>
-  <w:abstractNum w:abstractNumId="16" w15:restartNumberingAfterBreak="0">
+  <w:abstractNum w:abstractNumId="23" w15:restartNumberingAfterBreak="0">
     <w:nsid w:val="738B7662"/>
     <w:multiLevelType w:val="multilevel"/>
     <w:tmpl w:val="A5E85E08"/>
@@ -16512,7 +18904,7 @@
       </w:rPr>
     </w:lvl>
   </w:abstractNum>
-  <w:abstractNum w:abstractNumId="17" w15:restartNumberingAfterBreak="0">
+  <w:abstractNum w:abstractNumId="24" w15:restartNumberingAfterBreak="0">
     <w:nsid w:val="762F327D"/>
     <w:multiLevelType w:val="hybridMultilevel"/>
     <w:tmpl w:val="3F146536"/>
@@ -16625,7 +19017,7 @@
       </w:rPr>
     </w:lvl>
   </w:abstractNum>
-  <w:abstractNum w:abstractNumId="18" w15:restartNumberingAfterBreak="0">
+  <w:abstractNum w:abstractNumId="25" w15:restartNumberingAfterBreak="0">
     <w:nsid w:val="7D2F44AF"/>
     <w:multiLevelType w:val="multilevel"/>
     <w:tmpl w:val="7E42130E"/>
@@ -16738,7 +19130,7 @@
       </w:pPr>
     </w:lvl>
   </w:abstractNum>
-  <w:abstractNum w:abstractNumId="19" w15:restartNumberingAfterBreak="0">
+  <w:abstractNum w:abstractNumId="26" w15:restartNumberingAfterBreak="0">
     <w:nsid w:val="7E6D79F1"/>
     <w:multiLevelType w:val="hybridMultilevel"/>
     <w:tmpl w:val="ED16F040"/>
@@ -16852,64 +19244,85 @@
     </w:lvl>
   </w:abstractNum>
   <w:num w:numId="1" w16cid:durableId="1732650367">
-    <w:abstractNumId w:val="4"/>
+    <w:abstractNumId w:val="6"/>
   </w:num>
   <w:num w:numId="2" w16cid:durableId="1496343170">
-    <w:abstractNumId w:val="10"/>
+    <w:abstractNumId w:val="15"/>
   </w:num>
   <w:num w:numId="3" w16cid:durableId="49767029">
-    <w:abstractNumId w:val="15"/>
+    <w:abstractNumId w:val="22"/>
   </w:num>
   <w:num w:numId="4" w16cid:durableId="374893099">
     <w:abstractNumId w:val="1"/>
   </w:num>
   <w:num w:numId="5" w16cid:durableId="1740667314">
-    <w:abstractNumId w:val="12"/>
+    <w:abstractNumId w:val="17"/>
   </w:num>
   <w:num w:numId="6" w16cid:durableId="211429764">
-    <w:abstractNumId w:val="17"/>
+    <w:abstractNumId w:val="24"/>
   </w:num>
   <w:num w:numId="7" w16cid:durableId="205803120">
-    <w:abstractNumId w:val="7"/>
+    <w:abstractNumId w:val="9"/>
   </w:num>
   <w:num w:numId="8" w16cid:durableId="1639070327">
-    <w:abstractNumId w:val="5"/>
+    <w:abstractNumId w:val="7"/>
   </w:num>
   <w:num w:numId="9" w16cid:durableId="623119324">
     <w:abstractNumId w:val="0"/>
   </w:num>
   <w:num w:numId="10" w16cid:durableId="393817826">
-    <w:abstractNumId w:val="3"/>
+    <w:abstractNumId w:val="4"/>
   </w:num>
   <w:num w:numId="11" w16cid:durableId="2122912253">
-    <w:abstractNumId w:val="14"/>
+    <w:abstractNumId w:val="20"/>
   </w:num>
   <w:num w:numId="12" w16cid:durableId="553346507">
-    <w:abstractNumId w:val="18"/>
+    <w:abstractNumId w:val="25"/>
   </w:num>
   <w:num w:numId="13" w16cid:durableId="467816780">
-    <w:abstractNumId w:val="8"/>
+    <w:abstractNumId w:val="12"/>
   </w:num>
   <w:num w:numId="14" w16cid:durableId="2050490527">
     <w:abstractNumId w:val="2"/>
   </w:num>
   <w:num w:numId="15" w16cid:durableId="1470320644">
+    <w:abstractNumId w:val="26"/>
+  </w:num>
+  <w:num w:numId="16" w16cid:durableId="1669867527">
+    <w:abstractNumId w:val="23"/>
+  </w:num>
+  <w:num w:numId="17" w16cid:durableId="1342272628">
+    <w:abstractNumId w:val="13"/>
+  </w:num>
+  <w:num w:numId="18" w16cid:durableId="582489701">
     <w:abstractNumId w:val="19"/>
   </w:num>
-  <w:num w:numId="16" w16cid:durableId="1669867527">
+  <w:num w:numId="19" w16cid:durableId="1700623649">
     <w:abstractNumId w:val="16"/>
   </w:num>
-  <w:num w:numId="17" w16cid:durableId="1342272628">
-    <w:abstractNumId w:val="9"/>
+  <w:num w:numId="20" w16cid:durableId="1144273388">
+    <w:abstractNumId w:val="8"/>
   </w:num>
-  <w:num w:numId="18" w16cid:durableId="582489701">
-    <w:abstractNumId w:val="13"/>
+  <w:num w:numId="21" w16cid:durableId="521632438">
+    <w:abstractNumId w:val="18"/>
   </w:num>
-  <w:num w:numId="19" w16cid:durableId="1700623649">
+  <w:num w:numId="22" w16cid:durableId="21638314">
+    <w:abstractNumId w:val="14"/>
+  </w:num>
+  <w:num w:numId="23" w16cid:durableId="1495995910">
+    <w:abstractNumId w:val="10"/>
+  </w:num>
+  <w:num w:numId="24" w16cid:durableId="2103451875">
     <w:abstractNumId w:val="11"/>
   </w:num>
-  <w:num w:numId="20" w16cid:durableId="1144273388">
-    <w:abstractNumId w:val="6"/>
+  <w:num w:numId="25" w16cid:durableId="41364366">
+    <w:abstractNumId w:val="5"/>
+  </w:num>
+  <w:num w:numId="26" w16cid:durableId="1457404237">
+    <w:abstractNumId w:val="21"/>
+  </w:num>
+  <w:num w:numId="27" w16cid:durableId="970937450">
+    <w:abstractNumId w:val="3"/>
   </w:num>
 </w:numbering>
 </file>

</xml_diff>